<commit_message>
update (doc): added material and cupertino as
</commit_message>
<xml_diff>
--- a/flutter_documents/f8_packages_tools_and_CLI/f60_vscode_for_flutter.docx
+++ b/flutter_documents/f8_packages_tools_and_CLI/f60_vscode_for_flutter.docx
@@ -61,17 +61,8 @@
           <w:sz w:val="32"/>
           <w:szCs w:val="32"/>
         </w:rPr>
-        <w:t>……</w:t>
-      </w:r>
-      <w:proofErr w:type="gramStart"/>
-      <w:r>
-        <w:rPr>
-          <w:sz w:val="32"/>
-          <w:szCs w:val="32"/>
-        </w:rPr>
-        <w:t>…..</w:t>
-      </w:r>
-      <w:proofErr w:type="gramEnd"/>
+        <w:t>………..</w:t>
+      </w:r>
       <w:r>
         <w:rPr>
           <w:sz w:val="32"/>
@@ -107,23 +98,7 @@
           <w:sz w:val="32"/>
           <w:szCs w:val="32"/>
         </w:rPr>
-        <w:t xml:space="preserve"> CLI in VS code……………………………</w:t>
-      </w:r>
-      <w:proofErr w:type="gramStart"/>
-      <w:r>
-        <w:rPr>
-          <w:sz w:val="32"/>
-          <w:szCs w:val="32"/>
-        </w:rPr>
-        <w:t>…..</w:t>
-      </w:r>
-      <w:proofErr w:type="gramEnd"/>
-      <w:r>
-        <w:rPr>
-          <w:sz w:val="32"/>
-          <w:szCs w:val="32"/>
-        </w:rPr>
-        <w:t>…………</w:t>
+        <w:t xml:space="preserve"> CLI in VS code………………………………..…………</w:t>
       </w:r>
       <w:r>
         <w:rPr>
@@ -193,23 +168,7 @@
           <w:sz w:val="32"/>
           <w:szCs w:val="32"/>
         </w:rPr>
-        <w:t xml:space="preserve">Run Time Configurations in VS Code (flavors &amp; dart </w:t>
-      </w:r>
-      <w:proofErr w:type="gramStart"/>
-      <w:r>
-        <w:rPr>
-          <w:sz w:val="32"/>
-          <w:szCs w:val="32"/>
-        </w:rPr>
-        <w:t>define)…</w:t>
-      </w:r>
-      <w:proofErr w:type="gramEnd"/>
-      <w:r>
-        <w:rPr>
-          <w:sz w:val="32"/>
-          <w:szCs w:val="32"/>
-        </w:rPr>
-        <w:t>.…6</w:t>
+        <w:t>Run Time Configurations in VS Code (flavors &amp; dart define)….…6</w:t>
       </w:r>
     </w:p>
     <w:p>
@@ -253,6 +212,13 @@
         </w:rPr>
         <w:t>Physical Device Mirroring in VS Code………………………………….</w:t>
       </w:r>
+      <w:r>
+        <w:rPr>
+          <w:sz w:val="32"/>
+          <w:szCs w:val="32"/>
+        </w:rPr>
+        <w:t>8</w:t>
+      </w:r>
     </w:p>
     <w:p>
       <w:pPr>
@@ -272,17 +238,15 @@
           <w:sz w:val="32"/>
           <w:szCs w:val="32"/>
         </w:rPr>
-        <w:t>Manage Android Emulators by Android CLI……………………</w:t>
-      </w:r>
-      <w:proofErr w:type="gramStart"/>
-      <w:r>
-        <w:rPr>
-          <w:sz w:val="32"/>
-          <w:szCs w:val="32"/>
-        </w:rPr>
-        <w:t>…..</w:t>
-      </w:r>
-      <w:proofErr w:type="gramEnd"/>
+        <w:t>Manage Android Emulators by Android CLI………………………</w:t>
+      </w:r>
+      <w:r>
+        <w:rPr>
+          <w:sz w:val="32"/>
+          <w:szCs w:val="32"/>
+        </w:rPr>
+        <w:t>….9</w:t>
+      </w:r>
     </w:p>
     <w:p>
       <w:pPr>
@@ -302,7 +266,14 @@
           <w:sz w:val="32"/>
           <w:szCs w:val="32"/>
         </w:rPr>
-        <w:t>Antigravity Extension Market Fix…………………………………………</w:t>
+        <w:t>Antigravity Extension Market Fix………………………………………</w:t>
+      </w:r>
+      <w:r>
+        <w:rPr>
+          <w:sz w:val="32"/>
+          <w:szCs w:val="32"/>
+        </w:rPr>
+        <w:t>.10</w:t>
       </w:r>
     </w:p>
     <w:p>
@@ -448,7 +419,6 @@
         </w:rPr>
         <w:t xml:space="preserve"> (for reading </w:t>
       </w:r>
-      <w:proofErr w:type="spellStart"/>
       <w:r>
         <w:rPr>
           <w:b/>
@@ -458,7 +428,6 @@
         </w:rPr>
         <w:t>build.gradle.kts</w:t>
       </w:r>
-      <w:proofErr w:type="spellEnd"/>
       <w:r>
         <w:rPr>
           <w:sz w:val="32"/>
@@ -496,25 +465,14 @@
         </w:rPr>
         <w:t xml:space="preserve"> by JetBrains (for reading </w:t>
       </w:r>
-      <w:proofErr w:type="spellStart"/>
-      <w:r>
-        <w:rPr>
-          <w:b/>
-          <w:bCs/>
-          <w:sz w:val="32"/>
-          <w:szCs w:val="32"/>
-        </w:rPr>
-        <w:t>MainActivity.kt</w:t>
-      </w:r>
-      <w:proofErr w:type="spellEnd"/>
-      <w:r>
-        <w:rPr>
-          <w:b/>
-          <w:bCs/>
-          <w:sz w:val="32"/>
-          <w:szCs w:val="32"/>
-        </w:rPr>
-        <w:t xml:space="preserve"> </w:t>
+      <w:r>
+        <w:rPr>
+          <w:b/>
+          <w:bCs/>
+          <w:sz w:val="32"/>
+          <w:szCs w:val="32"/>
+        </w:rPr>
+        <w:t xml:space="preserve">MainActivity.kt </w:t>
       </w:r>
       <w:r>
         <w:rPr>
@@ -692,7 +650,6 @@
           <w:szCs w:val="32"/>
         </w:rPr>
       </w:pPr>
-      <w:proofErr w:type="spellStart"/>
       <w:r>
         <w:rPr>
           <w:b/>
@@ -702,7 +659,6 @@
         </w:rPr>
         <w:t>GitLens</w:t>
       </w:r>
-      <w:proofErr w:type="spellEnd"/>
       <w:r>
         <w:rPr>
           <w:sz w:val="32"/>
@@ -1073,27 +1029,14 @@
         </w:rPr>
         <w:t xml:space="preserve"> project which will be our app name (like </w:t>
       </w:r>
-      <w:proofErr w:type="spellStart"/>
-      <w:proofErr w:type="gramStart"/>
-      <w:r>
-        <w:rPr>
-          <w:b/>
-          <w:bCs/>
-          <w:sz w:val="32"/>
-          <w:szCs w:val="32"/>
-        </w:rPr>
-        <w:t>android:label</w:t>
-      </w:r>
-      <w:proofErr w:type="spellEnd"/>
-      <w:proofErr w:type="gramEnd"/>
-      <w:r>
-        <w:rPr>
-          <w:b/>
-          <w:bCs/>
-          <w:sz w:val="32"/>
-          <w:szCs w:val="32"/>
-        </w:rPr>
-        <w:t>=</w:t>
+      <w:r>
+        <w:rPr>
+          <w:b/>
+          <w:bCs/>
+          <w:sz w:val="32"/>
+          <w:szCs w:val="32"/>
+        </w:rPr>
+        <w:t>android:label=</w:t>
       </w:r>
       <w:r>
         <w:rPr>
@@ -1118,7 +1061,6 @@
         </w:rPr>
         <w:t xml:space="preserve"> and </w:t>
       </w:r>
-      <w:proofErr w:type="spellStart"/>
       <w:r>
         <w:rPr>
           <w:b/>
@@ -1128,7 +1070,6 @@
         </w:rPr>
         <w:t>pubsec.yaml</w:t>
       </w:r>
-      <w:proofErr w:type="spellEnd"/>
       <w:r>
         <w:rPr>
           <w:sz w:val="32"/>
@@ -1164,7 +1105,6 @@
         </w:rPr>
         <w:t xml:space="preserve"> </w:t>
       </w:r>
-      <w:proofErr w:type="spellStart"/>
       <w:r>
         <w:rPr>
           <w:b/>
@@ -1174,7 +1114,6 @@
         </w:rPr>
         <w:t>com.example.testing_flutter</w:t>
       </w:r>
-      <w:proofErr w:type="spellEnd"/>
       <w:r>
         <w:rPr>
           <w:sz w:val="32"/>
@@ -1543,37 +1482,17 @@
           <w:sz w:val="32"/>
           <w:szCs w:val="32"/>
         </w:rPr>
-        <w:t xml:space="preserve"># If we add </w:t>
-      </w:r>
-      <w:proofErr w:type="gramStart"/>
-      <w:r>
-        <w:rPr>
-          <w:sz w:val="32"/>
-          <w:szCs w:val="32"/>
-        </w:rPr>
-        <w:t xml:space="preserve">a </w:t>
-      </w:r>
-      <w:r>
-        <w:rPr>
-          <w:b/>
-          <w:bCs/>
-          <w:sz w:val="32"/>
-          <w:szCs w:val="32"/>
-        </w:rPr>
-        <w:t>.</w:t>
-      </w:r>
-      <w:proofErr w:type="spellStart"/>
-      <w:r>
-        <w:rPr>
-          <w:b/>
-          <w:bCs/>
-          <w:sz w:val="32"/>
-          <w:szCs w:val="32"/>
-        </w:rPr>
-        <w:t>vscode</w:t>
-      </w:r>
-      <w:proofErr w:type="spellEnd"/>
-      <w:proofErr w:type="gramEnd"/>
+        <w:t xml:space="preserve"># If we add a </w:t>
+      </w:r>
+      <w:r>
+        <w:rPr>
+          <w:b/>
+          <w:bCs/>
+          <w:sz w:val="32"/>
+          <w:szCs w:val="32"/>
+        </w:rPr>
+        <w:t>.vscode</w:t>
+      </w:r>
       <w:r>
         <w:rPr>
           <w:sz w:val="32"/>
@@ -1581,47 +1500,22 @@
         </w:rPr>
         <w:t xml:space="preserve"> directory inside our (like </w:t>
       </w:r>
-      <w:proofErr w:type="spellStart"/>
-      <w:r>
-        <w:rPr>
-          <w:b/>
-          <w:bCs/>
-          <w:sz w:val="32"/>
-          <w:szCs w:val="32"/>
-        </w:rPr>
-        <w:t>project_root</w:t>
-      </w:r>
-      <w:proofErr w:type="spellEnd"/>
-      <w:r>
-        <w:rPr>
-          <w:b/>
-          <w:bCs/>
-          <w:sz w:val="32"/>
-          <w:szCs w:val="32"/>
-        </w:rPr>
-        <w:t>/.</w:t>
-      </w:r>
-      <w:proofErr w:type="spellStart"/>
-      <w:r>
-        <w:rPr>
-          <w:b/>
-          <w:bCs/>
-          <w:sz w:val="32"/>
-          <w:szCs w:val="32"/>
-        </w:rPr>
-        <w:t>vscode</w:t>
-      </w:r>
-      <w:proofErr w:type="spellEnd"/>
-      <w:r>
-        <w:rPr>
-          <w:b/>
-          <w:bCs/>
-          <w:sz w:val="32"/>
-          <w:szCs w:val="32"/>
-        </w:rPr>
-        <w:t>/</w:t>
-      </w:r>
-      <w:proofErr w:type="spellStart"/>
+      <w:r>
+        <w:rPr>
+          <w:b/>
+          <w:bCs/>
+          <w:sz w:val="32"/>
+          <w:szCs w:val="32"/>
+        </w:rPr>
+        <w:t>project_root/.vscode/settings.json</w:t>
+      </w:r>
+      <w:r>
+        <w:rPr>
+          <w:sz w:val="32"/>
+          <w:szCs w:val="32"/>
+        </w:rPr>
+        <w:t xml:space="preserve">) and it has </w:t>
+      </w:r>
       <w:r>
         <w:rPr>
           <w:b/>
@@ -1631,25 +1525,6 @@
         </w:rPr>
         <w:t>settings.json</w:t>
       </w:r>
-      <w:proofErr w:type="spellEnd"/>
-      <w:r>
-        <w:rPr>
-          <w:sz w:val="32"/>
-          <w:szCs w:val="32"/>
-        </w:rPr>
-        <w:t xml:space="preserve">) and it has </w:t>
-      </w:r>
-      <w:proofErr w:type="spellStart"/>
-      <w:r>
-        <w:rPr>
-          <w:b/>
-          <w:bCs/>
-          <w:sz w:val="32"/>
-          <w:szCs w:val="32"/>
-        </w:rPr>
-        <w:t>settings.json</w:t>
-      </w:r>
-      <w:proofErr w:type="spellEnd"/>
       <w:r>
         <w:rPr>
           <w:sz w:val="32"/>
@@ -1668,7 +1543,6 @@
           <w:szCs w:val="28"/>
         </w:rPr>
       </w:pPr>
-      <w:proofErr w:type="spellStart"/>
       <w:r>
         <w:rPr>
           <w:b/>
@@ -1676,141 +1550,140 @@
           <w:sz w:val="28"/>
           <w:szCs w:val="28"/>
         </w:rPr>
-        <w:t>my_flutter_app</w:t>
-      </w:r>
-      <w:proofErr w:type="spellEnd"/>
-      <w:r>
+        <w:t>my_flutter_app/</w:t>
+      </w:r>
+    </w:p>
+    <w:p>
+      <w:pPr>
+        <w:jc w:val="both"/>
         <w:rPr>
           <w:b/>
           <w:bCs/>
           <w:sz w:val="28"/>
           <w:szCs w:val="28"/>
         </w:rPr>
-        <w:t>/</w:t>
-      </w:r>
-    </w:p>
-    <w:p>
-      <w:pPr>
-        <w:jc w:val="both"/>
-        <w:rPr>
+      </w:pPr>
+      <w:r>
+        <w:rPr>
+          <w:rFonts w:ascii="Arial" w:hAnsi="Arial" w:cs="Arial"/>
           <w:b/>
           <w:bCs/>
           <w:sz w:val="28"/>
           <w:szCs w:val="28"/>
         </w:rPr>
-      </w:pPr>
-      <w:r>
-        <w:rPr>
-          <w:rFonts w:ascii="Arial" w:hAnsi="Arial" w:cs="Arial"/>
+        <w:t>├</w:t>
+      </w:r>
+      <w:r>
+        <w:rPr>
+          <w:rFonts w:ascii="Aptos" w:hAnsi="Aptos" w:cs="Aptos"/>
           <w:b/>
           <w:bCs/>
           <w:sz w:val="28"/>
           <w:szCs w:val="28"/>
         </w:rPr>
-        <w:t>├</w:t>
-      </w:r>
-      <w:r>
-        <w:rPr>
-          <w:rFonts w:ascii="Aptos" w:hAnsi="Aptos" w:cs="Aptos"/>
+        <w:t>──</w:t>
+      </w:r>
+      <w:r>
+        <w:rPr>
           <w:b/>
           <w:bCs/>
           <w:sz w:val="28"/>
           <w:szCs w:val="28"/>
         </w:rPr>
-        <w:t>──</w:t>
-      </w:r>
-      <w:r>
+        <w:t xml:space="preserve"> lib/</w:t>
+      </w:r>
+    </w:p>
+    <w:p>
+      <w:pPr>
+        <w:jc w:val="both"/>
         <w:rPr>
           <w:b/>
           <w:bCs/>
           <w:sz w:val="28"/>
           <w:szCs w:val="28"/>
         </w:rPr>
-        <w:t xml:space="preserve"> lib/</w:t>
-      </w:r>
-    </w:p>
-    <w:p>
-      <w:pPr>
-        <w:jc w:val="both"/>
-        <w:rPr>
+      </w:pPr>
+      <w:r>
+        <w:rPr>
+          <w:rFonts w:ascii="Arial" w:hAnsi="Arial" w:cs="Arial"/>
           <w:b/>
           <w:bCs/>
           <w:sz w:val="28"/>
           <w:szCs w:val="28"/>
         </w:rPr>
-      </w:pPr>
-      <w:r>
-        <w:rPr>
-          <w:rFonts w:ascii="Arial" w:hAnsi="Arial" w:cs="Arial"/>
+        <w:lastRenderedPageBreak/>
+        <w:t>├</w:t>
+      </w:r>
+      <w:r>
+        <w:rPr>
+          <w:rFonts w:ascii="Aptos" w:hAnsi="Aptos" w:cs="Aptos"/>
           <w:b/>
           <w:bCs/>
           <w:sz w:val="28"/>
           <w:szCs w:val="28"/>
         </w:rPr>
-        <w:lastRenderedPageBreak/>
-        <w:t>├</w:t>
-      </w:r>
-      <w:r>
-        <w:rPr>
-          <w:rFonts w:ascii="Aptos" w:hAnsi="Aptos" w:cs="Aptos"/>
+        <w:t>──</w:t>
+      </w:r>
+      <w:r>
+        <w:rPr>
           <w:b/>
           <w:bCs/>
           <w:sz w:val="28"/>
           <w:szCs w:val="28"/>
         </w:rPr>
-        <w:t>──</w:t>
-      </w:r>
-      <w:r>
+        <w:t xml:space="preserve"> android/</w:t>
+      </w:r>
+    </w:p>
+    <w:p>
+      <w:pPr>
+        <w:jc w:val="both"/>
         <w:rPr>
           <w:b/>
           <w:bCs/>
           <w:sz w:val="28"/>
           <w:szCs w:val="28"/>
         </w:rPr>
-        <w:t xml:space="preserve"> android/</w:t>
-      </w:r>
-    </w:p>
-    <w:p>
-      <w:pPr>
-        <w:jc w:val="both"/>
-        <w:rPr>
+      </w:pPr>
+      <w:r>
+        <w:rPr>
+          <w:rFonts w:ascii="Arial" w:hAnsi="Arial" w:cs="Arial"/>
           <w:b/>
           <w:bCs/>
           <w:sz w:val="28"/>
           <w:szCs w:val="28"/>
         </w:rPr>
-      </w:pPr>
-      <w:r>
-        <w:rPr>
-          <w:rFonts w:ascii="Arial" w:hAnsi="Arial" w:cs="Arial"/>
+        <w:t>├</w:t>
+      </w:r>
+      <w:r>
+        <w:rPr>
+          <w:rFonts w:ascii="Aptos" w:hAnsi="Aptos" w:cs="Aptos"/>
           <w:b/>
           <w:bCs/>
           <w:sz w:val="28"/>
           <w:szCs w:val="28"/>
         </w:rPr>
-        <w:t>├</w:t>
-      </w:r>
-      <w:r>
-        <w:rPr>
-          <w:rFonts w:ascii="Aptos" w:hAnsi="Aptos" w:cs="Aptos"/>
+        <w:t>──</w:t>
+      </w:r>
+      <w:r>
+        <w:rPr>
           <w:b/>
           <w:bCs/>
           <w:sz w:val="28"/>
           <w:szCs w:val="28"/>
         </w:rPr>
-        <w:t>──</w:t>
-      </w:r>
-      <w:r>
+        <w:t xml:space="preserve"> pubspec.yaml</w:t>
+      </w:r>
+    </w:p>
+    <w:p>
+      <w:pPr>
+        <w:jc w:val="both"/>
         <w:rPr>
           <w:b/>
           <w:bCs/>
           <w:sz w:val="28"/>
           <w:szCs w:val="28"/>
         </w:rPr>
-        <w:t xml:space="preserve"> </w:t>
-      </w:r>
-      <w:proofErr w:type="spellStart"/>
-      <w:proofErr w:type="gramStart"/>
+      </w:pPr>
       <w:r>
         <w:rPr>
           <w:b/>
@@ -1818,10 +1691,8 @@
           <w:sz w:val="28"/>
           <w:szCs w:val="28"/>
         </w:rPr>
-        <w:t>pubspec.yaml</w:t>
-      </w:r>
-      <w:proofErr w:type="spellEnd"/>
-      <w:proofErr w:type="gramEnd"/>
+        <w:t>└── .vscode/</w:t>
+      </w:r>
     </w:p>
     <w:p>
       <w:pPr>
@@ -1840,19 +1711,35 @@
           <w:sz w:val="28"/>
           <w:szCs w:val="28"/>
         </w:rPr>
-        <w:t>└─</w:t>
-      </w:r>
-      <w:proofErr w:type="gramStart"/>
-      <w:r>
+        <w:t xml:space="preserve">    └── settings.json</w:t>
+      </w:r>
+    </w:p>
+    <w:p>
+      <w:pPr>
+        <w:jc w:val="both"/>
+        <w:rPr>
+          <w:sz w:val="32"/>
+          <w:szCs w:val="32"/>
+        </w:rPr>
+      </w:pPr>
+      <w:r>
+        <w:rPr>
+          <w:sz w:val="32"/>
+          <w:szCs w:val="32"/>
+        </w:rPr>
+        <w:t># Like:</w:t>
+      </w:r>
+    </w:p>
+    <w:p>
+      <w:pPr>
+        <w:jc w:val="both"/>
         <w:rPr>
           <w:b/>
           <w:bCs/>
           <w:sz w:val="28"/>
           <w:szCs w:val="28"/>
         </w:rPr>
-        <w:t>─ .</w:t>
-      </w:r>
-      <w:proofErr w:type="spellStart"/>
+      </w:pPr>
       <w:r>
         <w:rPr>
           <w:b/>
@@ -1860,41 +1747,39 @@
           <w:sz w:val="28"/>
           <w:szCs w:val="28"/>
         </w:rPr>
-        <w:t>vscode</w:t>
-      </w:r>
-      <w:proofErr w:type="spellEnd"/>
-      <w:proofErr w:type="gramEnd"/>
-      <w:r>
+        <w:t>{</w:t>
+      </w:r>
+    </w:p>
+    <w:p>
+      <w:pPr>
+        <w:jc w:val="both"/>
         <w:rPr>
           <w:b/>
           <w:bCs/>
           <w:sz w:val="28"/>
           <w:szCs w:val="28"/>
         </w:rPr>
-        <w:t>/</w:t>
-      </w:r>
-    </w:p>
-    <w:p>
-      <w:pPr>
-        <w:jc w:val="both"/>
+      </w:pPr>
+      <w:r>
         <w:rPr>
           <w:b/>
           <w:bCs/>
           <w:sz w:val="28"/>
           <w:szCs w:val="28"/>
         </w:rPr>
-      </w:pPr>
-      <w:r>
+        <w:t xml:space="preserve">  "editor.fontSize": 16,</w:t>
+      </w:r>
+    </w:p>
+    <w:p>
+      <w:pPr>
+        <w:jc w:val="both"/>
         <w:rPr>
           <w:b/>
           <w:bCs/>
           <w:sz w:val="28"/>
           <w:szCs w:val="28"/>
         </w:rPr>
-        <w:t xml:space="preserve">    └── </w:t>
-      </w:r>
-      <w:proofErr w:type="spellStart"/>
-      <w:proofErr w:type="gramStart"/>
+      </w:pPr>
       <w:r>
         <w:rPr>
           <w:b/>
@@ -1902,25 +1787,7 @@
           <w:sz w:val="28"/>
           <w:szCs w:val="28"/>
         </w:rPr>
-        <w:t>settings.json</w:t>
-      </w:r>
-      <w:proofErr w:type="spellEnd"/>
-      <w:proofErr w:type="gramEnd"/>
-    </w:p>
-    <w:p>
-      <w:pPr>
-        <w:jc w:val="both"/>
-        <w:rPr>
-          <w:sz w:val="32"/>
-          <w:szCs w:val="32"/>
-        </w:rPr>
-      </w:pPr>
-      <w:r>
-        <w:rPr>
-          <w:sz w:val="32"/>
-          <w:szCs w:val="32"/>
-        </w:rPr>
-        <w:t># Like:</w:t>
+        <w:t xml:space="preserve">  "cSpell.words": [</w:t>
       </w:r>
     </w:p>
     <w:p>
@@ -1940,7 +1807,7 @@
           <w:sz w:val="28"/>
           <w:szCs w:val="28"/>
         </w:rPr>
-        <w:t>{</w:t>
+        <w:t xml:space="preserve">        "playfair"</w:t>
       </w:r>
     </w:p>
     <w:p>
@@ -1960,21 +1827,19 @@
           <w:sz w:val="28"/>
           <w:szCs w:val="28"/>
         </w:rPr>
-        <w:t xml:space="preserve">  "</w:t>
-      </w:r>
-      <w:proofErr w:type="spellStart"/>
-      <w:proofErr w:type="gramStart"/>
-      <w:r>
+        <w:t xml:space="preserve">  ],</w:t>
+      </w:r>
+    </w:p>
+    <w:p>
+      <w:pPr>
+        <w:jc w:val="both"/>
         <w:rPr>
           <w:b/>
           <w:bCs/>
           <w:sz w:val="28"/>
           <w:szCs w:val="28"/>
         </w:rPr>
-        <w:t>editor.fontSize</w:t>
-      </w:r>
-      <w:proofErr w:type="spellEnd"/>
-      <w:proofErr w:type="gramEnd"/>
+      </w:pPr>
       <w:r>
         <w:rPr>
           <w:b/>
@@ -1982,7 +1847,7 @@
           <w:sz w:val="28"/>
           <w:szCs w:val="28"/>
         </w:rPr>
-        <w:t>": 16,</w:t>
+        <w:t xml:space="preserve">  "java.configuration.updateBuildConfiguration": "interactive",</w:t>
       </w:r>
     </w:p>
     <w:p>
@@ -2002,19 +1867,19 @@
           <w:sz w:val="28"/>
           <w:szCs w:val="28"/>
         </w:rPr>
-        <w:t xml:space="preserve">  "</w:t>
-      </w:r>
-      <w:proofErr w:type="spellStart"/>
-      <w:r>
+        <w:t xml:space="preserve">  "dart.previewFlutterUiGuides": true,</w:t>
+      </w:r>
+    </w:p>
+    <w:p>
+      <w:pPr>
+        <w:jc w:val="both"/>
         <w:rPr>
           <w:b/>
           <w:bCs/>
           <w:sz w:val="28"/>
           <w:szCs w:val="28"/>
         </w:rPr>
-        <w:t>cSpell.words</w:t>
-      </w:r>
-      <w:proofErr w:type="spellEnd"/>
+      </w:pPr>
       <w:r>
         <w:rPr>
           <w:b/>
@@ -2022,7 +1887,154 @@
           <w:sz w:val="28"/>
           <w:szCs w:val="28"/>
         </w:rPr>
-        <w:t>": [</w:t>
+        <w:t>}</w:t>
+      </w:r>
+    </w:p>
+    <w:p>
+      <w:pPr>
+        <w:jc w:val="both"/>
+        <w:rPr>
+          <w:sz w:val="32"/>
+          <w:szCs w:val="32"/>
+        </w:rPr>
+      </w:pPr>
+      <w:r>
+        <w:rPr>
+          <w:sz w:val="32"/>
+          <w:szCs w:val="32"/>
+        </w:rPr>
+        <w:t xml:space="preserve"># </w:t>
+      </w:r>
+      <w:r>
+        <w:rPr>
+          <w:b/>
+          <w:bCs/>
+          <w:sz w:val="32"/>
+          <w:szCs w:val="32"/>
+        </w:rPr>
+        <w:t>editor.fontSize</w:t>
+      </w:r>
+      <w:r>
+        <w:rPr>
+          <w:sz w:val="32"/>
+          <w:szCs w:val="32"/>
+        </w:rPr>
+        <w:t xml:space="preserve"> tells use font size 16 for this project</w:t>
+      </w:r>
+    </w:p>
+    <w:p>
+      <w:pPr>
+        <w:jc w:val="both"/>
+        <w:rPr>
+          <w:sz w:val="32"/>
+          <w:szCs w:val="32"/>
+        </w:rPr>
+      </w:pPr>
+      <w:r>
+        <w:rPr>
+          <w:sz w:val="32"/>
+          <w:szCs w:val="32"/>
+        </w:rPr>
+        <w:t xml:space="preserve"># </w:t>
+      </w:r>
+      <w:r>
+        <w:rPr>
+          <w:b/>
+          <w:bCs/>
+          <w:sz w:val="32"/>
+          <w:szCs w:val="32"/>
+        </w:rPr>
+        <w:t>cSpell.words</w:t>
+      </w:r>
+      <w:r>
+        <w:rPr>
+          <w:sz w:val="32"/>
+          <w:szCs w:val="32"/>
+        </w:rPr>
+        <w:t xml:space="preserve"> tells the spell checker not to flag like we know this word. Don’t complain about it (Project level dictionary)</w:t>
+      </w:r>
+    </w:p>
+    <w:p>
+      <w:pPr>
+        <w:jc w:val="both"/>
+        <w:rPr>
+          <w:sz w:val="32"/>
+          <w:szCs w:val="32"/>
+        </w:rPr>
+      </w:pPr>
+      <w:r>
+        <w:rPr>
+          <w:sz w:val="32"/>
+          <w:szCs w:val="32"/>
+        </w:rPr>
+        <w:t xml:space="preserve"># </w:t>
+      </w:r>
+      <w:r>
+        <w:rPr>
+          <w:b/>
+          <w:bCs/>
+          <w:sz w:val="32"/>
+          <w:szCs w:val="32"/>
+        </w:rPr>
+        <w:t>java.configuration.updateBuildConfiguration</w:t>
+      </w:r>
+      <w:r>
+        <w:rPr>
+          <w:sz w:val="32"/>
+          <w:szCs w:val="32"/>
+        </w:rPr>
+        <w:t xml:space="preserve"> </w:t>
+      </w:r>
+      <w:r>
+        <w:rPr>
+          <w:sz w:val="32"/>
+          <w:szCs w:val="32"/>
+        </w:rPr>
+        <w:t>controls what VS Code does when it detects that our Gradle configuration has changed.</w:t>
+      </w:r>
+      <w:r>
+        <w:rPr>
+          <w:sz w:val="32"/>
+          <w:szCs w:val="32"/>
+        </w:rPr>
+        <w:t xml:space="preserve"> </w:t>
+      </w:r>
+      <w:r>
+        <w:rPr>
+          <w:sz w:val="32"/>
+          <w:szCs w:val="32"/>
+        </w:rPr>
+        <w:t>For example,</w:t>
+      </w:r>
+      <w:r>
+        <w:rPr>
+          <w:sz w:val="32"/>
+          <w:szCs w:val="32"/>
+        </w:rPr>
+        <w:t xml:space="preserve"> </w:t>
+      </w:r>
+      <w:r>
+        <w:rPr>
+          <w:sz w:val="32"/>
+          <w:szCs w:val="32"/>
+        </w:rPr>
+        <w:t xml:space="preserve">our </w:t>
+      </w:r>
+      <w:r>
+        <w:rPr>
+          <w:b/>
+          <w:bCs/>
+          <w:sz w:val="32"/>
+          <w:szCs w:val="32"/>
+        </w:rPr>
+        <w:t>Flutter</w:t>
+      </w:r>
+      <w:r>
+        <w:rPr>
+          <w:sz w:val="32"/>
+          <w:szCs w:val="32"/>
+        </w:rPr>
+        <w:t xml:space="preserve"> project has:</w:t>
       </w:r>
     </w:p>
     <w:p>
@@ -2042,39 +2054,39 @@
           <w:sz w:val="28"/>
           <w:szCs w:val="28"/>
         </w:rPr>
-        <w:t xml:space="preserve">        "</w:t>
-      </w:r>
-      <w:proofErr w:type="spellStart"/>
-      <w:r>
+        <w:t>android/</w:t>
+      </w:r>
+    </w:p>
+    <w:p>
+      <w:pPr>
+        <w:jc w:val="both"/>
         <w:rPr>
           <w:b/>
           <w:bCs/>
           <w:sz w:val="28"/>
           <w:szCs w:val="28"/>
         </w:rPr>
-        <w:t>playfair</w:t>
-      </w:r>
-      <w:proofErr w:type="spellEnd"/>
-      <w:r>
-        <w:rPr>
+      </w:pPr>
+      <w:r>
+        <w:rPr>
+          <w:rFonts w:ascii="Arial" w:hAnsi="Arial" w:cs="Arial"/>
           <w:b/>
           <w:bCs/>
           <w:sz w:val="28"/>
           <w:szCs w:val="28"/>
         </w:rPr>
-        <w:t>"</w:t>
-      </w:r>
-    </w:p>
-    <w:p>
-      <w:pPr>
-        <w:jc w:val="both"/>
-        <w:rPr>
+        <w:t>├</w:t>
+      </w:r>
+      <w:r>
+        <w:rPr>
+          <w:rFonts w:ascii="Aptos" w:hAnsi="Aptos" w:cs="Aptos"/>
           <w:b/>
           <w:bCs/>
           <w:sz w:val="28"/>
           <w:szCs w:val="28"/>
         </w:rPr>
-      </w:pPr>
+        <w:t>──</w:t>
+      </w:r>
       <w:r>
         <w:rPr>
           <w:b/>
@@ -2082,7 +2094,7 @@
           <w:sz w:val="28"/>
           <w:szCs w:val="28"/>
         </w:rPr>
-        <w:t xml:space="preserve">  ],</w:t>
+        <w:t xml:space="preserve"> build.gradle.kts</w:t>
       </w:r>
     </w:p>
     <w:p>
@@ -2097,25 +2109,24 @@
       </w:pPr>
       <w:r>
         <w:rPr>
+          <w:rFonts w:ascii="Arial" w:hAnsi="Arial" w:cs="Arial"/>
           <w:b/>
           <w:bCs/>
           <w:sz w:val="28"/>
           <w:szCs w:val="28"/>
         </w:rPr>
-        <w:t xml:space="preserve">  "</w:t>
-      </w:r>
-      <w:proofErr w:type="spellStart"/>
-      <w:proofErr w:type="gramStart"/>
-      <w:r>
-        <w:rPr>
+        <w:t>├</w:t>
+      </w:r>
+      <w:r>
+        <w:rPr>
+          <w:rFonts w:ascii="Aptos" w:hAnsi="Aptos" w:cs="Aptos"/>
           <w:b/>
           <w:bCs/>
           <w:sz w:val="28"/>
           <w:szCs w:val="28"/>
         </w:rPr>
-        <w:t>java.configuration</w:t>
-      </w:r>
-      <w:proofErr w:type="gramEnd"/>
+        <w:t>──</w:t>
+      </w:r>
       <w:r>
         <w:rPr>
           <w:b/>
@@ -2123,40 +2134,39 @@
           <w:sz w:val="28"/>
           <w:szCs w:val="28"/>
         </w:rPr>
-        <w:t>.updateBuildConfiguration</w:t>
-      </w:r>
-      <w:proofErr w:type="spellEnd"/>
-      <w:r>
+        <w:t xml:space="preserve"> settings.gradle.kts</w:t>
+      </w:r>
+    </w:p>
+    <w:p>
+      <w:pPr>
+        <w:jc w:val="both"/>
         <w:rPr>
           <w:b/>
           <w:bCs/>
           <w:sz w:val="28"/>
           <w:szCs w:val="28"/>
         </w:rPr>
-        <w:t>": "interactive",</w:t>
-      </w:r>
-    </w:p>
-    <w:p>
-      <w:pPr>
-        <w:jc w:val="both"/>
+      </w:pPr>
+      <w:r>
         <w:rPr>
           <w:b/>
           <w:bCs/>
           <w:sz w:val="28"/>
           <w:szCs w:val="28"/>
         </w:rPr>
-      </w:pPr>
-      <w:r>
+        <w:t>└── app/</w:t>
+      </w:r>
+    </w:p>
+    <w:p>
+      <w:pPr>
+        <w:jc w:val="both"/>
         <w:rPr>
           <w:b/>
           <w:bCs/>
           <w:sz w:val="28"/>
           <w:szCs w:val="28"/>
         </w:rPr>
-        <w:t xml:space="preserve">  "</w:t>
-      </w:r>
-      <w:proofErr w:type="spellStart"/>
-      <w:proofErr w:type="gramStart"/>
+      </w:pPr>
       <w:r>
         <w:rPr>
           <w:b/>
@@ -2164,378 +2174,8 @@
           <w:sz w:val="28"/>
           <w:szCs w:val="28"/>
         </w:rPr>
-        <w:t>dart.previewFlutterUiGuides</w:t>
-      </w:r>
-      <w:proofErr w:type="spellEnd"/>
-      <w:proofErr w:type="gramEnd"/>
-      <w:r>
-        <w:rPr>
-          <w:b/>
-          <w:bCs/>
-          <w:sz w:val="28"/>
-          <w:szCs w:val="28"/>
-        </w:rPr>
-        <w:t>": true,</w:t>
-      </w:r>
-    </w:p>
-    <w:p>
-      <w:pPr>
-        <w:jc w:val="both"/>
-        <w:rPr>
-          <w:b/>
-          <w:bCs/>
-          <w:sz w:val="28"/>
-          <w:szCs w:val="28"/>
-        </w:rPr>
-      </w:pPr>
-      <w:r>
-        <w:rPr>
-          <w:b/>
-          <w:bCs/>
-          <w:sz w:val="28"/>
-          <w:szCs w:val="28"/>
-        </w:rPr>
-        <w:t>}</w:t>
-      </w:r>
-    </w:p>
-    <w:p>
-      <w:pPr>
-        <w:jc w:val="both"/>
-        <w:rPr>
-          <w:sz w:val="32"/>
-          <w:szCs w:val="32"/>
-        </w:rPr>
-      </w:pPr>
-      <w:r>
-        <w:rPr>
-          <w:sz w:val="32"/>
-          <w:szCs w:val="32"/>
-        </w:rPr>
-        <w:t xml:space="preserve"># </w:t>
-      </w:r>
-      <w:proofErr w:type="spellStart"/>
-      <w:proofErr w:type="gramStart"/>
-      <w:r>
-        <w:rPr>
-          <w:b/>
-          <w:bCs/>
-          <w:sz w:val="32"/>
-          <w:szCs w:val="32"/>
-        </w:rPr>
-        <w:t>editor.fontSize</w:t>
-      </w:r>
-      <w:proofErr w:type="spellEnd"/>
-      <w:proofErr w:type="gramEnd"/>
-      <w:r>
-        <w:rPr>
-          <w:sz w:val="32"/>
-          <w:szCs w:val="32"/>
-        </w:rPr>
-        <w:t xml:space="preserve"> tells use font size 16 for this project</w:t>
-      </w:r>
-    </w:p>
-    <w:p>
-      <w:pPr>
-        <w:jc w:val="both"/>
-        <w:rPr>
-          <w:sz w:val="32"/>
-          <w:szCs w:val="32"/>
-        </w:rPr>
-      </w:pPr>
-      <w:r>
-        <w:rPr>
-          <w:sz w:val="32"/>
-          <w:szCs w:val="32"/>
-        </w:rPr>
-        <w:t xml:space="preserve"># </w:t>
-      </w:r>
-      <w:proofErr w:type="spellStart"/>
-      <w:r>
-        <w:rPr>
-          <w:b/>
-          <w:bCs/>
-          <w:sz w:val="32"/>
-          <w:szCs w:val="32"/>
-        </w:rPr>
-        <w:t>cSpell.words</w:t>
-      </w:r>
-      <w:proofErr w:type="spellEnd"/>
-      <w:r>
-        <w:rPr>
-          <w:sz w:val="32"/>
-          <w:szCs w:val="32"/>
-        </w:rPr>
-        <w:t xml:space="preserve"> tells the spell checker not to flag like we know this word. Don’t complain about it (Project level dictionary)</w:t>
-      </w:r>
-    </w:p>
-    <w:p>
-      <w:pPr>
-        <w:jc w:val="both"/>
-        <w:rPr>
-          <w:sz w:val="32"/>
-          <w:szCs w:val="32"/>
-        </w:rPr>
-      </w:pPr>
-      <w:r>
-        <w:rPr>
-          <w:sz w:val="32"/>
-          <w:szCs w:val="32"/>
-        </w:rPr>
-        <w:t xml:space="preserve"># </w:t>
-      </w:r>
-      <w:proofErr w:type="spellStart"/>
-      <w:proofErr w:type="gramStart"/>
-      <w:r>
-        <w:rPr>
-          <w:b/>
-          <w:bCs/>
-          <w:sz w:val="32"/>
-          <w:szCs w:val="32"/>
-        </w:rPr>
-        <w:t>java.configuration</w:t>
-      </w:r>
-      <w:proofErr w:type="gramEnd"/>
-      <w:r>
-        <w:rPr>
-          <w:b/>
-          <w:bCs/>
-          <w:sz w:val="32"/>
-          <w:szCs w:val="32"/>
-        </w:rPr>
-        <w:t>.updateBuildConfiguration</w:t>
-      </w:r>
-      <w:proofErr w:type="spellEnd"/>
-      <w:r>
-        <w:rPr>
-          <w:sz w:val="32"/>
-          <w:szCs w:val="32"/>
-        </w:rPr>
-        <w:t xml:space="preserve"> </w:t>
-      </w:r>
-      <w:r>
-        <w:rPr>
-          <w:sz w:val="32"/>
-          <w:szCs w:val="32"/>
-        </w:rPr>
-        <w:t>controls what VS Code does when it detects that our Gradle configuration has changed.</w:t>
-      </w:r>
-      <w:r>
-        <w:rPr>
-          <w:sz w:val="32"/>
-          <w:szCs w:val="32"/>
-        </w:rPr>
-        <w:t xml:space="preserve"> </w:t>
-      </w:r>
-      <w:r>
-        <w:rPr>
-          <w:sz w:val="32"/>
-          <w:szCs w:val="32"/>
-        </w:rPr>
-        <w:t>For example,</w:t>
-      </w:r>
-      <w:r>
-        <w:rPr>
-          <w:sz w:val="32"/>
-          <w:szCs w:val="32"/>
-        </w:rPr>
-        <w:t xml:space="preserve"> </w:t>
-      </w:r>
-      <w:r>
-        <w:rPr>
-          <w:sz w:val="32"/>
-          <w:szCs w:val="32"/>
-        </w:rPr>
-        <w:t xml:space="preserve">our </w:t>
-      </w:r>
-      <w:r>
-        <w:rPr>
-          <w:b/>
-          <w:bCs/>
-          <w:sz w:val="32"/>
-          <w:szCs w:val="32"/>
-        </w:rPr>
-        <w:t>Flutter</w:t>
-      </w:r>
-      <w:r>
-        <w:rPr>
-          <w:sz w:val="32"/>
-          <w:szCs w:val="32"/>
-        </w:rPr>
-        <w:t xml:space="preserve"> project has:</w:t>
-      </w:r>
-    </w:p>
-    <w:p>
-      <w:pPr>
-        <w:jc w:val="both"/>
-        <w:rPr>
-          <w:b/>
-          <w:bCs/>
-          <w:sz w:val="28"/>
-          <w:szCs w:val="28"/>
-        </w:rPr>
-      </w:pPr>
-      <w:r>
-        <w:rPr>
-          <w:b/>
-          <w:bCs/>
-          <w:sz w:val="28"/>
-          <w:szCs w:val="28"/>
-        </w:rPr>
-        <w:t>android/</w:t>
-      </w:r>
-    </w:p>
-    <w:p>
-      <w:pPr>
-        <w:jc w:val="both"/>
-        <w:rPr>
-          <w:b/>
-          <w:bCs/>
-          <w:sz w:val="28"/>
-          <w:szCs w:val="28"/>
-        </w:rPr>
-      </w:pPr>
-      <w:r>
-        <w:rPr>
-          <w:rFonts w:ascii="Arial" w:hAnsi="Arial" w:cs="Arial"/>
-          <w:b/>
-          <w:bCs/>
-          <w:sz w:val="28"/>
-          <w:szCs w:val="28"/>
-        </w:rPr>
-        <w:t>├</w:t>
-      </w:r>
-      <w:r>
-        <w:rPr>
-          <w:rFonts w:ascii="Aptos" w:hAnsi="Aptos" w:cs="Aptos"/>
-          <w:b/>
-          <w:bCs/>
-          <w:sz w:val="28"/>
-          <w:szCs w:val="28"/>
-        </w:rPr>
-        <w:t>──</w:t>
-      </w:r>
-      <w:r>
-        <w:rPr>
-          <w:b/>
-          <w:bCs/>
-          <w:sz w:val="28"/>
-          <w:szCs w:val="28"/>
-        </w:rPr>
-        <w:t xml:space="preserve"> </w:t>
-      </w:r>
-      <w:proofErr w:type="spellStart"/>
-      <w:r>
-        <w:rPr>
-          <w:b/>
-          <w:bCs/>
-          <w:sz w:val="28"/>
-          <w:szCs w:val="28"/>
-        </w:rPr>
-        <w:t>build.gradle.kts</w:t>
-      </w:r>
-      <w:proofErr w:type="spellEnd"/>
-    </w:p>
-    <w:p>
-      <w:pPr>
-        <w:jc w:val="both"/>
-        <w:rPr>
-          <w:b/>
-          <w:bCs/>
-          <w:sz w:val="28"/>
-          <w:szCs w:val="28"/>
-        </w:rPr>
-      </w:pPr>
-      <w:r>
-        <w:rPr>
-          <w:rFonts w:ascii="Arial" w:hAnsi="Arial" w:cs="Arial"/>
-          <w:b/>
-          <w:bCs/>
-          <w:sz w:val="28"/>
-          <w:szCs w:val="28"/>
-        </w:rPr>
-        <w:t>├</w:t>
-      </w:r>
-      <w:r>
-        <w:rPr>
-          <w:rFonts w:ascii="Aptos" w:hAnsi="Aptos" w:cs="Aptos"/>
-          <w:b/>
-          <w:bCs/>
-          <w:sz w:val="28"/>
-          <w:szCs w:val="28"/>
-        </w:rPr>
-        <w:t>──</w:t>
-      </w:r>
-      <w:r>
-        <w:rPr>
-          <w:b/>
-          <w:bCs/>
-          <w:sz w:val="28"/>
-          <w:szCs w:val="28"/>
-        </w:rPr>
-        <w:t xml:space="preserve"> </w:t>
-      </w:r>
-      <w:proofErr w:type="spellStart"/>
-      <w:r>
-        <w:rPr>
-          <w:b/>
-          <w:bCs/>
-          <w:sz w:val="28"/>
-          <w:szCs w:val="28"/>
-        </w:rPr>
-        <w:t>settings.gradle.kts</w:t>
-      </w:r>
-      <w:proofErr w:type="spellEnd"/>
-    </w:p>
-    <w:p>
-      <w:pPr>
-        <w:jc w:val="both"/>
-        <w:rPr>
-          <w:b/>
-          <w:bCs/>
-          <w:sz w:val="28"/>
-          <w:szCs w:val="28"/>
-        </w:rPr>
-      </w:pPr>
-      <w:r>
-        <w:rPr>
-          <w:b/>
-          <w:bCs/>
-          <w:sz w:val="28"/>
-          <w:szCs w:val="28"/>
-        </w:rPr>
-        <w:t>└── app/</w:t>
-      </w:r>
-    </w:p>
-    <w:p>
-      <w:pPr>
-        <w:jc w:val="both"/>
-        <w:rPr>
-          <w:b/>
-          <w:bCs/>
-          <w:sz w:val="28"/>
-          <w:szCs w:val="28"/>
-        </w:rPr>
-      </w:pPr>
-      <w:r>
-        <w:rPr>
-          <w:b/>
-          <w:bCs/>
-          <w:sz w:val="28"/>
-          <w:szCs w:val="28"/>
-        </w:rPr>
-        <w:t xml:space="preserve">    └── </w:t>
-      </w:r>
-      <w:proofErr w:type="spellStart"/>
-      <w:r>
-        <w:rPr>
-          <w:b/>
-          <w:bCs/>
-          <w:sz w:val="28"/>
-          <w:szCs w:val="28"/>
-        </w:rPr>
-        <w:t>build.gradle.kts</w:t>
-      </w:r>
-      <w:proofErr w:type="spellEnd"/>
+        <w:t xml:space="preserve">    └── build.gradle.kts</w:t>
+      </w:r>
     </w:p>
     <w:p>
       <w:pPr>
@@ -2803,8 +2443,6 @@
         </w:rPr>
         <w:t xml:space="preserve"># It shows custom lines for better clarity of the Widget tree in Flutter. To enable this in project level just add it in </w:t>
       </w:r>
-      <w:proofErr w:type="spellStart"/>
-      <w:proofErr w:type="gramStart"/>
       <w:r>
         <w:rPr>
           <w:b/>
@@ -2814,8 +2452,6 @@
         </w:rPr>
         <w:t>settings.json</w:t>
       </w:r>
-      <w:proofErr w:type="spellEnd"/>
-      <w:proofErr w:type="gramEnd"/>
     </w:p>
     <w:p>
       <w:pPr>
@@ -2880,11 +2516,12 @@
           <w:sz w:val="32"/>
           <w:szCs w:val="32"/>
         </w:rPr>
-        <w:t>    "</w:t>
-      </w:r>
-      <w:proofErr w:type="spellStart"/>
-      <w:proofErr w:type="gramStart"/>
-      <w:r>
+        <w:t>    "dart.previewFlutterUiGuides": true,</w:t>
+      </w:r>
+    </w:p>
+    <w:p>
+      <w:pPr>
+        <w:jc w:val="both"/>
         <w:rPr>
           <w:b/>
           <w:bCs/>
@@ -2892,10 +2529,7 @@
           <w:sz w:val="32"/>
           <w:szCs w:val="32"/>
         </w:rPr>
-        <w:t>dart.previewFlutterUiGuides</w:t>
-      </w:r>
-      <w:proofErr w:type="spellEnd"/>
-      <w:proofErr w:type="gramEnd"/>
+      </w:pPr>
       <w:r>
         <w:rPr>
           <w:b/>
@@ -2904,28 +2538,6 @@
           <w:sz w:val="32"/>
           <w:szCs w:val="32"/>
         </w:rPr>
-        <w:t>": true,</w:t>
-      </w:r>
-    </w:p>
-    <w:p>
-      <w:pPr>
-        <w:jc w:val="both"/>
-        <w:rPr>
-          <w:b/>
-          <w:bCs/>
-          <w:color w:val="D86DCB" w:themeColor="accent5" w:themeTint="99"/>
-          <w:sz w:val="32"/>
-          <w:szCs w:val="32"/>
-        </w:rPr>
-      </w:pPr>
-      <w:r>
-        <w:rPr>
-          <w:b/>
-          <w:bCs/>
-          <w:color w:val="D86DCB" w:themeColor="accent5" w:themeTint="99"/>
-          <w:sz w:val="32"/>
-          <w:szCs w:val="32"/>
-        </w:rPr>
         <w:t>}</w:t>
       </w:r>
     </w:p>
@@ -3034,7 +2646,6 @@
         </w:rPr>
         <w:t xml:space="preserve"> or workspace (applicable to all projects) and User settings (applicable for only that user). And project level settings (</w:t>
       </w:r>
-      <w:proofErr w:type="spellStart"/>
       <w:r>
         <w:rPr>
           <w:b/>
@@ -3044,43 +2655,22 @@
         </w:rPr>
         <w:t>settings.json</w:t>
       </w:r>
-      <w:proofErr w:type="spellEnd"/>
-      <w:r>
-        <w:rPr>
-          <w:sz w:val="32"/>
-          <w:szCs w:val="32"/>
-        </w:rPr>
-        <w:t xml:space="preserve"> file </w:t>
-      </w:r>
-      <w:proofErr w:type="gramStart"/>
-      <w:r>
-        <w:rPr>
-          <w:sz w:val="32"/>
-          <w:szCs w:val="32"/>
-        </w:rPr>
-        <w:t xml:space="preserve">in </w:t>
-      </w:r>
-      <w:r>
-        <w:rPr>
-          <w:b/>
-          <w:bCs/>
-          <w:sz w:val="32"/>
-          <w:szCs w:val="32"/>
-        </w:rPr>
-        <w:t>.</w:t>
-      </w:r>
-      <w:proofErr w:type="spellStart"/>
-      <w:r>
-        <w:rPr>
-          <w:b/>
-          <w:bCs/>
-          <w:sz w:val="32"/>
-          <w:szCs w:val="32"/>
-        </w:rPr>
-        <w:t>vscode</w:t>
-      </w:r>
-      <w:proofErr w:type="spellEnd"/>
-      <w:proofErr w:type="gramEnd"/>
+      <w:r>
+        <w:rPr>
+          <w:sz w:val="32"/>
+          <w:szCs w:val="32"/>
+        </w:rPr>
+        <w:t xml:space="preserve"> file in </w:t>
+      </w:r>
+      <w:r>
+        <w:rPr>
+          <w:b/>
+          <w:bCs/>
+          <w:sz w:val="32"/>
+          <w:szCs w:val="32"/>
+        </w:rPr>
+        <w:t>.vscode</w:t>
+      </w:r>
       <w:r>
         <w:rPr>
           <w:sz w:val="32"/>
@@ -3189,63 +2779,23 @@
           <w:sz w:val="32"/>
           <w:szCs w:val="32"/>
         </w:rPr>
-        <w:t xml:space="preserve"> </w:t>
-      </w:r>
-      <w:proofErr w:type="spellStart"/>
-      <w:r>
-        <w:rPr>
-          <w:b/>
-          <w:bCs/>
-          <w:sz w:val="32"/>
-          <w:szCs w:val="32"/>
-        </w:rPr>
-        <w:t>launch.json</w:t>
-      </w:r>
-      <w:proofErr w:type="spellEnd"/>
-      <w:r>
-        <w:rPr>
-          <w:sz w:val="32"/>
-          <w:szCs w:val="32"/>
-        </w:rPr>
-        <w:t xml:space="preserve"> file will be added in </w:t>
-      </w:r>
-      <w:proofErr w:type="gramStart"/>
-      <w:r>
-        <w:rPr>
-          <w:sz w:val="32"/>
-          <w:szCs w:val="32"/>
-        </w:rPr>
-        <w:t xml:space="preserve">the </w:t>
-      </w:r>
-      <w:r>
-        <w:rPr>
-          <w:b/>
-          <w:bCs/>
-          <w:sz w:val="32"/>
-          <w:szCs w:val="32"/>
-        </w:rPr>
-        <w:t>.</w:t>
-      </w:r>
-      <w:proofErr w:type="spellStart"/>
-      <w:r>
-        <w:rPr>
-          <w:b/>
-          <w:bCs/>
-          <w:sz w:val="32"/>
-          <w:szCs w:val="32"/>
-        </w:rPr>
-        <w:t>vscode</w:t>
-      </w:r>
-      <w:proofErr w:type="spellEnd"/>
-      <w:proofErr w:type="gramEnd"/>
-      <w:r>
-        <w:rPr>
-          <w:b/>
-          <w:bCs/>
-          <w:sz w:val="32"/>
-          <w:szCs w:val="32"/>
-        </w:rPr>
-        <w:t>/</w:t>
+        <w:t xml:space="preserve"> launch.json</w:t>
+      </w:r>
+      <w:r>
+        <w:rPr>
+          <w:sz w:val="32"/>
+          <w:szCs w:val="32"/>
+        </w:rPr>
+        <w:t xml:space="preserve"> file will be added in the </w:t>
+      </w:r>
+      <w:r>
+        <w:rPr>
+          <w:b/>
+          <w:bCs/>
+          <w:sz w:val="32"/>
+          <w:szCs w:val="32"/>
+        </w:rPr>
+        <w:t>.vscode/</w:t>
       </w:r>
       <w:r>
         <w:rPr>
@@ -3341,19 +2891,8 @@
           <w:sz w:val="32"/>
           <w:szCs w:val="32"/>
         </w:rPr>
-        <w:t xml:space="preserve"> </w:t>
-      </w:r>
-      <w:proofErr w:type="spellStart"/>
-      <w:r>
-        <w:rPr>
-          <w:b/>
-          <w:bCs/>
-          <w:sz w:val="32"/>
-          <w:szCs w:val="32"/>
-        </w:rPr>
-        <w:t>launch.json</w:t>
-      </w:r>
-      <w:proofErr w:type="spellEnd"/>
+        <w:t xml:space="preserve"> launch.json</w:t>
+      </w:r>
       <w:r>
         <w:rPr>
           <w:sz w:val="32"/>
@@ -3370,25 +2909,14 @@
         </w:rPr>
         <w:t xml:space="preserve"> flutter run --flavor staging --dart-define=API_URL=</w:t>
       </w:r>
-      <w:proofErr w:type="spellStart"/>
-      <w:r>
-        <w:rPr>
-          <w:b/>
-          <w:bCs/>
-          <w:sz w:val="32"/>
-          <w:szCs w:val="32"/>
-        </w:rPr>
-        <w:t>htt</w:t>
-      </w:r>
-      <w:proofErr w:type="spellEnd"/>
-      <w:r>
-        <w:rPr>
-          <w:b/>
-          <w:bCs/>
-          <w:sz w:val="32"/>
-          <w:szCs w:val="32"/>
-        </w:rPr>
-        <w:t xml:space="preserve">… </w:t>
+      <w:r>
+        <w:rPr>
+          <w:b/>
+          <w:bCs/>
+          <w:sz w:val="32"/>
+          <w:szCs w:val="32"/>
+        </w:rPr>
+        <w:t xml:space="preserve">htt… </w:t>
       </w:r>
       <w:r>
         <w:rPr>
@@ -3571,10 +3099,12 @@
           <w:sz w:val="32"/>
           <w:szCs w:val="32"/>
         </w:rPr>
-        <w:t xml:space="preserve">            "</w:t>
-      </w:r>
-      <w:proofErr w:type="spellStart"/>
-      <w:r>
+        <w:t xml:space="preserve">            "flutterMode": "debug",</w:t>
+      </w:r>
+    </w:p>
+    <w:p>
+      <w:pPr>
+        <w:jc w:val="both"/>
         <w:rPr>
           <w:b/>
           <w:bCs/>
@@ -3582,9 +3112,7 @@
           <w:sz w:val="32"/>
           <w:szCs w:val="32"/>
         </w:rPr>
-        <w:t>flutterMode</w:t>
-      </w:r>
-      <w:proofErr w:type="spellEnd"/>
+      </w:pPr>
       <w:r>
         <w:rPr>
           <w:b/>
@@ -3593,51 +3121,7 @@
           <w:sz w:val="32"/>
           <w:szCs w:val="32"/>
         </w:rPr>
-        <w:t>": "debug",</w:t>
-      </w:r>
-    </w:p>
-    <w:p>
-      <w:pPr>
-        <w:jc w:val="both"/>
-        <w:rPr>
-          <w:b/>
-          <w:bCs/>
-          <w:color w:val="D86DCB" w:themeColor="accent5" w:themeTint="99"/>
-          <w:sz w:val="32"/>
-          <w:szCs w:val="32"/>
-        </w:rPr>
-      </w:pPr>
-      <w:r>
-        <w:rPr>
-          <w:b/>
-          <w:bCs/>
-          <w:color w:val="D86DCB" w:themeColor="accent5" w:themeTint="99"/>
-          <w:sz w:val="32"/>
-          <w:szCs w:val="32"/>
-        </w:rPr>
-        <w:t xml:space="preserve">            "</w:t>
-      </w:r>
-      <w:proofErr w:type="spellStart"/>
-      <w:r>
-        <w:rPr>
-          <w:b/>
-          <w:bCs/>
-          <w:color w:val="D86DCB" w:themeColor="accent5" w:themeTint="99"/>
-          <w:sz w:val="32"/>
-          <w:szCs w:val="32"/>
-        </w:rPr>
-        <w:t>args</w:t>
-      </w:r>
-      <w:proofErr w:type="spellEnd"/>
-      <w:r>
-        <w:rPr>
-          <w:b/>
-          <w:bCs/>
-          <w:color w:val="D86DCB" w:themeColor="accent5" w:themeTint="99"/>
-          <w:sz w:val="32"/>
-          <w:szCs w:val="32"/>
-        </w:rPr>
-        <w:t>": [</w:t>
+        <w:t xml:space="preserve">            "args": [</w:t>
       </w:r>
     </w:p>
     <w:p>
@@ -3907,25 +3391,14 @@
         </w:rPr>
         <w:t xml:space="preserve">in </w:t>
       </w:r>
-      <w:proofErr w:type="spellStart"/>
-      <w:r>
-        <w:rPr>
-          <w:b/>
-          <w:bCs/>
-          <w:sz w:val="32"/>
-          <w:szCs w:val="32"/>
-        </w:rPr>
-        <w:t>flutterMode</w:t>
-      </w:r>
-      <w:proofErr w:type="spellEnd"/>
-      <w:r>
-        <w:rPr>
-          <w:b/>
-          <w:bCs/>
-          <w:sz w:val="32"/>
-          <w:szCs w:val="32"/>
-        </w:rPr>
-        <w:t xml:space="preserve">: </w:t>
+      <w:r>
+        <w:rPr>
+          <w:b/>
+          <w:bCs/>
+          <w:sz w:val="32"/>
+          <w:szCs w:val="32"/>
+        </w:rPr>
+        <w:t xml:space="preserve">flutterMode: </w:t>
       </w:r>
       <w:r>
         <w:rPr>
@@ -4031,29 +3504,8 @@
           <w:sz w:val="32"/>
           <w:szCs w:val="32"/>
         </w:rPr>
-        <w:t>"</w:t>
-      </w:r>
-      <w:proofErr w:type="spellStart"/>
-      <w:r>
-        <w:rPr>
-          <w:b/>
-          <w:bCs/>
-          <w:sz w:val="32"/>
-          <w:szCs w:val="32"/>
-        </w:rPr>
-        <w:t>cwd</w:t>
-      </w:r>
-      <w:proofErr w:type="spellEnd"/>
-      <w:r>
-        <w:rPr>
-          <w:b/>
-          <w:bCs/>
-          <w:sz w:val="32"/>
-          <w:szCs w:val="32"/>
-        </w:rPr>
-        <w:t>": "</w:t>
-      </w:r>
-      <w:proofErr w:type="spellStart"/>
+        <w:t>"cwd": "</w:t>
+      </w:r>
       <w:r>
         <w:rPr>
           <w:b/>
@@ -4063,7 +3515,6 @@
         </w:rPr>
         <w:t>project_name</w:t>
       </w:r>
-      <w:proofErr w:type="spellEnd"/>
       <w:r>
         <w:rPr>
           <w:b/>
@@ -4196,7 +3647,6 @@
         </w:rPr>
         <w:t xml:space="preserve"> Select </w:t>
       </w:r>
-      <w:proofErr w:type="spellStart"/>
       <w:r>
         <w:rPr>
           <w:b/>
@@ -4206,7 +3656,6 @@
         </w:rPr>
         <w:t>afterDelay</w:t>
       </w:r>
-      <w:proofErr w:type="spellEnd"/>
       <w:r>
         <w:rPr>
           <w:sz w:val="32"/>
@@ -4237,39 +3686,8 @@
           <w:sz w:val="32"/>
           <w:szCs w:val="32"/>
         </w:rPr>
-        <w:t>.</w:t>
-      </w:r>
-      <w:proofErr w:type="spellStart"/>
-      <w:r>
-        <w:rPr>
-          <w:b/>
-          <w:bCs/>
-          <w:sz w:val="32"/>
-          <w:szCs w:val="32"/>
-        </w:rPr>
-        <w:t>vscode</w:t>
-      </w:r>
-      <w:proofErr w:type="spellEnd"/>
-      <w:r>
-        <w:rPr>
-          <w:b/>
-          <w:bCs/>
-          <w:sz w:val="32"/>
-          <w:szCs w:val="32"/>
-        </w:rPr>
-        <w:t>/</w:t>
-      </w:r>
-      <w:proofErr w:type="spellStart"/>
-      <w:r>
-        <w:rPr>
-          <w:b/>
-          <w:bCs/>
-          <w:sz w:val="32"/>
-          <w:szCs w:val="32"/>
-        </w:rPr>
-        <w:t>settings.json</w:t>
-      </w:r>
-      <w:proofErr w:type="spellEnd"/>
+        <w:t>.vscode/settings.json</w:t>
+      </w:r>
       <w:r>
         <w:rPr>
           <w:sz w:val="32"/>
@@ -4319,11 +3737,12 @@
           <w:sz w:val="32"/>
           <w:szCs w:val="32"/>
         </w:rPr>
-        <w:t xml:space="preserve">    "</w:t>
-      </w:r>
-      <w:proofErr w:type="spellStart"/>
-      <w:proofErr w:type="gramStart"/>
-      <w:r>
+        <w:t xml:space="preserve">    "files.autoSave": "afterDelay",</w:t>
+      </w:r>
+    </w:p>
+    <w:p>
+      <w:pPr>
+        <w:jc w:val="both"/>
         <w:rPr>
           <w:b/>
           <w:bCs/>
@@ -4331,10 +3750,7 @@
           <w:sz w:val="32"/>
           <w:szCs w:val="32"/>
         </w:rPr>
-        <w:t>files.autoSave</w:t>
-      </w:r>
-      <w:proofErr w:type="spellEnd"/>
-      <w:proofErr w:type="gramEnd"/>
+      </w:pPr>
       <w:r>
         <w:rPr>
           <w:b/>
@@ -4343,75 +3759,7 @@
           <w:sz w:val="32"/>
           <w:szCs w:val="32"/>
         </w:rPr>
-        <w:t>": "</w:t>
-      </w:r>
-      <w:proofErr w:type="spellStart"/>
-      <w:r>
-        <w:rPr>
-          <w:b/>
-          <w:bCs/>
-          <w:color w:val="D86DCB" w:themeColor="accent5" w:themeTint="99"/>
-          <w:sz w:val="32"/>
-          <w:szCs w:val="32"/>
-        </w:rPr>
-        <w:t>afterDelay</w:t>
-      </w:r>
-      <w:proofErr w:type="spellEnd"/>
-      <w:r>
-        <w:rPr>
-          <w:b/>
-          <w:bCs/>
-          <w:color w:val="D86DCB" w:themeColor="accent5" w:themeTint="99"/>
-          <w:sz w:val="32"/>
-          <w:szCs w:val="32"/>
-        </w:rPr>
-        <w:t>",</w:t>
-      </w:r>
-    </w:p>
-    <w:p>
-      <w:pPr>
-        <w:jc w:val="both"/>
-        <w:rPr>
-          <w:b/>
-          <w:bCs/>
-          <w:color w:val="D86DCB" w:themeColor="accent5" w:themeTint="99"/>
-          <w:sz w:val="32"/>
-          <w:szCs w:val="32"/>
-        </w:rPr>
-      </w:pPr>
-      <w:r>
-        <w:rPr>
-          <w:b/>
-          <w:bCs/>
-          <w:color w:val="D86DCB" w:themeColor="accent5" w:themeTint="99"/>
-          <w:sz w:val="32"/>
-          <w:szCs w:val="32"/>
-        </w:rPr>
-        <w:t xml:space="preserve">    "</w:t>
-      </w:r>
-      <w:proofErr w:type="spellStart"/>
-      <w:proofErr w:type="gramStart"/>
-      <w:r>
-        <w:rPr>
-          <w:b/>
-          <w:bCs/>
-          <w:color w:val="D86DCB" w:themeColor="accent5" w:themeTint="99"/>
-          <w:sz w:val="32"/>
-          <w:szCs w:val="32"/>
-        </w:rPr>
-        <w:t>files.autoSaveDelay</w:t>
-      </w:r>
-      <w:proofErr w:type="spellEnd"/>
-      <w:proofErr w:type="gramEnd"/>
-      <w:r>
-        <w:rPr>
-          <w:b/>
-          <w:bCs/>
-          <w:color w:val="D86DCB" w:themeColor="accent5" w:themeTint="99"/>
-          <w:sz w:val="32"/>
-          <w:szCs w:val="32"/>
-        </w:rPr>
-        <w:t>": 1000</w:t>
+        <w:t xml:space="preserve">    "files.autoSaveDelay": 1000</w:t>
       </w:r>
     </w:p>
     <w:p>
@@ -4559,7 +3907,6 @@
         </w:rPr>
         <w:t xml:space="preserve"># Use </w:t>
       </w:r>
-      <w:proofErr w:type="spellStart"/>
       <w:r>
         <w:rPr>
           <w:b/>
@@ -4569,7 +3916,6 @@
         </w:rPr>
         <w:t>scrcpy</w:t>
       </w:r>
-      <w:proofErr w:type="spellEnd"/>
       <w:r>
         <w:rPr>
           <w:sz w:val="32"/>
@@ -4657,7 +4003,6 @@
           <w:szCs w:val="32"/>
         </w:rPr>
       </w:pPr>
-      <w:proofErr w:type="spellStart"/>
       <w:r>
         <w:rPr>
           <w:b/>
@@ -4666,10 +4011,28 @@
           <w:sz w:val="32"/>
           <w:szCs w:val="32"/>
         </w:rPr>
-        <w:t>winget</w:t>
-      </w:r>
-      <w:proofErr w:type="spellEnd"/>
-      <w:r>
+        <w:t>winget install --exact Genymobile.scrcpy</w:t>
+      </w:r>
+    </w:p>
+    <w:p>
+      <w:pPr>
+        <w:jc w:val="both"/>
+        <w:rPr>
+          <w:sz w:val="32"/>
+          <w:szCs w:val="32"/>
+        </w:rPr>
+      </w:pPr>
+      <w:r>
+        <w:rPr>
+          <w:sz w:val="32"/>
+          <w:szCs w:val="32"/>
+        </w:rPr>
+        <w:t># Then simply run this command in the PowerShell:</w:t>
+      </w:r>
+    </w:p>
+    <w:p>
+      <w:pPr>
+        <w:jc w:val="both"/>
         <w:rPr>
           <w:b/>
           <w:bCs/>
@@ -4677,9 +4040,7 @@
           <w:sz w:val="32"/>
           <w:szCs w:val="32"/>
         </w:rPr>
-        <w:t xml:space="preserve"> install --exact </w:t>
-      </w:r>
-      <w:proofErr w:type="spellStart"/>
+      </w:pPr>
       <w:r>
         <w:rPr>
           <w:b/>
@@ -4688,27 +4049,198 @@
           <w:sz w:val="32"/>
           <w:szCs w:val="32"/>
         </w:rPr>
-        <w:t>Genymobile.scrcpy</w:t>
-      </w:r>
-      <w:proofErr w:type="spellEnd"/>
-    </w:p>
-    <w:p>
-      <w:pPr>
-        <w:jc w:val="both"/>
-        <w:rPr>
-          <w:sz w:val="32"/>
-          <w:szCs w:val="32"/>
-        </w:rPr>
-      </w:pPr>
-    </w:p>
-    <w:p>
-      <w:pPr>
-        <w:jc w:val="both"/>
-        <w:rPr>
-          <w:sz w:val="32"/>
-          <w:szCs w:val="32"/>
-        </w:rPr>
-      </w:pPr>
+        <w:t>scrcpy</w:t>
+      </w:r>
+    </w:p>
+    <w:p>
+      <w:pPr>
+        <w:jc w:val="both"/>
+        <w:rPr>
+          <w:sz w:val="32"/>
+          <w:szCs w:val="32"/>
+        </w:rPr>
+      </w:pPr>
+      <w:r>
+        <w:rPr>
+          <w:sz w:val="32"/>
+          <w:szCs w:val="32"/>
+        </w:rPr>
+        <w:t># If we want to keep the screen awake then:</w:t>
+      </w:r>
+    </w:p>
+    <w:p>
+      <w:pPr>
+        <w:jc w:val="both"/>
+        <w:rPr>
+          <w:b/>
+          <w:bCs/>
+          <w:color w:val="60CAF3" w:themeColor="accent4" w:themeTint="99"/>
+          <w:sz w:val="32"/>
+          <w:szCs w:val="32"/>
+        </w:rPr>
+      </w:pPr>
+      <w:r>
+        <w:rPr>
+          <w:b/>
+          <w:bCs/>
+          <w:color w:val="60CAF3" w:themeColor="accent4" w:themeTint="99"/>
+          <w:sz w:val="32"/>
+          <w:szCs w:val="32"/>
+        </w:rPr>
+        <w:t>scrcpy --stay-awake</w:t>
+      </w:r>
+    </w:p>
+    <w:p>
+      <w:pPr>
+        <w:jc w:val="both"/>
+        <w:rPr>
+          <w:sz w:val="32"/>
+          <w:szCs w:val="32"/>
+        </w:rPr>
+      </w:pPr>
+    </w:p>
+    <w:p>
+      <w:pPr>
+        <w:jc w:val="both"/>
+        <w:rPr>
+          <w:sz w:val="32"/>
+          <w:szCs w:val="32"/>
+        </w:rPr>
+      </w:pPr>
+      <w:r>
+        <w:rPr>
+          <w:sz w:val="32"/>
+          <w:szCs w:val="32"/>
+        </w:rPr>
+        <w:t>VS Code Extension:</w:t>
+      </w:r>
+    </w:p>
+    <w:p>
+      <w:pPr>
+        <w:jc w:val="both"/>
+        <w:rPr>
+          <w:sz w:val="32"/>
+          <w:szCs w:val="32"/>
+        </w:rPr>
+      </w:pPr>
+      <w:r>
+        <w:rPr>
+          <w:sz w:val="32"/>
+          <w:szCs w:val="32"/>
+        </w:rPr>
+        <w:t xml:space="preserve"># Or go to the extension section of VS code and install the </w:t>
+      </w:r>
+      <w:r>
+        <w:rPr>
+          <w:b/>
+          <w:bCs/>
+          <w:sz w:val="32"/>
+          <w:szCs w:val="32"/>
+        </w:rPr>
+        <w:t xml:space="preserve">scrcpy </w:t>
+      </w:r>
+      <w:r>
+        <w:rPr>
+          <w:sz w:val="32"/>
+          <w:szCs w:val="32"/>
+        </w:rPr>
+        <w:t xml:space="preserve">extension then go to on the top left corner </w:t>
+      </w:r>
+      <w:r>
+        <w:rPr>
+          <w:b/>
+          <w:bCs/>
+          <w:sz w:val="32"/>
+          <w:szCs w:val="32"/>
+        </w:rPr>
+        <w:t>View</w:t>
+      </w:r>
+      <w:r>
+        <w:rPr>
+          <w:sz w:val="32"/>
+          <w:szCs w:val="32"/>
+        </w:rPr>
+        <w:t xml:space="preserve"> </w:t>
+      </w:r>
+      <w:r>
+        <w:rPr>
+          <w:sz w:val="32"/>
+          <w:szCs w:val="32"/>
+        </w:rPr>
+        <w:sym w:font="Wingdings" w:char="F0E0"/>
+      </w:r>
+      <w:r>
+        <w:rPr>
+          <w:sz w:val="32"/>
+          <w:szCs w:val="32"/>
+        </w:rPr>
+        <w:t xml:space="preserve"> </w:t>
+      </w:r>
+      <w:r>
+        <w:rPr>
+          <w:b/>
+          <w:bCs/>
+          <w:sz w:val="32"/>
+          <w:szCs w:val="32"/>
+        </w:rPr>
+        <w:t>Command Pallet</w:t>
+      </w:r>
+      <w:r>
+        <w:rPr>
+          <w:sz w:val="32"/>
+          <w:szCs w:val="32"/>
+        </w:rPr>
+        <w:t xml:space="preserve"> and search fo</w:t>
+      </w:r>
+      <w:r>
+        <w:rPr>
+          <w:sz w:val="32"/>
+          <w:szCs w:val="32"/>
+        </w:rPr>
+        <w:t>r</w:t>
+      </w:r>
+      <w:r>
+        <w:rPr>
+          <w:b/>
+          <w:bCs/>
+          <w:sz w:val="32"/>
+          <w:szCs w:val="32"/>
+        </w:rPr>
+        <w:t xml:space="preserve"> &gt;scrcpy</w:t>
+      </w:r>
+      <w:r>
+        <w:rPr>
+          <w:b/>
+          <w:bCs/>
+          <w:sz w:val="32"/>
+          <w:szCs w:val="32"/>
+        </w:rPr>
+        <w:t>:</w:t>
+      </w:r>
+      <w:r>
+        <w:rPr>
+          <w:sz w:val="32"/>
+          <w:szCs w:val="32"/>
+        </w:rPr>
+        <w:t xml:space="preserve"> and run it</w:t>
+      </w:r>
+    </w:p>
+    <w:p>
+      <w:pPr>
+        <w:jc w:val="both"/>
+        <w:rPr>
+          <w:sz w:val="32"/>
+          <w:szCs w:val="32"/>
+        </w:rPr>
+      </w:pPr>
+      <w:r>
+        <w:rPr>
+          <w:sz w:val="32"/>
+          <w:szCs w:val="32"/>
+        </w:rPr>
+        <w:lastRenderedPageBreak/>
+        <w:t># It will mirror our physical device without needing to open a external terminal (it saves up ram, tiny bit)</w:t>
+      </w:r>
     </w:p>
     <w:p>
       <w:pPr>
@@ -4777,8 +4309,575 @@
           <w:sz w:val="32"/>
           <w:szCs w:val="32"/>
         </w:rPr>
+        <w:t>#</w:t>
+      </w:r>
+      <w:r>
+        <w:rPr>
+          <w:sz w:val="32"/>
+          <w:szCs w:val="32"/>
+        </w:rPr>
+        <w:t xml:space="preserve"> C</w:t>
+      </w:r>
+      <w:r>
+        <w:rPr>
+          <w:sz w:val="32"/>
+          <w:szCs w:val="32"/>
+        </w:rPr>
+        <w:t>reate any device profile (Pixel 8, Nexus, custom screen dimensions) directly from our terminal using the standalone Android Command Line Tools</w:t>
+      </w:r>
+      <w:r>
+        <w:rPr>
+          <w:sz w:val="32"/>
+          <w:szCs w:val="32"/>
+        </w:rPr>
+        <w:t xml:space="preserve"> (</w:t>
+      </w:r>
+      <w:r>
+        <w:rPr>
+          <w:b/>
+          <w:bCs/>
+          <w:sz w:val="32"/>
+          <w:szCs w:val="32"/>
+        </w:rPr>
+        <w:t>avdmanager</w:t>
+      </w:r>
+      <w:r>
+        <w:rPr>
+          <w:sz w:val="32"/>
+          <w:szCs w:val="32"/>
+        </w:rPr>
+        <w:t>)</w:t>
+      </w:r>
+    </w:p>
+    <w:p>
+      <w:pPr>
+        <w:jc w:val="both"/>
+        <w:rPr>
+          <w:sz w:val="32"/>
+          <w:szCs w:val="32"/>
+        </w:rPr>
+      </w:pPr>
+      <w:r>
+        <w:rPr>
+          <w:sz w:val="32"/>
+          <w:szCs w:val="32"/>
+        </w:rPr>
         <w:t xml:space="preserve"># </w:t>
       </w:r>
+      <w:r>
+        <w:rPr>
+          <w:sz w:val="32"/>
+          <w:szCs w:val="32"/>
+        </w:rPr>
+        <w:t>Install SDK Tools &amp; Images</w:t>
+      </w:r>
+      <w:r>
+        <w:rPr>
+          <w:sz w:val="32"/>
+          <w:szCs w:val="32"/>
+        </w:rPr>
+        <w:t xml:space="preserve"> by o</w:t>
+      </w:r>
+      <w:r>
+        <w:rPr>
+          <w:sz w:val="32"/>
+          <w:szCs w:val="32"/>
+        </w:rPr>
+        <w:t>pen</w:t>
+      </w:r>
+      <w:r>
+        <w:rPr>
+          <w:sz w:val="32"/>
+          <w:szCs w:val="32"/>
+        </w:rPr>
+        <w:t>ing</w:t>
+      </w:r>
+      <w:r>
+        <w:rPr>
+          <w:sz w:val="32"/>
+          <w:szCs w:val="32"/>
+        </w:rPr>
+        <w:t xml:space="preserve"> our terminal and list/install our target system image</w:t>
+      </w:r>
+      <w:r>
+        <w:rPr>
+          <w:sz w:val="32"/>
+          <w:szCs w:val="32"/>
+        </w:rPr>
+        <w:t xml:space="preserve">. Here, downloading </w:t>
+      </w:r>
+      <w:r>
+        <w:rPr>
+          <w:sz w:val="32"/>
+          <w:szCs w:val="32"/>
+        </w:rPr>
+        <w:t>system image Android 14/API 34</w:t>
+      </w:r>
+    </w:p>
+    <w:p>
+      <w:pPr>
+        <w:jc w:val="both"/>
+        <w:rPr>
+          <w:b/>
+          <w:bCs/>
+          <w:color w:val="60CAF3" w:themeColor="accent4" w:themeTint="99"/>
+          <w:sz w:val="32"/>
+          <w:szCs w:val="32"/>
+        </w:rPr>
+      </w:pPr>
+      <w:r>
+        <w:rPr>
+          <w:b/>
+          <w:bCs/>
+          <w:color w:val="60CAF3" w:themeColor="accent4" w:themeTint="99"/>
+          <w:sz w:val="32"/>
+          <w:szCs w:val="32"/>
+        </w:rPr>
+        <w:t>sdkmanager</w:t>
+      </w:r>
+      <w:r>
+        <w:rPr>
+          <w:b/>
+          <w:bCs/>
+          <w:color w:val="60CAF3" w:themeColor="accent4" w:themeTint="99"/>
+          <w:sz w:val="32"/>
+          <w:szCs w:val="32"/>
+        </w:rPr>
+        <w:t xml:space="preserve"> \</w:t>
+      </w:r>
+    </w:p>
+    <w:p>
+      <w:pPr>
+        <w:jc w:val="both"/>
+        <w:rPr>
+          <w:b/>
+          <w:bCs/>
+          <w:color w:val="60CAF3" w:themeColor="accent4" w:themeTint="99"/>
+          <w:sz w:val="32"/>
+          <w:szCs w:val="32"/>
+        </w:rPr>
+      </w:pPr>
+      <w:r>
+        <w:rPr>
+          <w:b/>
+          <w:bCs/>
+          <w:color w:val="60CAF3" w:themeColor="accent4" w:themeTint="99"/>
+          <w:sz w:val="32"/>
+          <w:szCs w:val="32"/>
+        </w:rPr>
+        <w:t>"system-images;android-34;google_apis_playstore;x86_64" "platforms;android-34" "emulator"</w:t>
+      </w:r>
+    </w:p>
+    <w:p>
+      <w:pPr>
+        <w:jc w:val="both"/>
+        <w:rPr>
+          <w:sz w:val="32"/>
+          <w:szCs w:val="32"/>
+        </w:rPr>
+      </w:pPr>
+      <w:r>
+        <w:rPr>
+          <w:sz w:val="32"/>
+          <w:szCs w:val="32"/>
+        </w:rPr>
+        <w:t xml:space="preserve"># Create the Device. Use </w:t>
+      </w:r>
+      <w:r>
+        <w:rPr>
+          <w:b/>
+          <w:bCs/>
+          <w:sz w:val="32"/>
+          <w:szCs w:val="32"/>
+        </w:rPr>
+        <w:t>advmanager</w:t>
+      </w:r>
+      <w:r>
+        <w:rPr>
+          <w:sz w:val="32"/>
+          <w:szCs w:val="32"/>
+        </w:rPr>
+        <w:t xml:space="preserve"> to instantiate a named virtual device:</w:t>
+      </w:r>
+    </w:p>
+    <w:p>
+      <w:pPr>
+        <w:jc w:val="both"/>
+        <w:rPr>
+          <w:b/>
+          <w:bCs/>
+          <w:color w:val="60CAF3" w:themeColor="accent4" w:themeTint="99"/>
+          <w:sz w:val="32"/>
+          <w:szCs w:val="32"/>
+        </w:rPr>
+      </w:pPr>
+      <w:r>
+        <w:rPr>
+          <w:b/>
+          <w:bCs/>
+          <w:color w:val="60CAF3" w:themeColor="accent4" w:themeTint="99"/>
+          <w:sz w:val="32"/>
+          <w:szCs w:val="32"/>
+        </w:rPr>
+        <w:t>avdmanager create avd --name "Pixel_7_Pro" --package "system-images;android-34;google_apis_playstore;x86_64" --device "pixel_7_pro"</w:t>
+      </w:r>
+    </w:p>
+    <w:p>
+      <w:pPr>
+        <w:jc w:val="both"/>
+        <w:rPr>
+          <w:sz w:val="32"/>
+          <w:szCs w:val="32"/>
+        </w:rPr>
+      </w:pPr>
+      <w:r>
+        <w:rPr>
+          <w:sz w:val="32"/>
+          <w:szCs w:val="32"/>
+        </w:rPr>
+        <w:t># Launch the device. Once launched</w:t>
+      </w:r>
+      <w:r>
+        <w:rPr>
+          <w:b/>
+          <w:bCs/>
+          <w:sz w:val="32"/>
+          <w:szCs w:val="32"/>
+        </w:rPr>
+        <w:t xml:space="preserve"> Flutter</w:t>
+      </w:r>
+      <w:r>
+        <w:rPr>
+          <w:sz w:val="32"/>
+          <w:szCs w:val="32"/>
+        </w:rPr>
+        <w:t xml:space="preserve"> extensions targets will automatically detect it and running </w:t>
+      </w:r>
+      <w:r>
+        <w:rPr>
+          <w:b/>
+          <w:bCs/>
+          <w:sz w:val="32"/>
+          <w:szCs w:val="32"/>
+        </w:rPr>
+        <w:t>flutter run</w:t>
+      </w:r>
+      <w:r>
+        <w:rPr>
+          <w:sz w:val="32"/>
+          <w:szCs w:val="32"/>
+        </w:rPr>
+        <w:t xml:space="preserve"> will deploy to it seamlessly</w:t>
+      </w:r>
+    </w:p>
+    <w:p>
+      <w:pPr>
+        <w:jc w:val="both"/>
+        <w:rPr>
+          <w:b/>
+          <w:bCs/>
+          <w:color w:val="60CAF3" w:themeColor="accent4" w:themeTint="99"/>
+          <w:sz w:val="32"/>
+          <w:szCs w:val="32"/>
+        </w:rPr>
+      </w:pPr>
+      <w:r>
+        <w:rPr>
+          <w:b/>
+          <w:bCs/>
+          <w:color w:val="60CAF3" w:themeColor="accent4" w:themeTint="99"/>
+          <w:sz w:val="32"/>
+          <w:szCs w:val="32"/>
+        </w:rPr>
+        <w:t>emulator -avd Pixel_7_Pro</w:t>
+      </w:r>
+    </w:p>
+    <w:p>
+      <w:pPr>
+        <w:jc w:val="both"/>
+        <w:rPr>
+          <w:sz w:val="32"/>
+          <w:szCs w:val="32"/>
+        </w:rPr>
+      </w:pPr>
+    </w:p>
+    <w:p>
+      <w:pPr>
+        <w:jc w:val="both"/>
+        <w:rPr>
+          <w:sz w:val="32"/>
+          <w:szCs w:val="32"/>
+        </w:rPr>
+      </w:pPr>
+      <w:r>
+        <w:rPr>
+          <w:sz w:val="32"/>
+          <w:szCs w:val="32"/>
+        </w:rPr>
+        <w:t>Removing Devices using CLI:</w:t>
+      </w:r>
+    </w:p>
+    <w:p>
+      <w:pPr>
+        <w:jc w:val="both"/>
+        <w:rPr>
+          <w:sz w:val="32"/>
+          <w:szCs w:val="32"/>
+        </w:rPr>
+      </w:pPr>
+      <w:r>
+        <w:rPr>
+          <w:sz w:val="32"/>
+          <w:szCs w:val="32"/>
+        </w:rPr>
+        <w:lastRenderedPageBreak/>
+        <w:t xml:space="preserve"># </w:t>
+      </w:r>
+      <w:r>
+        <w:rPr>
+          <w:sz w:val="32"/>
+          <w:szCs w:val="32"/>
+        </w:rPr>
+        <w:t>List our current emulators to get the exact device name</w:t>
+      </w:r>
+      <w:r>
+        <w:rPr>
+          <w:sz w:val="32"/>
+          <w:szCs w:val="32"/>
+        </w:rPr>
+        <w:t xml:space="preserve"> using flutter emulators or:</w:t>
+      </w:r>
+    </w:p>
+    <w:p>
+      <w:pPr>
+        <w:jc w:val="both"/>
+        <w:rPr>
+          <w:rFonts w:ascii="Times New Roman" w:eastAsia="Times New Roman" w:hAnsi="Times New Roman" w:cs="Times New Roman"/>
+          <w:b/>
+          <w:bCs/>
+          <w:kern w:val="0"/>
+          <w14:ligatures w14:val="none"/>
+        </w:rPr>
+      </w:pPr>
+      <w:r>
+        <w:rPr>
+          <w:b/>
+          <w:bCs/>
+          <w:color w:val="60CAF3" w:themeColor="accent4" w:themeTint="99"/>
+          <w:sz w:val="32"/>
+          <w:szCs w:val="32"/>
+        </w:rPr>
+        <w:t>avdmanager list avd</w:t>
+      </w:r>
+    </w:p>
+    <w:p>
+      <w:pPr>
+        <w:jc w:val="both"/>
+        <w:rPr>
+          <w:sz w:val="32"/>
+          <w:szCs w:val="32"/>
+        </w:rPr>
+      </w:pPr>
+      <w:r>
+        <w:rPr>
+          <w:rFonts w:ascii="Times New Roman" w:eastAsia="Times New Roman" w:hAnsi="Times New Roman" w:cs="Times New Roman"/>
+          <w:kern w:val="0"/>
+          <w14:ligatures w14:val="none"/>
+        </w:rPr>
+        <w:t xml:space="preserve"># </w:t>
+      </w:r>
+      <w:r>
+        <w:rPr>
+          <w:sz w:val="32"/>
+          <w:szCs w:val="32"/>
+        </w:rPr>
+        <w:t xml:space="preserve">Delete the device using </w:t>
+      </w:r>
+      <w:r>
+        <w:rPr>
+          <w:b/>
+          <w:bCs/>
+          <w:sz w:val="32"/>
+          <w:szCs w:val="32"/>
+        </w:rPr>
+        <w:t>avdmanager</w:t>
+      </w:r>
+      <w:r>
+        <w:rPr>
+          <w:b/>
+          <w:bCs/>
+          <w:sz w:val="32"/>
+          <w:szCs w:val="32"/>
+        </w:rPr>
+        <w:t xml:space="preserve"> </w:t>
+      </w:r>
+      <w:r>
+        <w:rPr>
+          <w:sz w:val="32"/>
+          <w:szCs w:val="32"/>
+        </w:rPr>
+        <w:t>(replace Pixel_8_Api34 with emulator’s exact name)</w:t>
+      </w:r>
+      <w:r>
+        <w:rPr>
+          <w:sz w:val="32"/>
+          <w:szCs w:val="32"/>
+        </w:rPr>
+        <w:t>:</w:t>
+      </w:r>
+    </w:p>
+    <w:p>
+      <w:pPr>
+        <w:jc w:val="both"/>
+        <w:rPr>
+          <w:b/>
+          <w:bCs/>
+          <w:color w:val="60CAF3" w:themeColor="accent4" w:themeTint="99"/>
+          <w:sz w:val="32"/>
+          <w:szCs w:val="32"/>
+        </w:rPr>
+      </w:pPr>
+      <w:r>
+        <w:rPr>
+          <w:b/>
+          <w:bCs/>
+          <w:color w:val="60CAF3" w:themeColor="accent4" w:themeTint="99"/>
+          <w:sz w:val="32"/>
+          <w:szCs w:val="32"/>
+        </w:rPr>
+        <w:t>avdmanager delete avd -n Pixel_8_Api34</w:t>
+      </w:r>
+    </w:p>
+    <w:p>
+      <w:pPr>
+        <w:jc w:val="both"/>
+        <w:rPr>
+          <w:sz w:val="32"/>
+          <w:szCs w:val="32"/>
+        </w:rPr>
+      </w:pPr>
+      <w:r>
+        <w:rPr>
+          <w:sz w:val="32"/>
+          <w:szCs w:val="32"/>
+        </w:rPr>
+        <w:t xml:space="preserve"># Delete System Image, list </w:t>
+      </w:r>
+      <w:r>
+        <w:rPr>
+          <w:sz w:val="32"/>
+          <w:szCs w:val="32"/>
+        </w:rPr>
+        <w:t>all installed SDK packages to find the exact image string:</w:t>
+      </w:r>
+    </w:p>
+    <w:p>
+      <w:pPr>
+        <w:jc w:val="both"/>
+        <w:rPr>
+          <w:b/>
+          <w:bCs/>
+          <w:color w:val="60CAF3" w:themeColor="accent4" w:themeTint="99"/>
+          <w:sz w:val="32"/>
+          <w:szCs w:val="32"/>
+        </w:rPr>
+      </w:pPr>
+      <w:r>
+        <w:rPr>
+          <w:b/>
+          <w:bCs/>
+          <w:color w:val="60CAF3" w:themeColor="accent4" w:themeTint="99"/>
+          <w:sz w:val="32"/>
+          <w:szCs w:val="32"/>
+        </w:rPr>
+        <w:t>sdkmanager --list</w:t>
+      </w:r>
+    </w:p>
+    <w:p>
+      <w:pPr>
+        <w:jc w:val="both"/>
+        <w:rPr>
+          <w:sz w:val="32"/>
+          <w:szCs w:val="32"/>
+        </w:rPr>
+      </w:pPr>
+      <w:r>
+        <w:rPr>
+          <w:sz w:val="32"/>
+          <w:szCs w:val="32"/>
+        </w:rPr>
+        <w:t xml:space="preserve"># </w:t>
+      </w:r>
+      <w:r>
+        <w:rPr>
+          <w:sz w:val="32"/>
+          <w:szCs w:val="32"/>
+        </w:rPr>
+        <w:t>Uninstall the system image using the</w:t>
+      </w:r>
+      <w:r>
+        <w:rPr>
+          <w:b/>
+          <w:bCs/>
+          <w:sz w:val="32"/>
+          <w:szCs w:val="32"/>
+        </w:rPr>
+        <w:t xml:space="preserve"> --uninstall</w:t>
+      </w:r>
+      <w:r>
+        <w:rPr>
+          <w:sz w:val="32"/>
+          <w:szCs w:val="32"/>
+        </w:rPr>
+        <w:t xml:space="preserve"> flag:</w:t>
+      </w:r>
+    </w:p>
+    <w:p>
+      <w:pPr>
+        <w:jc w:val="both"/>
+        <w:rPr>
+          <w:b/>
+          <w:bCs/>
+          <w:color w:val="60CAF3" w:themeColor="accent4" w:themeTint="99"/>
+          <w:sz w:val="32"/>
+          <w:szCs w:val="32"/>
+        </w:rPr>
+      </w:pPr>
+      <w:r>
+        <w:rPr>
+          <w:b/>
+          <w:bCs/>
+          <w:color w:val="60CAF3" w:themeColor="accent4" w:themeTint="99"/>
+          <w:sz w:val="32"/>
+          <w:szCs w:val="32"/>
+        </w:rPr>
+        <w:t>sdkmanager --uninstall "system-images;android-34;google_apis;x86_64"</w:t>
+      </w:r>
+    </w:p>
+    <w:p>
+      <w:pPr>
+        <w:jc w:val="both"/>
+        <w:rPr>
+          <w:sz w:val="32"/>
+          <w:szCs w:val="32"/>
+        </w:rPr>
+      </w:pPr>
+      <w:r>
+        <w:rPr>
+          <w:b/>
+          <w:bCs/>
+          <w:sz w:val="32"/>
+          <w:szCs w:val="32"/>
+        </w:rPr>
+        <w:t xml:space="preserve">NOTE: </w:t>
+      </w:r>
+      <w:r>
+        <w:rPr>
+          <w:sz w:val="32"/>
+          <w:szCs w:val="32"/>
+        </w:rPr>
+        <w:t>Or we can manually manage it in the Android Studio IDE</w:t>
+      </w:r>
     </w:p>
     <w:p>
       <w:pPr>
@@ -4831,7 +4930,6 @@
           <w:sz w:val="32"/>
           <w:szCs w:val="32"/>
         </w:rPr>
-        <w:lastRenderedPageBreak/>
         <w:t>Antigravity Extension Market Fix:</w:t>
       </w:r>
     </w:p>
@@ -4940,21 +5038,8 @@
           <w:sz w:val="32"/>
           <w:szCs w:val="32"/>
         </w:rPr>
-        <w:t xml:space="preserve"> </w:t>
-      </w:r>
-      <w:proofErr w:type="spellStart"/>
-      <w:proofErr w:type="gramStart"/>
-      <w:r>
-        <w:rPr>
-          <w:b/>
-          <w:bCs/>
-          <w:sz w:val="32"/>
-          <w:szCs w:val="32"/>
-        </w:rPr>
-        <w:t>product.json</w:t>
-      </w:r>
-      <w:proofErr w:type="spellEnd"/>
-      <w:proofErr w:type="gramEnd"/>
+        <w:t xml:space="preserve"> product.json</w:t>
+      </w:r>
       <w:r>
         <w:rPr>
           <w:sz w:val="32"/>
@@ -4983,7 +5068,6 @@
         </w:rPr>
         <w:t xml:space="preserve">Search for </w:t>
       </w:r>
-      <w:proofErr w:type="spellStart"/>
       <w:r>
         <w:rPr>
           <w:b/>
@@ -4993,7 +5077,6 @@
         </w:rPr>
         <w:t>extensionsGallery</w:t>
       </w:r>
-      <w:proofErr w:type="spellEnd"/>
       <w:r>
         <w:rPr>
           <w:sz w:val="32"/>
@@ -5021,10 +5104,13 @@
           <w:sz w:val="32"/>
           <w:szCs w:val="32"/>
         </w:rPr>
-        <w:t>"</w:t>
-      </w:r>
-      <w:proofErr w:type="spellStart"/>
-      <w:r>
+        <w:lastRenderedPageBreak/>
+        <w:t>"extensionsGallery": {</w:t>
+      </w:r>
+    </w:p>
+    <w:p>
+      <w:pPr>
+        <w:jc w:val="both"/>
         <w:rPr>
           <w:b/>
           <w:bCs/>
@@ -5032,9 +5118,7 @@
           <w:sz w:val="32"/>
           <w:szCs w:val="32"/>
         </w:rPr>
-        <w:t>extensionsGallery</w:t>
-      </w:r>
-      <w:proofErr w:type="spellEnd"/>
+      </w:pPr>
       <w:r>
         <w:rPr>
           <w:b/>
@@ -5043,7 +5127,7 @@
           <w:sz w:val="32"/>
           <w:szCs w:val="32"/>
         </w:rPr>
-        <w:t>": {</w:t>
+        <w:t xml:space="preserve">  "serviceUrl": "https://marketplace.visualstudio.com/_apis/public/gallery",</w:t>
       </w:r>
     </w:p>
     <w:p>
@@ -5065,95 +5149,7 @@
           <w:sz w:val="32"/>
           <w:szCs w:val="32"/>
         </w:rPr>
-        <w:t xml:space="preserve">  "</w:t>
-      </w:r>
-      <w:proofErr w:type="spellStart"/>
-      <w:r>
-        <w:rPr>
-          <w:b/>
-          <w:bCs/>
-          <w:color w:val="D86DCB" w:themeColor="accent5" w:themeTint="99"/>
-          <w:sz w:val="32"/>
-          <w:szCs w:val="32"/>
-        </w:rPr>
-        <w:t>serviceUrl</w:t>
-      </w:r>
-      <w:proofErr w:type="spellEnd"/>
-      <w:r>
-        <w:rPr>
-          <w:b/>
-          <w:bCs/>
-          <w:color w:val="D86DCB" w:themeColor="accent5" w:themeTint="99"/>
-          <w:sz w:val="32"/>
-          <w:szCs w:val="32"/>
-        </w:rPr>
-        <w:t>": "https://marketplace.visualstudio.com/_</w:t>
-      </w:r>
-      <w:proofErr w:type="spellStart"/>
-      <w:r>
-        <w:rPr>
-          <w:b/>
-          <w:bCs/>
-          <w:color w:val="D86DCB" w:themeColor="accent5" w:themeTint="99"/>
-          <w:sz w:val="32"/>
-          <w:szCs w:val="32"/>
-        </w:rPr>
-        <w:t>apis</w:t>
-      </w:r>
-      <w:proofErr w:type="spellEnd"/>
-      <w:r>
-        <w:rPr>
-          <w:b/>
-          <w:bCs/>
-          <w:color w:val="D86DCB" w:themeColor="accent5" w:themeTint="99"/>
-          <w:sz w:val="32"/>
-          <w:szCs w:val="32"/>
-        </w:rPr>
-        <w:t>/public/gallery",</w:t>
-      </w:r>
-    </w:p>
-    <w:p>
-      <w:pPr>
-        <w:jc w:val="both"/>
-        <w:rPr>
-          <w:b/>
-          <w:bCs/>
-          <w:color w:val="D86DCB" w:themeColor="accent5" w:themeTint="99"/>
-          <w:sz w:val="32"/>
-          <w:szCs w:val="32"/>
-        </w:rPr>
-      </w:pPr>
-      <w:r>
-        <w:rPr>
-          <w:b/>
-          <w:bCs/>
-          <w:color w:val="D86DCB" w:themeColor="accent5" w:themeTint="99"/>
-          <w:sz w:val="32"/>
-          <w:szCs w:val="32"/>
-        </w:rPr>
-        <w:t xml:space="preserve">  "</w:t>
-      </w:r>
-      <w:proofErr w:type="spellStart"/>
-      <w:r>
-        <w:rPr>
-          <w:b/>
-          <w:bCs/>
-          <w:color w:val="D86DCB" w:themeColor="accent5" w:themeTint="99"/>
-          <w:sz w:val="32"/>
-          <w:szCs w:val="32"/>
-        </w:rPr>
-        <w:t>itemUrl</w:t>
-      </w:r>
-      <w:proofErr w:type="spellEnd"/>
-      <w:r>
-        <w:rPr>
-          <w:b/>
-          <w:bCs/>
-          <w:color w:val="D86DCB" w:themeColor="accent5" w:themeTint="99"/>
-          <w:sz w:val="32"/>
-          <w:szCs w:val="32"/>
-        </w:rPr>
-        <w:t>": "https://marketplace.visualstudio.com/items"</w:t>
+        <w:t xml:space="preserve">  "itemUrl": "https://marketplace.visualstudio.com/items"</w:t>
       </w:r>
     </w:p>
     <w:p>
@@ -7119,6 +7115,17 @@
     <w:uiPriority w:val="99"/>
     <w:rsid w:val="00571185"/>
   </w:style>
+  <w:style w:type="paragraph" w:styleId="NormalWeb">
+    <w:name w:val="Normal (Web)"/>
+    <w:basedOn w:val="Normal"/>
+    <w:uiPriority w:val="99"/>
+    <w:semiHidden/>
+    <w:unhideWhenUsed/>
+    <w:rsid w:val="00DE607E"/>
+    <w:rPr>
+      <w:rFonts w:ascii="Times New Roman" w:hAnsi="Times New Roman" w:cs="Times New Roman"/>
+    </w:rPr>
+  </w:style>
 </w:styles>
 </file>
 

</xml_diff>

<commit_message>
update (logger): updated logger notes
</commit_message>
<xml_diff>
--- a/flutter_documents/f8_packages_tools_and_CLI/f60_vscode_for_flutter.docx
+++ b/flutter_documents/f8_packages_tools_and_CLI/f60_vscode_for_flutter.docx
@@ -68,8 +68,18 @@
           <w:sz w:val="32"/>
           <w:szCs w:val="32"/>
         </w:rPr>
-        <w:t>………..</w:t>
-      </w:r>
+        <w:t>……</w:t>
+      </w:r>
+      <w:proofErr w:type="gramStart"/>
+      <w:r>
+        <w:rPr>
+          <w:rFonts w:ascii="Carlito" w:hAnsi="Carlito" w:cs="Carlito"/>
+          <w:sz w:val="32"/>
+          <w:szCs w:val="32"/>
+        </w:rPr>
+        <w:t>…..</w:t>
+      </w:r>
+      <w:proofErr w:type="gramEnd"/>
       <w:r>
         <w:rPr>
           <w:rFonts w:ascii="Carlito" w:hAnsi="Carlito" w:cs="Carlito"/>
@@ -109,7 +119,25 @@
           <w:sz w:val="32"/>
           <w:szCs w:val="32"/>
         </w:rPr>
-        <w:t xml:space="preserve"> CLI in VS code………………………………..…………</w:t>
+        <w:t xml:space="preserve"> CLI in VS code……………………………</w:t>
+      </w:r>
+      <w:proofErr w:type="gramStart"/>
+      <w:r>
+        <w:rPr>
+          <w:rFonts w:ascii="Carlito" w:hAnsi="Carlito" w:cs="Carlito"/>
+          <w:sz w:val="32"/>
+          <w:szCs w:val="32"/>
+        </w:rPr>
+        <w:t>…..</w:t>
+      </w:r>
+      <w:proofErr w:type="gramEnd"/>
+      <w:r>
+        <w:rPr>
+          <w:rFonts w:ascii="Carlito" w:hAnsi="Carlito" w:cs="Carlito"/>
+          <w:sz w:val="32"/>
+          <w:szCs w:val="32"/>
+        </w:rPr>
+        <w:t>…………</w:t>
       </w:r>
       <w:r>
         <w:rPr>
@@ -187,7 +215,25 @@
           <w:sz w:val="32"/>
           <w:szCs w:val="32"/>
         </w:rPr>
-        <w:t>Run Time Configurations in VS Code (flavors &amp; dart define)….…6</w:t>
+        <w:t xml:space="preserve">Run Time Configurations in VS Code (flavors &amp; dart </w:t>
+      </w:r>
+      <w:proofErr w:type="gramStart"/>
+      <w:r>
+        <w:rPr>
+          <w:rFonts w:ascii="Carlito" w:hAnsi="Carlito" w:cs="Carlito"/>
+          <w:sz w:val="32"/>
+          <w:szCs w:val="32"/>
+        </w:rPr>
+        <w:t>define)…</w:t>
+      </w:r>
+      <w:proofErr w:type="gramEnd"/>
+      <w:r>
+        <w:rPr>
+          <w:rFonts w:ascii="Carlito" w:hAnsi="Carlito" w:cs="Carlito"/>
+          <w:sz w:val="32"/>
+          <w:szCs w:val="32"/>
+        </w:rPr>
+        <w:t>.…6</w:t>
       </w:r>
     </w:p>
     <w:p>
@@ -622,6 +668,7 @@
           <w:szCs w:val="32"/>
         </w:rPr>
       </w:pPr>
+      <w:proofErr w:type="spellStart"/>
       <w:r>
         <w:rPr>
           <w:rFonts w:ascii="Carlito" w:hAnsi="Carlito" w:cs="Carlito"/>
@@ -632,6 +679,7 @@
         </w:rPr>
         <w:t>GitLens</w:t>
       </w:r>
+      <w:proofErr w:type="spellEnd"/>
       <w:r>
         <w:rPr>
           <w:rFonts w:ascii="Carlito" w:hAnsi="Carlito" w:cs="Carlito"/>
@@ -727,15 +775,17 @@
           <w:sz w:val="32"/>
           <w:szCs w:val="32"/>
         </w:rPr>
-        <w:t xml:space="preserve"> IntelliJ IDEA Class Dark</w:t>
-      </w:r>
-      <w:r>
-        <w:rPr>
-          <w:rFonts w:ascii="Carlito" w:hAnsi="Carlito" w:cs="Carlito"/>
-          <w:sz w:val="32"/>
-          <w:szCs w:val="32"/>
-        </w:rPr>
-        <w:t xml:space="preserve"> or install IntelliJ IDEA New UI extension and select dark mode (RECOMMENDED)</w:t>
+        <w:t xml:space="preserve"> </w:t>
+      </w:r>
+      <w:r>
+        <w:rPr>
+          <w:rFonts w:ascii="Carlito" w:hAnsi="Carlito" w:cs="Carlito"/>
+          <w:b/>
+          <w:bCs/>
+          <w:sz w:val="32"/>
+          <w:szCs w:val="32"/>
+        </w:rPr>
+        <w:t>Dark+</w:t>
       </w:r>
     </w:p>
     <w:p>
@@ -761,6 +811,14 @@
           <w:sz w:val="32"/>
           <w:szCs w:val="32"/>
         </w:rPr>
+        <w:t xml:space="preserve">(IMPORTANT) </w:t>
+      </w:r>
+      <w:r>
+        <w:rPr>
+          <w:rFonts w:ascii="Carlito" w:hAnsi="Carlito" w:cs="Carlito"/>
+          <w:sz w:val="32"/>
+          <w:szCs w:val="32"/>
+        </w:rPr>
         <w:t xml:space="preserve">Then prese </w:t>
       </w:r>
       <w:r>
@@ -903,31 +961,83 @@
           <w:sz w:val="32"/>
           <w:szCs w:val="32"/>
         </w:rPr>
-        <w:t xml:space="preserve">    "workbench.colorCustomizations": {</w:t>
-      </w:r>
-    </w:p>
-    <w:p>
-      <w:pPr>
-        <w:jc w:val="both"/>
-        <w:rPr>
-          <w:rFonts w:ascii="Carlito" w:hAnsi="Carlito" w:cs="Carlito"/>
-          <w:b/>
-          <w:bCs/>
-          <w:color w:val="D86DCB" w:themeColor="accent5" w:themeTint="99"/>
-          <w:sz w:val="32"/>
-          <w:szCs w:val="32"/>
-        </w:rPr>
-      </w:pPr>
-      <w:r>
-        <w:rPr>
-          <w:rFonts w:ascii="Carlito" w:hAnsi="Carlito" w:cs="Carlito"/>
-          <w:b/>
-          <w:bCs/>
-          <w:color w:val="D86DCB" w:themeColor="accent5" w:themeTint="99"/>
-          <w:sz w:val="32"/>
-          <w:szCs w:val="32"/>
-        </w:rPr>
-        <w:t xml:space="preserve">        "editor.background": "#1</w:t>
+        <w:t xml:space="preserve">    "</w:t>
+      </w:r>
+      <w:proofErr w:type="spellStart"/>
+      <w:proofErr w:type="gramStart"/>
+      <w:r>
+        <w:rPr>
+          <w:rFonts w:ascii="Carlito" w:hAnsi="Carlito" w:cs="Carlito"/>
+          <w:b/>
+          <w:bCs/>
+          <w:color w:val="D86DCB" w:themeColor="accent5" w:themeTint="99"/>
+          <w:sz w:val="32"/>
+          <w:szCs w:val="32"/>
+        </w:rPr>
+        <w:t>workbench.colorCustomizations</w:t>
+      </w:r>
+      <w:proofErr w:type="spellEnd"/>
+      <w:proofErr w:type="gramEnd"/>
+      <w:r>
+        <w:rPr>
+          <w:rFonts w:ascii="Carlito" w:hAnsi="Carlito" w:cs="Carlito"/>
+          <w:b/>
+          <w:bCs/>
+          <w:color w:val="D86DCB" w:themeColor="accent5" w:themeTint="99"/>
+          <w:sz w:val="32"/>
+          <w:szCs w:val="32"/>
+        </w:rPr>
+        <w:t>": {</w:t>
+      </w:r>
+    </w:p>
+    <w:p>
+      <w:pPr>
+        <w:jc w:val="both"/>
+        <w:rPr>
+          <w:rFonts w:ascii="Carlito" w:hAnsi="Carlito" w:cs="Carlito"/>
+          <w:b/>
+          <w:bCs/>
+          <w:color w:val="D86DCB" w:themeColor="accent5" w:themeTint="99"/>
+          <w:sz w:val="32"/>
+          <w:szCs w:val="32"/>
+        </w:rPr>
+      </w:pPr>
+      <w:r>
+        <w:rPr>
+          <w:rFonts w:ascii="Carlito" w:hAnsi="Carlito" w:cs="Carlito"/>
+          <w:b/>
+          <w:bCs/>
+          <w:color w:val="D86DCB" w:themeColor="accent5" w:themeTint="99"/>
+          <w:sz w:val="32"/>
+          <w:szCs w:val="32"/>
+        </w:rPr>
+        <w:t xml:space="preserve">        "</w:t>
+      </w:r>
+      <w:proofErr w:type="spellStart"/>
+      <w:proofErr w:type="gramStart"/>
+      <w:r>
+        <w:rPr>
+          <w:rFonts w:ascii="Carlito" w:hAnsi="Carlito" w:cs="Carlito"/>
+          <w:b/>
+          <w:bCs/>
+          <w:color w:val="D86DCB" w:themeColor="accent5" w:themeTint="99"/>
+          <w:sz w:val="32"/>
+          <w:szCs w:val="32"/>
+        </w:rPr>
+        <w:t>editor.background</w:t>
+      </w:r>
+      <w:proofErr w:type="spellEnd"/>
+      <w:proofErr w:type="gramEnd"/>
+      <w:r>
+        <w:rPr>
+          <w:rFonts w:ascii="Carlito" w:hAnsi="Carlito" w:cs="Carlito"/>
+          <w:b/>
+          <w:bCs/>
+          <w:color w:val="D86DCB" w:themeColor="accent5" w:themeTint="99"/>
+          <w:sz w:val="32"/>
+          <w:szCs w:val="32"/>
+        </w:rPr>
+        <w:t>": "#1</w:t>
       </w:r>
       <w:r>
         <w:rPr>
@@ -1067,7 +1177,6 @@
           <w:sz w:val="32"/>
           <w:szCs w:val="32"/>
         </w:rPr>
-        <w:lastRenderedPageBreak/>
         <w:t># S</w:t>
       </w:r>
       <w:r>
@@ -1145,6 +1254,7 @@
           <w:sz w:val="32"/>
           <w:szCs w:val="32"/>
         </w:rPr>
+        <w:lastRenderedPageBreak/>
         <w:t>View</w:t>
       </w:r>
       <w:r>
@@ -1374,15 +1484,29 @@
         </w:rPr>
         <w:t xml:space="preserve"> project which will be our app name (like </w:t>
       </w:r>
-      <w:r>
-        <w:rPr>
-          <w:rFonts w:ascii="Carlito" w:hAnsi="Carlito" w:cs="Carlito"/>
-          <w:b/>
-          <w:bCs/>
-          <w:sz w:val="32"/>
-          <w:szCs w:val="32"/>
-        </w:rPr>
-        <w:t>android:label=</w:t>
+      <w:proofErr w:type="spellStart"/>
+      <w:proofErr w:type="gramStart"/>
+      <w:r>
+        <w:rPr>
+          <w:rFonts w:ascii="Carlito" w:hAnsi="Carlito" w:cs="Carlito"/>
+          <w:b/>
+          <w:bCs/>
+          <w:sz w:val="32"/>
+          <w:szCs w:val="32"/>
+        </w:rPr>
+        <w:t>android:label</w:t>
+      </w:r>
+      <w:proofErr w:type="spellEnd"/>
+      <w:proofErr w:type="gramEnd"/>
+      <w:r>
+        <w:rPr>
+          <w:rFonts w:ascii="Carlito" w:hAnsi="Carlito" w:cs="Carlito"/>
+          <w:b/>
+          <w:bCs/>
+          <w:sz w:val="32"/>
+          <w:szCs w:val="32"/>
+        </w:rPr>
+        <w:t>=</w:t>
       </w:r>
       <w:r>
         <w:rPr>
@@ -1410,6 +1534,7 @@
         </w:rPr>
         <w:t xml:space="preserve"> and </w:t>
       </w:r>
+      <w:proofErr w:type="spellStart"/>
       <w:r>
         <w:rPr>
           <w:rFonts w:ascii="Carlito" w:hAnsi="Carlito" w:cs="Carlito"/>
@@ -1420,6 +1545,7 @@
         </w:rPr>
         <w:t>pubsec.yaml</w:t>
       </w:r>
+      <w:proofErr w:type="spellEnd"/>
       <w:r>
         <w:rPr>
           <w:rFonts w:ascii="Carlito" w:hAnsi="Carlito" w:cs="Carlito"/>
@@ -1460,6 +1586,7 @@
         </w:rPr>
         <w:t xml:space="preserve"> </w:t>
       </w:r>
+      <w:proofErr w:type="spellStart"/>
       <w:r>
         <w:rPr>
           <w:rFonts w:ascii="Carlito" w:hAnsi="Carlito" w:cs="Carlito"/>
@@ -1470,6 +1597,7 @@
         </w:rPr>
         <w:t>com.example.testing_flutter</w:t>
       </w:r>
+      <w:proofErr w:type="spellEnd"/>
       <w:r>
         <w:rPr>
           <w:rFonts w:ascii="Carlito" w:hAnsi="Carlito" w:cs="Carlito"/>
@@ -1810,39 +1938,39 @@
           <w:sz w:val="32"/>
           <w:szCs w:val="32"/>
         </w:rPr>
+        <w:t>Break</w:t>
+      </w:r>
+    </w:p>
+    <w:p>
+      <w:pPr>
+        <w:jc w:val="both"/>
+        <w:rPr>
+          <w:rFonts w:ascii="Carlito" w:hAnsi="Carlito" w:cs="Carlito"/>
+          <w:sz w:val="32"/>
+          <w:szCs w:val="32"/>
+        </w:rPr>
+      </w:pPr>
+    </w:p>
+    <w:p>
+      <w:pPr>
+        <w:jc w:val="both"/>
+        <w:rPr>
+          <w:rFonts w:ascii="Carlito" w:hAnsi="Carlito" w:cs="Carlito"/>
+          <w:b/>
+          <w:bCs/>
+          <w:sz w:val="32"/>
+          <w:szCs w:val="32"/>
+        </w:rPr>
+      </w:pPr>
+      <w:r>
+        <w:rPr>
+          <w:rFonts w:ascii="Carlito" w:hAnsi="Carlito" w:cs="Carlito"/>
+          <w:b/>
+          <w:bCs/>
+          <w:sz w:val="32"/>
+          <w:szCs w:val="32"/>
+        </w:rPr>
         <w:lastRenderedPageBreak/>
-        <w:t>Break</w:t>
-      </w:r>
-    </w:p>
-    <w:p>
-      <w:pPr>
-        <w:jc w:val="both"/>
-        <w:rPr>
-          <w:rFonts w:ascii="Carlito" w:hAnsi="Carlito" w:cs="Carlito"/>
-          <w:sz w:val="32"/>
-          <w:szCs w:val="32"/>
-        </w:rPr>
-      </w:pPr>
-    </w:p>
-    <w:p>
-      <w:pPr>
-        <w:jc w:val="both"/>
-        <w:rPr>
-          <w:rFonts w:ascii="Carlito" w:hAnsi="Carlito" w:cs="Carlito"/>
-          <w:b/>
-          <w:bCs/>
-          <w:sz w:val="32"/>
-          <w:szCs w:val="32"/>
-        </w:rPr>
-      </w:pPr>
-      <w:r>
-        <w:rPr>
-          <w:rFonts w:ascii="Carlito" w:hAnsi="Carlito" w:cs="Carlito"/>
-          <w:b/>
-          <w:bCs/>
-          <w:sz w:val="32"/>
-          <w:szCs w:val="32"/>
-        </w:rPr>
         <w:t>Project Level Settings in VS Code:</w:t>
       </w:r>
     </w:p>
@@ -1861,18 +1989,40 @@
           <w:sz w:val="32"/>
           <w:szCs w:val="32"/>
         </w:rPr>
-        <w:t xml:space="preserve"># If we add a </w:t>
-      </w:r>
-      <w:r>
-        <w:rPr>
-          <w:rFonts w:ascii="Carlito" w:hAnsi="Carlito" w:cs="Carlito"/>
-          <w:b/>
-          <w:bCs/>
-          <w:sz w:val="32"/>
-          <w:szCs w:val="32"/>
-        </w:rPr>
-        <w:t>.vscode</w:t>
-      </w:r>
+        <w:t xml:space="preserve"># If we add </w:t>
+      </w:r>
+      <w:proofErr w:type="gramStart"/>
+      <w:r>
+        <w:rPr>
+          <w:rFonts w:ascii="Carlito" w:hAnsi="Carlito" w:cs="Carlito"/>
+          <w:sz w:val="32"/>
+          <w:szCs w:val="32"/>
+        </w:rPr>
+        <w:t xml:space="preserve">a </w:t>
+      </w:r>
+      <w:r>
+        <w:rPr>
+          <w:rFonts w:ascii="Carlito" w:hAnsi="Carlito" w:cs="Carlito"/>
+          <w:b/>
+          <w:bCs/>
+          <w:sz w:val="32"/>
+          <w:szCs w:val="32"/>
+        </w:rPr>
+        <w:t>.</w:t>
+      </w:r>
+      <w:proofErr w:type="spellStart"/>
+      <w:r>
+        <w:rPr>
+          <w:rFonts w:ascii="Carlito" w:hAnsi="Carlito" w:cs="Carlito"/>
+          <w:b/>
+          <w:bCs/>
+          <w:sz w:val="32"/>
+          <w:szCs w:val="32"/>
+        </w:rPr>
+        <w:t>vscode</w:t>
+      </w:r>
+      <w:proofErr w:type="spellEnd"/>
+      <w:proofErr w:type="gramEnd"/>
       <w:r>
         <w:rPr>
           <w:rFonts w:ascii="Carlito" w:hAnsi="Carlito" w:cs="Carlito"/>
@@ -1881,16 +2031,62 @@
         </w:rPr>
         <w:t xml:space="preserve"> directory inside our (like </w:t>
       </w:r>
-      <w:r>
-        <w:rPr>
-          <w:rFonts w:ascii="Carlito" w:hAnsi="Carlito" w:cs="Carlito"/>
-          <w:b/>
-          <w:bCs/>
-          <w:sz w:val="32"/>
-          <w:szCs w:val="32"/>
-        </w:rPr>
-        <w:t>project_root/.vscode/settings.json</w:t>
-      </w:r>
+      <w:proofErr w:type="spellStart"/>
+      <w:r>
+        <w:rPr>
+          <w:rFonts w:ascii="Carlito" w:hAnsi="Carlito" w:cs="Carlito"/>
+          <w:b/>
+          <w:bCs/>
+          <w:sz w:val="32"/>
+          <w:szCs w:val="32"/>
+        </w:rPr>
+        <w:t>project_root</w:t>
+      </w:r>
+      <w:proofErr w:type="spellEnd"/>
+      <w:r>
+        <w:rPr>
+          <w:rFonts w:ascii="Carlito" w:hAnsi="Carlito" w:cs="Carlito"/>
+          <w:b/>
+          <w:bCs/>
+          <w:sz w:val="32"/>
+          <w:szCs w:val="32"/>
+        </w:rPr>
+        <w:t>/.</w:t>
+      </w:r>
+      <w:proofErr w:type="spellStart"/>
+      <w:r>
+        <w:rPr>
+          <w:rFonts w:ascii="Carlito" w:hAnsi="Carlito" w:cs="Carlito"/>
+          <w:b/>
+          <w:bCs/>
+          <w:sz w:val="32"/>
+          <w:szCs w:val="32"/>
+        </w:rPr>
+        <w:t>vscode</w:t>
+      </w:r>
+      <w:proofErr w:type="spellEnd"/>
+      <w:r>
+        <w:rPr>
+          <w:rFonts w:ascii="Carlito" w:hAnsi="Carlito" w:cs="Carlito"/>
+          <w:b/>
+          <w:bCs/>
+          <w:sz w:val="32"/>
+          <w:szCs w:val="32"/>
+        </w:rPr>
+        <w:t>/</w:t>
+      </w:r>
+      <w:proofErr w:type="spellStart"/>
+      <w:r>
+        <w:rPr>
+          <w:rFonts w:ascii="Carlito" w:hAnsi="Carlito" w:cs="Carlito"/>
+          <w:b/>
+          <w:bCs/>
+          <w:sz w:val="32"/>
+          <w:szCs w:val="32"/>
+        </w:rPr>
+        <w:t>settings.json</w:t>
+      </w:r>
+      <w:proofErr w:type="spellEnd"/>
       <w:r>
         <w:rPr>
           <w:rFonts w:ascii="Carlito" w:hAnsi="Carlito" w:cs="Carlito"/>
@@ -1899,6 +2095,7 @@
         </w:rPr>
         <w:t xml:space="preserve">) and it has </w:t>
       </w:r>
+      <w:proofErr w:type="spellStart"/>
       <w:r>
         <w:rPr>
           <w:rFonts w:ascii="Carlito" w:hAnsi="Carlito" w:cs="Carlito"/>
@@ -1909,6 +2106,7 @@
         </w:rPr>
         <w:t>settings.json</w:t>
       </w:r>
+      <w:proofErr w:type="spellEnd"/>
       <w:r>
         <w:rPr>
           <w:rFonts w:ascii="Carlito" w:hAnsi="Carlito" w:cs="Carlito"/>
@@ -1929,6 +2127,7 @@
           <w:szCs w:val="28"/>
         </w:rPr>
       </w:pPr>
+      <w:proofErr w:type="spellStart"/>
       <w:r>
         <w:rPr>
           <w:rFonts w:ascii="Carlito" w:hAnsi="Carlito" w:cs="Carlito"/>
@@ -1937,12 +2136,10 @@
           <w:sz w:val="28"/>
           <w:szCs w:val="28"/>
         </w:rPr>
-        <w:t>my_flutter_app/</w:t>
-      </w:r>
-    </w:p>
-    <w:p>
-      <w:pPr>
-        <w:jc w:val="both"/>
+        <w:t>my_flutter_app</w:t>
+      </w:r>
+      <w:proofErr w:type="spellEnd"/>
+      <w:r>
         <w:rPr>
           <w:rFonts w:ascii="Carlito" w:hAnsi="Carlito" w:cs="Carlito"/>
           <w:b/>
@@ -1950,31 +2147,31 @@
           <w:sz w:val="28"/>
           <w:szCs w:val="28"/>
         </w:rPr>
-      </w:pPr>
-      <w:r>
-        <w:rPr>
-          <w:rFonts w:ascii="Arial" w:hAnsi="Arial" w:cs="Arial"/>
+        <w:t>/</w:t>
+      </w:r>
+    </w:p>
+    <w:p>
+      <w:pPr>
+        <w:jc w:val="both"/>
+        <w:rPr>
+          <w:rFonts w:ascii="Carlito" w:hAnsi="Carlito" w:cs="Carlito"/>
           <w:b/>
           <w:bCs/>
           <w:sz w:val="28"/>
           <w:szCs w:val="28"/>
         </w:rPr>
-        <w:t>├</w:t>
-      </w:r>
-      <w:r>
-        <w:rPr>
-          <w:rFonts w:ascii="Carlito" w:hAnsi="Carlito" w:cs="Carlito"/>
+      </w:pPr>
+      <w:r>
+        <w:rPr>
+          <w:rFonts w:ascii="Arial" w:hAnsi="Arial" w:cs="Arial"/>
           <w:b/>
           <w:bCs/>
           <w:sz w:val="28"/>
           <w:szCs w:val="28"/>
         </w:rPr>
-        <w:t>── lib/</w:t>
-      </w:r>
-    </w:p>
-    <w:p>
-      <w:pPr>
-        <w:jc w:val="both"/>
+        <w:t>├</w:t>
+      </w:r>
+      <w:r>
         <w:rPr>
           <w:rFonts w:ascii="Carlito" w:hAnsi="Carlito" w:cs="Carlito"/>
           <w:b/>
@@ -1982,31 +2179,31 @@
           <w:sz w:val="28"/>
           <w:szCs w:val="28"/>
         </w:rPr>
-      </w:pPr>
-      <w:r>
-        <w:rPr>
-          <w:rFonts w:ascii="Arial" w:hAnsi="Arial" w:cs="Arial"/>
+        <w:t>── lib/</w:t>
+      </w:r>
+    </w:p>
+    <w:p>
+      <w:pPr>
+        <w:jc w:val="both"/>
+        <w:rPr>
+          <w:rFonts w:ascii="Carlito" w:hAnsi="Carlito" w:cs="Carlito"/>
           <w:b/>
           <w:bCs/>
           <w:sz w:val="28"/>
           <w:szCs w:val="28"/>
         </w:rPr>
-        <w:t>├</w:t>
-      </w:r>
-      <w:r>
-        <w:rPr>
-          <w:rFonts w:ascii="Carlito" w:hAnsi="Carlito" w:cs="Carlito"/>
+      </w:pPr>
+      <w:r>
+        <w:rPr>
+          <w:rFonts w:ascii="Arial" w:hAnsi="Arial" w:cs="Arial"/>
           <w:b/>
           <w:bCs/>
           <w:sz w:val="28"/>
           <w:szCs w:val="28"/>
         </w:rPr>
-        <w:t>── android/</w:t>
-      </w:r>
-    </w:p>
-    <w:p>
-      <w:pPr>
-        <w:jc w:val="both"/>
+        <w:t>├</w:t>
+      </w:r>
+      <w:r>
         <w:rPr>
           <w:rFonts w:ascii="Carlito" w:hAnsi="Carlito" w:cs="Carlito"/>
           <w:b/>
@@ -2014,31 +2211,31 @@
           <w:sz w:val="28"/>
           <w:szCs w:val="28"/>
         </w:rPr>
-      </w:pPr>
-      <w:r>
-        <w:rPr>
-          <w:rFonts w:ascii="Arial" w:hAnsi="Arial" w:cs="Arial"/>
+        <w:t>── android/</w:t>
+      </w:r>
+    </w:p>
+    <w:p>
+      <w:pPr>
+        <w:jc w:val="both"/>
+        <w:rPr>
+          <w:rFonts w:ascii="Carlito" w:hAnsi="Carlito" w:cs="Carlito"/>
           <w:b/>
           <w:bCs/>
           <w:sz w:val="28"/>
           <w:szCs w:val="28"/>
         </w:rPr>
-        <w:t>├</w:t>
-      </w:r>
-      <w:r>
-        <w:rPr>
-          <w:rFonts w:ascii="Carlito" w:hAnsi="Carlito" w:cs="Carlito"/>
+      </w:pPr>
+      <w:r>
+        <w:rPr>
+          <w:rFonts w:ascii="Arial" w:hAnsi="Arial" w:cs="Arial"/>
           <w:b/>
           <w:bCs/>
           <w:sz w:val="28"/>
           <w:szCs w:val="28"/>
         </w:rPr>
-        <w:t>── pubspec.yaml</w:t>
-      </w:r>
-    </w:p>
-    <w:p>
-      <w:pPr>
-        <w:jc w:val="both"/>
+        <w:t>├</w:t>
+      </w:r>
+      <w:r>
         <w:rPr>
           <w:rFonts w:ascii="Carlito" w:hAnsi="Carlito" w:cs="Carlito"/>
           <w:b/>
@@ -2046,7 +2243,10 @@
           <w:sz w:val="28"/>
           <w:szCs w:val="28"/>
         </w:rPr>
-      </w:pPr>
+        <w:t xml:space="preserve">── </w:t>
+      </w:r>
+      <w:proofErr w:type="spellStart"/>
+      <w:proofErr w:type="gramStart"/>
       <w:r>
         <w:rPr>
           <w:rFonts w:ascii="Carlito" w:hAnsi="Carlito" w:cs="Carlito"/>
@@ -2055,8 +2255,10 @@
           <w:sz w:val="28"/>
           <w:szCs w:val="28"/>
         </w:rPr>
-        <w:t>└── .vscode/</w:t>
-      </w:r>
+        <w:t>pubspec.yaml</w:t>
+      </w:r>
+      <w:proofErr w:type="spellEnd"/>
+      <w:proofErr w:type="gramEnd"/>
     </w:p>
     <w:p>
       <w:pPr>
@@ -2077,30 +2279,10 @@
           <w:sz w:val="28"/>
           <w:szCs w:val="28"/>
         </w:rPr>
-        <w:t xml:space="preserve">    └── settings.json</w:t>
-      </w:r>
-    </w:p>
-    <w:p>
-      <w:pPr>
-        <w:jc w:val="both"/>
-        <w:rPr>
-          <w:rFonts w:ascii="Carlito" w:hAnsi="Carlito" w:cs="Carlito"/>
-          <w:sz w:val="32"/>
-          <w:szCs w:val="32"/>
-        </w:rPr>
-      </w:pPr>
-      <w:r>
-        <w:rPr>
-          <w:rFonts w:ascii="Carlito" w:hAnsi="Carlito" w:cs="Carlito"/>
-          <w:sz w:val="32"/>
-          <w:szCs w:val="32"/>
-        </w:rPr>
-        <w:t># Like:</w:t>
-      </w:r>
-    </w:p>
-    <w:p>
-      <w:pPr>
-        <w:jc w:val="both"/>
+        <w:t>└─</w:t>
+      </w:r>
+      <w:proofErr w:type="gramStart"/>
+      <w:r>
         <w:rPr>
           <w:rFonts w:ascii="Carlito" w:hAnsi="Carlito" w:cs="Carlito"/>
           <w:b/>
@@ -2108,7 +2290,9 @@
           <w:sz w:val="28"/>
           <w:szCs w:val="28"/>
         </w:rPr>
-      </w:pPr>
+        <w:t>─ .</w:t>
+      </w:r>
+      <w:proofErr w:type="spellStart"/>
       <w:r>
         <w:rPr>
           <w:rFonts w:ascii="Carlito" w:hAnsi="Carlito" w:cs="Carlito"/>
@@ -2117,12 +2301,11 @@
           <w:sz w:val="28"/>
           <w:szCs w:val="28"/>
         </w:rPr>
-        <w:t>{</w:t>
-      </w:r>
-    </w:p>
-    <w:p>
-      <w:pPr>
-        <w:jc w:val="both"/>
+        <w:t>vscode</w:t>
+      </w:r>
+      <w:proofErr w:type="spellEnd"/>
+      <w:proofErr w:type="gramEnd"/>
+      <w:r>
         <w:rPr>
           <w:rFonts w:ascii="Carlito" w:hAnsi="Carlito" w:cs="Carlito"/>
           <w:b/>
@@ -2130,8 +2313,12 @@
           <w:sz w:val="28"/>
           <w:szCs w:val="28"/>
         </w:rPr>
-      </w:pPr>
-      <w:r>
+        <w:t>/</w:t>
+      </w:r>
+    </w:p>
+    <w:p>
+      <w:pPr>
+        <w:jc w:val="both"/>
         <w:rPr>
           <w:rFonts w:ascii="Carlito" w:hAnsi="Carlito" w:cs="Carlito"/>
           <w:b/>
@@ -2139,12 +2326,8 @@
           <w:sz w:val="28"/>
           <w:szCs w:val="28"/>
         </w:rPr>
-        <w:t xml:space="preserve">  "editor.fontSize": 16,</w:t>
-      </w:r>
-    </w:p>
-    <w:p>
-      <w:pPr>
-        <w:jc w:val="both"/>
+      </w:pPr>
+      <w:r>
         <w:rPr>
           <w:rFonts w:ascii="Carlito" w:hAnsi="Carlito" w:cs="Carlito"/>
           <w:b/>
@@ -2152,7 +2335,10 @@
           <w:sz w:val="28"/>
           <w:szCs w:val="28"/>
         </w:rPr>
-      </w:pPr>
+        <w:t xml:space="preserve">    └── </w:t>
+      </w:r>
+      <w:proofErr w:type="spellStart"/>
+      <w:proofErr w:type="gramStart"/>
       <w:r>
         <w:rPr>
           <w:rFonts w:ascii="Carlito" w:hAnsi="Carlito" w:cs="Carlito"/>
@@ -2161,7 +2347,27 @@
           <w:sz w:val="28"/>
           <w:szCs w:val="28"/>
         </w:rPr>
-        <w:t xml:space="preserve">  "cSpell.words": [</w:t>
+        <w:t>settings.json</w:t>
+      </w:r>
+      <w:proofErr w:type="spellEnd"/>
+      <w:proofErr w:type="gramEnd"/>
+    </w:p>
+    <w:p>
+      <w:pPr>
+        <w:jc w:val="both"/>
+        <w:rPr>
+          <w:rFonts w:ascii="Carlito" w:hAnsi="Carlito" w:cs="Carlito"/>
+          <w:sz w:val="32"/>
+          <w:szCs w:val="32"/>
+        </w:rPr>
+      </w:pPr>
+      <w:r>
+        <w:rPr>
+          <w:rFonts w:ascii="Carlito" w:hAnsi="Carlito" w:cs="Carlito"/>
+          <w:sz w:val="32"/>
+          <w:szCs w:val="32"/>
+        </w:rPr>
+        <w:t># Like:</w:t>
       </w:r>
     </w:p>
     <w:p>
@@ -2183,7 +2389,7 @@
           <w:sz w:val="28"/>
           <w:szCs w:val="28"/>
         </w:rPr>
-        <w:t xml:space="preserve">        "playfair"</w:t>
+        <w:t>{</w:t>
       </w:r>
     </w:p>
     <w:p>
@@ -2205,12 +2411,11 @@
           <w:sz w:val="28"/>
           <w:szCs w:val="28"/>
         </w:rPr>
-        <w:t xml:space="preserve">  ],</w:t>
-      </w:r>
-    </w:p>
-    <w:p>
-      <w:pPr>
-        <w:jc w:val="both"/>
+        <w:t xml:space="preserve">  "</w:t>
+      </w:r>
+      <w:proofErr w:type="spellStart"/>
+      <w:proofErr w:type="gramStart"/>
+      <w:r>
         <w:rPr>
           <w:rFonts w:ascii="Carlito" w:hAnsi="Carlito" w:cs="Carlito"/>
           <w:b/>
@@ -2218,7 +2423,10 @@
           <w:sz w:val="28"/>
           <w:szCs w:val="28"/>
         </w:rPr>
-      </w:pPr>
+        <w:t>editor.fontSize</w:t>
+      </w:r>
+      <w:proofErr w:type="spellEnd"/>
+      <w:proofErr w:type="gramEnd"/>
       <w:r>
         <w:rPr>
           <w:rFonts w:ascii="Carlito" w:hAnsi="Carlito" w:cs="Carlito"/>
@@ -2227,7 +2435,7 @@
           <w:sz w:val="28"/>
           <w:szCs w:val="28"/>
         </w:rPr>
-        <w:t xml:space="preserve">  "java.configuration.updateBuildConfiguration": "interactive",</w:t>
+        <w:t>": 16,</w:t>
       </w:r>
     </w:p>
     <w:p>
@@ -2249,12 +2457,10 @@
           <w:sz w:val="28"/>
           <w:szCs w:val="28"/>
         </w:rPr>
-        <w:t xml:space="preserve">  "dart.previewFlutterUiGuides": true,</w:t>
-      </w:r>
-    </w:p>
-    <w:p>
-      <w:pPr>
-        <w:jc w:val="both"/>
+        <w:t xml:space="preserve">  "</w:t>
+      </w:r>
+      <w:proofErr w:type="spellStart"/>
+      <w:r>
         <w:rPr>
           <w:rFonts w:ascii="Carlito" w:hAnsi="Carlito" w:cs="Carlito"/>
           <w:b/>
@@ -2262,7 +2468,9 @@
           <w:sz w:val="28"/>
           <w:szCs w:val="28"/>
         </w:rPr>
-      </w:pPr>
+        <w:t>cSpell.words</w:t>
+      </w:r>
+      <w:proofErr w:type="spellEnd"/>
       <w:r>
         <w:rPr>
           <w:rFonts w:ascii="Carlito" w:hAnsi="Carlito" w:cs="Carlito"/>
@@ -2271,174 +2479,7 @@
           <w:sz w:val="28"/>
           <w:szCs w:val="28"/>
         </w:rPr>
-        <w:t>}</w:t>
-      </w:r>
-    </w:p>
-    <w:p>
-      <w:pPr>
-        <w:jc w:val="both"/>
-        <w:rPr>
-          <w:rFonts w:ascii="Carlito" w:hAnsi="Carlito" w:cs="Carlito"/>
-          <w:sz w:val="32"/>
-          <w:szCs w:val="32"/>
-        </w:rPr>
-      </w:pPr>
-      <w:r>
-        <w:rPr>
-          <w:rFonts w:ascii="Carlito" w:hAnsi="Carlito" w:cs="Carlito"/>
-          <w:sz w:val="32"/>
-          <w:szCs w:val="32"/>
-        </w:rPr>
-        <w:t xml:space="preserve"># </w:t>
-      </w:r>
-      <w:r>
-        <w:rPr>
-          <w:rFonts w:ascii="Carlito" w:hAnsi="Carlito" w:cs="Carlito"/>
-          <w:b/>
-          <w:bCs/>
-          <w:sz w:val="32"/>
-          <w:szCs w:val="32"/>
-        </w:rPr>
-        <w:t>editor.fontSize</w:t>
-      </w:r>
-      <w:r>
-        <w:rPr>
-          <w:rFonts w:ascii="Carlito" w:hAnsi="Carlito" w:cs="Carlito"/>
-          <w:sz w:val="32"/>
-          <w:szCs w:val="32"/>
-        </w:rPr>
-        <w:t xml:space="preserve"> tells use font size 16 for this project</w:t>
-      </w:r>
-    </w:p>
-    <w:p>
-      <w:pPr>
-        <w:jc w:val="both"/>
-        <w:rPr>
-          <w:rFonts w:ascii="Carlito" w:hAnsi="Carlito" w:cs="Carlito"/>
-          <w:sz w:val="32"/>
-          <w:szCs w:val="32"/>
-        </w:rPr>
-      </w:pPr>
-      <w:r>
-        <w:rPr>
-          <w:rFonts w:ascii="Carlito" w:hAnsi="Carlito" w:cs="Carlito"/>
-          <w:sz w:val="32"/>
-          <w:szCs w:val="32"/>
-        </w:rPr>
-        <w:t xml:space="preserve"># </w:t>
-      </w:r>
-      <w:r>
-        <w:rPr>
-          <w:rFonts w:ascii="Carlito" w:hAnsi="Carlito" w:cs="Carlito"/>
-          <w:b/>
-          <w:bCs/>
-          <w:sz w:val="32"/>
-          <w:szCs w:val="32"/>
-        </w:rPr>
-        <w:t>cSpell.words</w:t>
-      </w:r>
-      <w:r>
-        <w:rPr>
-          <w:rFonts w:ascii="Carlito" w:hAnsi="Carlito" w:cs="Carlito"/>
-          <w:sz w:val="32"/>
-          <w:szCs w:val="32"/>
-        </w:rPr>
-        <w:t xml:space="preserve"> tells the spell checker not to flag like we know this word. Don’t complain about it (Project level dictionary)</w:t>
-      </w:r>
-    </w:p>
-    <w:p>
-      <w:pPr>
-        <w:jc w:val="both"/>
-        <w:rPr>
-          <w:rFonts w:ascii="Carlito" w:hAnsi="Carlito" w:cs="Carlito"/>
-          <w:sz w:val="32"/>
-          <w:szCs w:val="32"/>
-        </w:rPr>
-      </w:pPr>
-      <w:r>
-        <w:rPr>
-          <w:rFonts w:ascii="Carlito" w:hAnsi="Carlito" w:cs="Carlito"/>
-          <w:sz w:val="32"/>
-          <w:szCs w:val="32"/>
-        </w:rPr>
-        <w:lastRenderedPageBreak/>
-        <w:t xml:space="preserve"># </w:t>
-      </w:r>
-      <w:r>
-        <w:rPr>
-          <w:rFonts w:ascii="Carlito" w:hAnsi="Carlito" w:cs="Carlito"/>
-          <w:b/>
-          <w:bCs/>
-          <w:sz w:val="32"/>
-          <w:szCs w:val="32"/>
-        </w:rPr>
-        <w:t>java.configuration.updateBuildConfiguration</w:t>
-      </w:r>
-      <w:r>
-        <w:rPr>
-          <w:rFonts w:ascii="Carlito" w:hAnsi="Carlito" w:cs="Carlito"/>
-          <w:sz w:val="32"/>
-          <w:szCs w:val="32"/>
-        </w:rPr>
-        <w:t xml:space="preserve"> </w:t>
-      </w:r>
-      <w:r>
-        <w:rPr>
-          <w:rFonts w:ascii="Carlito" w:hAnsi="Carlito" w:cs="Carlito"/>
-          <w:sz w:val="32"/>
-          <w:szCs w:val="32"/>
-        </w:rPr>
-        <w:t>controls what VS Code does when it detects that our Gradle configuration has changed.</w:t>
-      </w:r>
-      <w:r>
-        <w:rPr>
-          <w:rFonts w:ascii="Carlito" w:hAnsi="Carlito" w:cs="Carlito"/>
-          <w:sz w:val="32"/>
-          <w:szCs w:val="32"/>
-        </w:rPr>
-        <w:t xml:space="preserve"> </w:t>
-      </w:r>
-      <w:r>
-        <w:rPr>
-          <w:rFonts w:ascii="Carlito" w:hAnsi="Carlito" w:cs="Carlito"/>
-          <w:sz w:val="32"/>
-          <w:szCs w:val="32"/>
-        </w:rPr>
-        <w:t>For example,</w:t>
-      </w:r>
-      <w:r>
-        <w:rPr>
-          <w:rFonts w:ascii="Carlito" w:hAnsi="Carlito" w:cs="Carlito"/>
-          <w:sz w:val="32"/>
-          <w:szCs w:val="32"/>
-        </w:rPr>
-        <w:t xml:space="preserve"> </w:t>
-      </w:r>
-      <w:r>
-        <w:rPr>
-          <w:rFonts w:ascii="Carlito" w:hAnsi="Carlito" w:cs="Carlito"/>
-          <w:sz w:val="32"/>
-          <w:szCs w:val="32"/>
-        </w:rPr>
-        <w:t xml:space="preserve">our </w:t>
-      </w:r>
-      <w:r>
-        <w:rPr>
-          <w:rFonts w:ascii="Carlito" w:hAnsi="Carlito" w:cs="Carlito"/>
-          <w:b/>
-          <w:bCs/>
-          <w:sz w:val="32"/>
-          <w:szCs w:val="32"/>
-        </w:rPr>
-        <w:t>Flutter</w:t>
-      </w:r>
-      <w:r>
-        <w:rPr>
-          <w:rFonts w:ascii="Carlito" w:hAnsi="Carlito" w:cs="Carlito"/>
-          <w:sz w:val="32"/>
-          <w:szCs w:val="32"/>
-        </w:rPr>
-        <w:t xml:space="preserve"> project has:</w:t>
+        <w:t>": [</w:t>
       </w:r>
     </w:p>
     <w:p>
@@ -2460,12 +2501,10 @@
           <w:sz w:val="28"/>
           <w:szCs w:val="28"/>
         </w:rPr>
-        <w:t>android/</w:t>
-      </w:r>
-    </w:p>
-    <w:p>
-      <w:pPr>
-        <w:jc w:val="both"/>
+        <w:t xml:space="preserve">        "</w:t>
+      </w:r>
+      <w:proofErr w:type="spellStart"/>
+      <w:r>
         <w:rPr>
           <w:rFonts w:ascii="Carlito" w:hAnsi="Carlito" w:cs="Carlito"/>
           <w:b/>
@@ -2473,18 +2512,23 @@
           <w:sz w:val="28"/>
           <w:szCs w:val="28"/>
         </w:rPr>
-      </w:pPr>
-      <w:r>
-        <w:rPr>
-          <w:rFonts w:ascii="Arial" w:hAnsi="Arial" w:cs="Arial"/>
+        <w:t>playfair</w:t>
+      </w:r>
+      <w:proofErr w:type="spellEnd"/>
+      <w:r>
+        <w:rPr>
+          <w:rFonts w:ascii="Carlito" w:hAnsi="Carlito" w:cs="Carlito"/>
           <w:b/>
           <w:bCs/>
           <w:sz w:val="28"/>
           <w:szCs w:val="28"/>
         </w:rPr>
-        <w:t>├</w:t>
-      </w:r>
-      <w:r>
+        <w:t>"</w:t>
+      </w:r>
+    </w:p>
+    <w:p>
+      <w:pPr>
+        <w:jc w:val="both"/>
         <w:rPr>
           <w:rFonts w:ascii="Carlito" w:hAnsi="Carlito" w:cs="Carlito"/>
           <w:b/>
@@ -2492,12 +2536,8 @@
           <w:sz w:val="28"/>
           <w:szCs w:val="28"/>
         </w:rPr>
-        <w:t>── build.gradle.kts</w:t>
-      </w:r>
-    </w:p>
-    <w:p>
-      <w:pPr>
-        <w:jc w:val="both"/>
+      </w:pPr>
+      <w:r>
         <w:rPr>
           <w:rFonts w:ascii="Carlito" w:hAnsi="Carlito" w:cs="Carlito"/>
           <w:b/>
@@ -2505,17 +2545,20 @@
           <w:sz w:val="28"/>
           <w:szCs w:val="28"/>
         </w:rPr>
-      </w:pPr>
-      <w:r>
-        <w:rPr>
-          <w:rFonts w:ascii="Arial" w:hAnsi="Arial" w:cs="Arial"/>
+        <w:t xml:space="preserve">  ],</w:t>
+      </w:r>
+    </w:p>
+    <w:p>
+      <w:pPr>
+        <w:jc w:val="both"/>
+        <w:rPr>
+          <w:rFonts w:ascii="Carlito" w:hAnsi="Carlito" w:cs="Carlito"/>
           <w:b/>
           <w:bCs/>
           <w:sz w:val="28"/>
           <w:szCs w:val="28"/>
         </w:rPr>
-        <w:t>├</w:t>
-      </w:r>
+      </w:pPr>
       <w:r>
         <w:rPr>
           <w:rFonts w:ascii="Carlito" w:hAnsi="Carlito" w:cs="Carlito"/>
@@ -2524,12 +2567,11 @@
           <w:sz w:val="28"/>
           <w:szCs w:val="28"/>
         </w:rPr>
-        <w:t>── settings.gradle.kts</w:t>
-      </w:r>
-    </w:p>
-    <w:p>
-      <w:pPr>
-        <w:jc w:val="both"/>
+        <w:t xml:space="preserve">  "</w:t>
+      </w:r>
+      <w:proofErr w:type="spellStart"/>
+      <w:proofErr w:type="gramStart"/>
+      <w:r>
         <w:rPr>
           <w:rFonts w:ascii="Carlito" w:hAnsi="Carlito" w:cs="Carlito"/>
           <w:b/>
@@ -2537,7 +2579,9 @@
           <w:sz w:val="28"/>
           <w:szCs w:val="28"/>
         </w:rPr>
-      </w:pPr>
+        <w:t>java.configuration</w:t>
+      </w:r>
+      <w:proofErr w:type="gramEnd"/>
       <w:r>
         <w:rPr>
           <w:rFonts w:ascii="Carlito" w:hAnsi="Carlito" w:cs="Carlito"/>
@@ -2546,12 +2590,10 @@
           <w:sz w:val="28"/>
           <w:szCs w:val="28"/>
         </w:rPr>
-        <w:t>└── app/</w:t>
-      </w:r>
-    </w:p>
-    <w:p>
-      <w:pPr>
-        <w:jc w:val="both"/>
+        <w:t>.updateBuildConfiguration</w:t>
+      </w:r>
+      <w:proofErr w:type="spellEnd"/>
+      <w:r>
         <w:rPr>
           <w:rFonts w:ascii="Carlito" w:hAnsi="Carlito" w:cs="Carlito"/>
           <w:b/>
@@ -2559,8 +2601,12 @@
           <w:sz w:val="28"/>
           <w:szCs w:val="28"/>
         </w:rPr>
-      </w:pPr>
-      <w:r>
+        <w:t>": "interactive",</w:t>
+      </w:r>
+    </w:p>
+    <w:p>
+      <w:pPr>
+        <w:jc w:val="both"/>
         <w:rPr>
           <w:rFonts w:ascii="Carlito" w:hAnsi="Carlito" w:cs="Carlito"/>
           <w:b/>
@@ -2568,8 +2614,416 @@
           <w:sz w:val="28"/>
           <w:szCs w:val="28"/>
         </w:rPr>
-        <w:t xml:space="preserve">    └── build.gradle.kts</w:t>
-      </w:r>
+      </w:pPr>
+      <w:r>
+        <w:rPr>
+          <w:rFonts w:ascii="Carlito" w:hAnsi="Carlito" w:cs="Carlito"/>
+          <w:b/>
+          <w:bCs/>
+          <w:sz w:val="28"/>
+          <w:szCs w:val="28"/>
+        </w:rPr>
+        <w:t xml:space="preserve">  "</w:t>
+      </w:r>
+      <w:proofErr w:type="spellStart"/>
+      <w:proofErr w:type="gramStart"/>
+      <w:r>
+        <w:rPr>
+          <w:rFonts w:ascii="Carlito" w:hAnsi="Carlito" w:cs="Carlito"/>
+          <w:b/>
+          <w:bCs/>
+          <w:sz w:val="28"/>
+          <w:szCs w:val="28"/>
+        </w:rPr>
+        <w:t>dart.previewFlutterUiGuides</w:t>
+      </w:r>
+      <w:proofErr w:type="spellEnd"/>
+      <w:proofErr w:type="gramEnd"/>
+      <w:r>
+        <w:rPr>
+          <w:rFonts w:ascii="Carlito" w:hAnsi="Carlito" w:cs="Carlito"/>
+          <w:b/>
+          <w:bCs/>
+          <w:sz w:val="28"/>
+          <w:szCs w:val="28"/>
+        </w:rPr>
+        <w:t>": true,</w:t>
+      </w:r>
+    </w:p>
+    <w:p>
+      <w:pPr>
+        <w:jc w:val="both"/>
+        <w:rPr>
+          <w:rFonts w:ascii="Carlito" w:hAnsi="Carlito" w:cs="Carlito"/>
+          <w:b/>
+          <w:bCs/>
+          <w:sz w:val="28"/>
+          <w:szCs w:val="28"/>
+        </w:rPr>
+      </w:pPr>
+      <w:r>
+        <w:rPr>
+          <w:rFonts w:ascii="Carlito" w:hAnsi="Carlito" w:cs="Carlito"/>
+          <w:b/>
+          <w:bCs/>
+          <w:sz w:val="28"/>
+          <w:szCs w:val="28"/>
+        </w:rPr>
+        <w:t>}</w:t>
+      </w:r>
+    </w:p>
+    <w:p>
+      <w:pPr>
+        <w:jc w:val="both"/>
+        <w:rPr>
+          <w:rFonts w:ascii="Carlito" w:hAnsi="Carlito" w:cs="Carlito"/>
+          <w:sz w:val="32"/>
+          <w:szCs w:val="32"/>
+        </w:rPr>
+      </w:pPr>
+      <w:r>
+        <w:rPr>
+          <w:rFonts w:ascii="Carlito" w:hAnsi="Carlito" w:cs="Carlito"/>
+          <w:sz w:val="32"/>
+          <w:szCs w:val="32"/>
+        </w:rPr>
+        <w:t xml:space="preserve"># </w:t>
+      </w:r>
+      <w:proofErr w:type="spellStart"/>
+      <w:proofErr w:type="gramStart"/>
+      <w:r>
+        <w:rPr>
+          <w:rFonts w:ascii="Carlito" w:hAnsi="Carlito" w:cs="Carlito"/>
+          <w:b/>
+          <w:bCs/>
+          <w:sz w:val="32"/>
+          <w:szCs w:val="32"/>
+        </w:rPr>
+        <w:t>editor.fontSize</w:t>
+      </w:r>
+      <w:proofErr w:type="spellEnd"/>
+      <w:proofErr w:type="gramEnd"/>
+      <w:r>
+        <w:rPr>
+          <w:rFonts w:ascii="Carlito" w:hAnsi="Carlito" w:cs="Carlito"/>
+          <w:sz w:val="32"/>
+          <w:szCs w:val="32"/>
+        </w:rPr>
+        <w:t xml:space="preserve"> tells use font size 16 for this project</w:t>
+      </w:r>
+    </w:p>
+    <w:p>
+      <w:pPr>
+        <w:jc w:val="both"/>
+        <w:rPr>
+          <w:rFonts w:ascii="Carlito" w:hAnsi="Carlito" w:cs="Carlito"/>
+          <w:sz w:val="32"/>
+          <w:szCs w:val="32"/>
+        </w:rPr>
+      </w:pPr>
+      <w:r>
+        <w:rPr>
+          <w:rFonts w:ascii="Carlito" w:hAnsi="Carlito" w:cs="Carlito"/>
+          <w:sz w:val="32"/>
+          <w:szCs w:val="32"/>
+        </w:rPr>
+        <w:t xml:space="preserve"># </w:t>
+      </w:r>
+      <w:proofErr w:type="spellStart"/>
+      <w:r>
+        <w:rPr>
+          <w:rFonts w:ascii="Carlito" w:hAnsi="Carlito" w:cs="Carlito"/>
+          <w:b/>
+          <w:bCs/>
+          <w:sz w:val="32"/>
+          <w:szCs w:val="32"/>
+        </w:rPr>
+        <w:t>cSpell.words</w:t>
+      </w:r>
+      <w:proofErr w:type="spellEnd"/>
+      <w:r>
+        <w:rPr>
+          <w:rFonts w:ascii="Carlito" w:hAnsi="Carlito" w:cs="Carlito"/>
+          <w:sz w:val="32"/>
+          <w:szCs w:val="32"/>
+        </w:rPr>
+        <w:t xml:space="preserve"> tells the spell checker not to flag like we know this word. Don’t complain about it (Project level dictionary)</w:t>
+      </w:r>
+    </w:p>
+    <w:p>
+      <w:pPr>
+        <w:jc w:val="both"/>
+        <w:rPr>
+          <w:rFonts w:ascii="Carlito" w:hAnsi="Carlito" w:cs="Carlito"/>
+          <w:sz w:val="32"/>
+          <w:szCs w:val="32"/>
+        </w:rPr>
+      </w:pPr>
+      <w:r>
+        <w:rPr>
+          <w:rFonts w:ascii="Carlito" w:hAnsi="Carlito" w:cs="Carlito"/>
+          <w:sz w:val="32"/>
+          <w:szCs w:val="32"/>
+        </w:rPr>
+        <w:t xml:space="preserve"># </w:t>
+      </w:r>
+      <w:proofErr w:type="spellStart"/>
+      <w:proofErr w:type="gramStart"/>
+      <w:r>
+        <w:rPr>
+          <w:rFonts w:ascii="Carlito" w:hAnsi="Carlito" w:cs="Carlito"/>
+          <w:b/>
+          <w:bCs/>
+          <w:sz w:val="32"/>
+          <w:szCs w:val="32"/>
+        </w:rPr>
+        <w:t>java.configuration</w:t>
+      </w:r>
+      <w:proofErr w:type="gramEnd"/>
+      <w:r>
+        <w:rPr>
+          <w:rFonts w:ascii="Carlito" w:hAnsi="Carlito" w:cs="Carlito"/>
+          <w:b/>
+          <w:bCs/>
+          <w:sz w:val="32"/>
+          <w:szCs w:val="32"/>
+        </w:rPr>
+        <w:t>.updateBuildConfiguration</w:t>
+      </w:r>
+      <w:proofErr w:type="spellEnd"/>
+      <w:r>
+        <w:rPr>
+          <w:rFonts w:ascii="Carlito" w:hAnsi="Carlito" w:cs="Carlito"/>
+          <w:sz w:val="32"/>
+          <w:szCs w:val="32"/>
+        </w:rPr>
+        <w:t xml:space="preserve"> </w:t>
+      </w:r>
+      <w:r>
+        <w:rPr>
+          <w:rFonts w:ascii="Carlito" w:hAnsi="Carlito" w:cs="Carlito"/>
+          <w:sz w:val="32"/>
+          <w:szCs w:val="32"/>
+        </w:rPr>
+        <w:t>controls what VS Code does when it detects that our Gradle configuration has changed.</w:t>
+      </w:r>
+      <w:r>
+        <w:rPr>
+          <w:rFonts w:ascii="Carlito" w:hAnsi="Carlito" w:cs="Carlito"/>
+          <w:sz w:val="32"/>
+          <w:szCs w:val="32"/>
+        </w:rPr>
+        <w:t xml:space="preserve"> </w:t>
+      </w:r>
+      <w:r>
+        <w:rPr>
+          <w:rFonts w:ascii="Carlito" w:hAnsi="Carlito" w:cs="Carlito"/>
+          <w:sz w:val="32"/>
+          <w:szCs w:val="32"/>
+        </w:rPr>
+        <w:t>For example,</w:t>
+      </w:r>
+      <w:r>
+        <w:rPr>
+          <w:rFonts w:ascii="Carlito" w:hAnsi="Carlito" w:cs="Carlito"/>
+          <w:sz w:val="32"/>
+          <w:szCs w:val="32"/>
+        </w:rPr>
+        <w:t xml:space="preserve"> </w:t>
+      </w:r>
+      <w:r>
+        <w:rPr>
+          <w:rFonts w:ascii="Carlito" w:hAnsi="Carlito" w:cs="Carlito"/>
+          <w:sz w:val="32"/>
+          <w:szCs w:val="32"/>
+        </w:rPr>
+        <w:t xml:space="preserve">our </w:t>
+      </w:r>
+      <w:r>
+        <w:rPr>
+          <w:rFonts w:ascii="Carlito" w:hAnsi="Carlito" w:cs="Carlito"/>
+          <w:b/>
+          <w:bCs/>
+          <w:sz w:val="32"/>
+          <w:szCs w:val="32"/>
+        </w:rPr>
+        <w:t>Flutter</w:t>
+      </w:r>
+      <w:r>
+        <w:rPr>
+          <w:rFonts w:ascii="Carlito" w:hAnsi="Carlito" w:cs="Carlito"/>
+          <w:sz w:val="32"/>
+          <w:szCs w:val="32"/>
+        </w:rPr>
+        <w:t xml:space="preserve"> project has:</w:t>
+      </w:r>
+    </w:p>
+    <w:p>
+      <w:pPr>
+        <w:jc w:val="both"/>
+        <w:rPr>
+          <w:rFonts w:ascii="Carlito" w:hAnsi="Carlito" w:cs="Carlito"/>
+          <w:b/>
+          <w:bCs/>
+          <w:sz w:val="28"/>
+          <w:szCs w:val="28"/>
+        </w:rPr>
+      </w:pPr>
+      <w:r>
+        <w:rPr>
+          <w:rFonts w:ascii="Carlito" w:hAnsi="Carlito" w:cs="Carlito"/>
+          <w:b/>
+          <w:bCs/>
+          <w:sz w:val="28"/>
+          <w:szCs w:val="28"/>
+        </w:rPr>
+        <w:lastRenderedPageBreak/>
+        <w:t>android/</w:t>
+      </w:r>
+    </w:p>
+    <w:p>
+      <w:pPr>
+        <w:jc w:val="both"/>
+        <w:rPr>
+          <w:rFonts w:ascii="Carlito" w:hAnsi="Carlito" w:cs="Carlito"/>
+          <w:b/>
+          <w:bCs/>
+          <w:sz w:val="28"/>
+          <w:szCs w:val="28"/>
+        </w:rPr>
+      </w:pPr>
+      <w:r>
+        <w:rPr>
+          <w:rFonts w:ascii="Arial" w:hAnsi="Arial" w:cs="Arial"/>
+          <w:b/>
+          <w:bCs/>
+          <w:sz w:val="28"/>
+          <w:szCs w:val="28"/>
+        </w:rPr>
+        <w:t>├</w:t>
+      </w:r>
+      <w:r>
+        <w:rPr>
+          <w:rFonts w:ascii="Carlito" w:hAnsi="Carlito" w:cs="Carlito"/>
+          <w:b/>
+          <w:bCs/>
+          <w:sz w:val="28"/>
+          <w:szCs w:val="28"/>
+        </w:rPr>
+        <w:t xml:space="preserve">── </w:t>
+      </w:r>
+      <w:proofErr w:type="spellStart"/>
+      <w:r>
+        <w:rPr>
+          <w:rFonts w:ascii="Carlito" w:hAnsi="Carlito" w:cs="Carlito"/>
+          <w:b/>
+          <w:bCs/>
+          <w:sz w:val="28"/>
+          <w:szCs w:val="28"/>
+        </w:rPr>
+        <w:t>build.gradle.kts</w:t>
+      </w:r>
+      <w:proofErr w:type="spellEnd"/>
+    </w:p>
+    <w:p>
+      <w:pPr>
+        <w:jc w:val="both"/>
+        <w:rPr>
+          <w:rFonts w:ascii="Carlito" w:hAnsi="Carlito" w:cs="Carlito"/>
+          <w:b/>
+          <w:bCs/>
+          <w:sz w:val="28"/>
+          <w:szCs w:val="28"/>
+        </w:rPr>
+      </w:pPr>
+      <w:r>
+        <w:rPr>
+          <w:rFonts w:ascii="Arial" w:hAnsi="Arial" w:cs="Arial"/>
+          <w:b/>
+          <w:bCs/>
+          <w:sz w:val="28"/>
+          <w:szCs w:val="28"/>
+        </w:rPr>
+        <w:t>├</w:t>
+      </w:r>
+      <w:r>
+        <w:rPr>
+          <w:rFonts w:ascii="Carlito" w:hAnsi="Carlito" w:cs="Carlito"/>
+          <w:b/>
+          <w:bCs/>
+          <w:sz w:val="28"/>
+          <w:szCs w:val="28"/>
+        </w:rPr>
+        <w:t xml:space="preserve">── </w:t>
+      </w:r>
+      <w:proofErr w:type="spellStart"/>
+      <w:r>
+        <w:rPr>
+          <w:rFonts w:ascii="Carlito" w:hAnsi="Carlito" w:cs="Carlito"/>
+          <w:b/>
+          <w:bCs/>
+          <w:sz w:val="28"/>
+          <w:szCs w:val="28"/>
+        </w:rPr>
+        <w:t>settings.gradle.kts</w:t>
+      </w:r>
+      <w:proofErr w:type="spellEnd"/>
+    </w:p>
+    <w:p>
+      <w:pPr>
+        <w:jc w:val="both"/>
+        <w:rPr>
+          <w:rFonts w:ascii="Carlito" w:hAnsi="Carlito" w:cs="Carlito"/>
+          <w:b/>
+          <w:bCs/>
+          <w:sz w:val="28"/>
+          <w:szCs w:val="28"/>
+        </w:rPr>
+      </w:pPr>
+      <w:r>
+        <w:rPr>
+          <w:rFonts w:ascii="Carlito" w:hAnsi="Carlito" w:cs="Carlito"/>
+          <w:b/>
+          <w:bCs/>
+          <w:sz w:val="28"/>
+          <w:szCs w:val="28"/>
+        </w:rPr>
+        <w:t>└── app/</w:t>
+      </w:r>
+    </w:p>
+    <w:p>
+      <w:pPr>
+        <w:jc w:val="both"/>
+        <w:rPr>
+          <w:rFonts w:ascii="Carlito" w:hAnsi="Carlito" w:cs="Carlito"/>
+          <w:b/>
+          <w:bCs/>
+          <w:sz w:val="28"/>
+          <w:szCs w:val="28"/>
+        </w:rPr>
+      </w:pPr>
+      <w:r>
+        <w:rPr>
+          <w:rFonts w:ascii="Carlito" w:hAnsi="Carlito" w:cs="Carlito"/>
+          <w:b/>
+          <w:bCs/>
+          <w:sz w:val="28"/>
+          <w:szCs w:val="28"/>
+        </w:rPr>
+        <w:t xml:space="preserve">    └── </w:t>
+      </w:r>
+      <w:proofErr w:type="spellStart"/>
+      <w:r>
+        <w:rPr>
+          <w:rFonts w:ascii="Carlito" w:hAnsi="Carlito" w:cs="Carlito"/>
+          <w:b/>
+          <w:bCs/>
+          <w:sz w:val="28"/>
+          <w:szCs w:val="28"/>
+        </w:rPr>
+        <w:t>build.gradle.kts</w:t>
+      </w:r>
+      <w:proofErr w:type="spellEnd"/>
     </w:p>
     <w:p>
       <w:pPr>
@@ -2875,6 +3329,8 @@
         </w:rPr>
         <w:t xml:space="preserve"># It shows custom lines for better clarity of the Widget tree in Flutter. To enable this in project level just add it in </w:t>
       </w:r>
+      <w:proofErr w:type="spellStart"/>
+      <w:proofErr w:type="gramStart"/>
       <w:r>
         <w:rPr>
           <w:rFonts w:ascii="Carlito" w:hAnsi="Carlito" w:cs="Carlito"/>
@@ -2885,6 +3341,8 @@
         </w:rPr>
         <w:t>settings.json</w:t>
       </w:r>
+      <w:proofErr w:type="spellEnd"/>
+      <w:proofErr w:type="gramEnd"/>
     </w:p>
     <w:p>
       <w:pPr>
@@ -3021,7 +3479,33 @@
           <w:sz w:val="32"/>
           <w:szCs w:val="32"/>
         </w:rPr>
-        <w:t xml:space="preserve"> "dart.previewFlutterUiGuides": true,</w:t>
+        <w:t xml:space="preserve"> "</w:t>
+      </w:r>
+      <w:proofErr w:type="spellStart"/>
+      <w:proofErr w:type="gramStart"/>
+      <w:r>
+        <w:rPr>
+          <w:rFonts w:ascii="Carlito" w:hAnsi="Carlito" w:cs="Carlito"/>
+          <w:b/>
+          <w:bCs/>
+          <w:color w:val="D86DCB" w:themeColor="accent5" w:themeTint="99"/>
+          <w:sz w:val="32"/>
+          <w:szCs w:val="32"/>
+        </w:rPr>
+        <w:t>dart.previewFlutterUiGuides</w:t>
+      </w:r>
+      <w:proofErr w:type="spellEnd"/>
+      <w:proofErr w:type="gramEnd"/>
+      <w:r>
+        <w:rPr>
+          <w:rFonts w:ascii="Carlito" w:hAnsi="Carlito" w:cs="Carlito"/>
+          <w:b/>
+          <w:bCs/>
+          <w:color w:val="D86DCB" w:themeColor="accent5" w:themeTint="99"/>
+          <w:sz w:val="32"/>
+          <w:szCs w:val="32"/>
+        </w:rPr>
+        <w:t>": true,</w:t>
       </w:r>
     </w:p>
     <w:p>
@@ -3123,27 +3607,28 @@
           <w:sz w:val="32"/>
           <w:szCs w:val="32"/>
         </w:rPr>
+        <w:t xml:space="preserve">User vs Workspace Settings: </w:t>
+      </w:r>
+    </w:p>
+    <w:p>
+      <w:pPr>
+        <w:jc w:val="both"/>
+        <w:rPr>
+          <w:rFonts w:ascii="Carlito" w:hAnsi="Carlito" w:cs="Carlito"/>
+          <w:sz w:val="32"/>
+          <w:szCs w:val="32"/>
+        </w:rPr>
+      </w:pPr>
+      <w:r>
+        <w:rPr>
+          <w:rFonts w:ascii="Carlito" w:hAnsi="Carlito" w:cs="Carlito"/>
+          <w:sz w:val="32"/>
+          <w:szCs w:val="32"/>
+        </w:rPr>
         <w:lastRenderedPageBreak/>
-        <w:t xml:space="preserve">User vs Workspace Settings: </w:t>
-      </w:r>
-    </w:p>
-    <w:p>
-      <w:pPr>
-        <w:jc w:val="both"/>
-        <w:rPr>
-          <w:rFonts w:ascii="Carlito" w:hAnsi="Carlito" w:cs="Carlito"/>
-          <w:sz w:val="32"/>
-          <w:szCs w:val="32"/>
-        </w:rPr>
-      </w:pPr>
-      <w:r>
-        <w:rPr>
-          <w:rFonts w:ascii="Carlito" w:hAnsi="Carlito" w:cs="Carlito"/>
-          <w:sz w:val="32"/>
-          <w:szCs w:val="32"/>
-        </w:rPr>
         <w:t># Global User Settings or workspace (applicable to all projects) and User settings (applicable for only that user). And project level settings (</w:t>
       </w:r>
+      <w:proofErr w:type="spellStart"/>
       <w:r>
         <w:rPr>
           <w:rFonts w:ascii="Carlito" w:hAnsi="Carlito" w:cs="Carlito"/>
@@ -3154,24 +3639,47 @@
         </w:rPr>
         <w:t>settings.json</w:t>
       </w:r>
-      <w:r>
-        <w:rPr>
-          <w:rFonts w:ascii="Carlito" w:hAnsi="Carlito" w:cs="Carlito"/>
-          <w:sz w:val="32"/>
-          <w:szCs w:val="32"/>
-        </w:rPr>
-        <w:t xml:space="preserve"> file in </w:t>
-      </w:r>
-      <w:r>
-        <w:rPr>
-          <w:rFonts w:ascii="Carlito" w:hAnsi="Carlito" w:cs="Carlito"/>
-          <w:b/>
-          <w:bCs/>
-          <w:sz w:val="32"/>
-          <w:szCs w:val="32"/>
-        </w:rPr>
-        <w:t>.vscode</w:t>
-      </w:r>
+      <w:proofErr w:type="spellEnd"/>
+      <w:r>
+        <w:rPr>
+          <w:rFonts w:ascii="Carlito" w:hAnsi="Carlito" w:cs="Carlito"/>
+          <w:sz w:val="32"/>
+          <w:szCs w:val="32"/>
+        </w:rPr>
+        <w:t xml:space="preserve"> file </w:t>
+      </w:r>
+      <w:proofErr w:type="gramStart"/>
+      <w:r>
+        <w:rPr>
+          <w:rFonts w:ascii="Carlito" w:hAnsi="Carlito" w:cs="Carlito"/>
+          <w:sz w:val="32"/>
+          <w:szCs w:val="32"/>
+        </w:rPr>
+        <w:t xml:space="preserve">in </w:t>
+      </w:r>
+      <w:r>
+        <w:rPr>
+          <w:rFonts w:ascii="Carlito" w:hAnsi="Carlito" w:cs="Carlito"/>
+          <w:b/>
+          <w:bCs/>
+          <w:sz w:val="32"/>
+          <w:szCs w:val="32"/>
+        </w:rPr>
+        <w:t>.</w:t>
+      </w:r>
+      <w:proofErr w:type="spellStart"/>
+      <w:r>
+        <w:rPr>
+          <w:rFonts w:ascii="Carlito" w:hAnsi="Carlito" w:cs="Carlito"/>
+          <w:b/>
+          <w:bCs/>
+          <w:sz w:val="32"/>
+          <w:szCs w:val="32"/>
+        </w:rPr>
+        <w:t>vscode</w:t>
+      </w:r>
+      <w:proofErr w:type="spellEnd"/>
+      <w:proofErr w:type="gramEnd"/>
       <w:r>
         <w:rPr>
           <w:rFonts w:ascii="Carlito" w:hAnsi="Carlito" w:cs="Carlito"/>
@@ -3292,25 +3800,69 @@
           <w:sz w:val="32"/>
           <w:szCs w:val="32"/>
         </w:rPr>
-        <w:t xml:space="preserve"> launch.json</w:t>
-      </w:r>
-      <w:r>
-        <w:rPr>
-          <w:rFonts w:ascii="Carlito" w:hAnsi="Carlito" w:cs="Carlito"/>
-          <w:sz w:val="32"/>
-          <w:szCs w:val="32"/>
-        </w:rPr>
-        <w:t xml:space="preserve"> file will be added in the </w:t>
-      </w:r>
-      <w:r>
-        <w:rPr>
-          <w:rFonts w:ascii="Carlito" w:hAnsi="Carlito" w:cs="Carlito"/>
-          <w:b/>
-          <w:bCs/>
-          <w:sz w:val="32"/>
-          <w:szCs w:val="32"/>
-        </w:rPr>
-        <w:t>.vscode/</w:t>
+        <w:t xml:space="preserve"> </w:t>
+      </w:r>
+      <w:proofErr w:type="spellStart"/>
+      <w:r>
+        <w:rPr>
+          <w:rFonts w:ascii="Carlito" w:hAnsi="Carlito" w:cs="Carlito"/>
+          <w:b/>
+          <w:bCs/>
+          <w:sz w:val="32"/>
+          <w:szCs w:val="32"/>
+        </w:rPr>
+        <w:t>launch.json</w:t>
+      </w:r>
+      <w:proofErr w:type="spellEnd"/>
+      <w:r>
+        <w:rPr>
+          <w:rFonts w:ascii="Carlito" w:hAnsi="Carlito" w:cs="Carlito"/>
+          <w:sz w:val="32"/>
+          <w:szCs w:val="32"/>
+        </w:rPr>
+        <w:t xml:space="preserve"> file will be added in </w:t>
+      </w:r>
+      <w:proofErr w:type="gramStart"/>
+      <w:r>
+        <w:rPr>
+          <w:rFonts w:ascii="Carlito" w:hAnsi="Carlito" w:cs="Carlito"/>
+          <w:sz w:val="32"/>
+          <w:szCs w:val="32"/>
+        </w:rPr>
+        <w:t xml:space="preserve">the </w:t>
+      </w:r>
+      <w:r>
+        <w:rPr>
+          <w:rFonts w:ascii="Carlito" w:hAnsi="Carlito" w:cs="Carlito"/>
+          <w:b/>
+          <w:bCs/>
+          <w:sz w:val="32"/>
+          <w:szCs w:val="32"/>
+        </w:rPr>
+        <w:t>.</w:t>
+      </w:r>
+      <w:proofErr w:type="spellStart"/>
+      <w:r>
+        <w:rPr>
+          <w:rFonts w:ascii="Carlito" w:hAnsi="Carlito" w:cs="Carlito"/>
+          <w:b/>
+          <w:bCs/>
+          <w:sz w:val="32"/>
+          <w:szCs w:val="32"/>
+        </w:rPr>
+        <w:t>vscode</w:t>
+      </w:r>
+      <w:proofErr w:type="spellEnd"/>
+      <w:proofErr w:type="gramEnd"/>
+      <w:r>
+        <w:rPr>
+          <w:rFonts w:ascii="Carlito" w:hAnsi="Carlito" w:cs="Carlito"/>
+          <w:b/>
+          <w:bCs/>
+          <w:sz w:val="32"/>
+          <w:szCs w:val="32"/>
+        </w:rPr>
+        <w:t>/</w:t>
       </w:r>
       <w:r>
         <w:rPr>
@@ -3418,8 +3970,20 @@
           <w:sz w:val="32"/>
           <w:szCs w:val="32"/>
         </w:rPr>
-        <w:t xml:space="preserve"> launch.json</w:t>
-      </w:r>
+        <w:t xml:space="preserve"> </w:t>
+      </w:r>
+      <w:proofErr w:type="spellStart"/>
+      <w:r>
+        <w:rPr>
+          <w:rFonts w:ascii="Carlito" w:hAnsi="Carlito" w:cs="Carlito"/>
+          <w:b/>
+          <w:bCs/>
+          <w:sz w:val="32"/>
+          <w:szCs w:val="32"/>
+        </w:rPr>
+        <w:t>launch.json</w:t>
+      </w:r>
+      <w:proofErr w:type="spellEnd"/>
       <w:r>
         <w:rPr>
           <w:rFonts w:ascii="Carlito" w:hAnsi="Carlito" w:cs="Carlito"/>
@@ -3436,7 +4000,29 @@
           <w:sz w:val="32"/>
           <w:szCs w:val="32"/>
         </w:rPr>
-        <w:t xml:space="preserve"> flutter run --flavor staging --dart-define=API_URL=htt… </w:t>
+        <w:t xml:space="preserve"> flutter run --flavor staging --dart-define=API_URL=</w:t>
+      </w:r>
+      <w:proofErr w:type="spellStart"/>
+      <w:r>
+        <w:rPr>
+          <w:rFonts w:ascii="Carlito" w:hAnsi="Carlito" w:cs="Carlito"/>
+          <w:b/>
+          <w:bCs/>
+          <w:sz w:val="32"/>
+          <w:szCs w:val="32"/>
+        </w:rPr>
+        <w:t>htt</w:t>
+      </w:r>
+      <w:proofErr w:type="spellEnd"/>
+      <w:r>
+        <w:rPr>
+          <w:rFonts w:ascii="Carlito" w:hAnsi="Carlito" w:cs="Carlito"/>
+          <w:b/>
+          <w:bCs/>
+          <w:sz w:val="32"/>
+          <w:szCs w:val="32"/>
+        </w:rPr>
+        <w:t xml:space="preserve">… </w:t>
       </w:r>
       <w:r>
         <w:rPr>
@@ -3636,32 +4222,80 @@
           <w:sz w:val="32"/>
           <w:szCs w:val="32"/>
         </w:rPr>
+        <w:t xml:space="preserve">            "</w:t>
+      </w:r>
+      <w:proofErr w:type="spellStart"/>
+      <w:r>
+        <w:rPr>
+          <w:rFonts w:ascii="Carlito" w:hAnsi="Carlito" w:cs="Carlito"/>
+          <w:b/>
+          <w:bCs/>
+          <w:color w:val="D86DCB" w:themeColor="accent5" w:themeTint="99"/>
+          <w:sz w:val="32"/>
+          <w:szCs w:val="32"/>
+        </w:rPr>
+        <w:t>flutterMode</w:t>
+      </w:r>
+      <w:proofErr w:type="spellEnd"/>
+      <w:r>
+        <w:rPr>
+          <w:rFonts w:ascii="Carlito" w:hAnsi="Carlito" w:cs="Carlito"/>
+          <w:b/>
+          <w:bCs/>
+          <w:color w:val="D86DCB" w:themeColor="accent5" w:themeTint="99"/>
+          <w:sz w:val="32"/>
+          <w:szCs w:val="32"/>
+        </w:rPr>
+        <w:t>": "debug",</w:t>
+      </w:r>
+    </w:p>
+    <w:p>
+      <w:pPr>
+        <w:jc w:val="both"/>
+        <w:rPr>
+          <w:rFonts w:ascii="Carlito" w:hAnsi="Carlito" w:cs="Carlito"/>
+          <w:b/>
+          <w:bCs/>
+          <w:color w:val="D86DCB" w:themeColor="accent5" w:themeTint="99"/>
+          <w:sz w:val="32"/>
+          <w:szCs w:val="32"/>
+        </w:rPr>
+      </w:pPr>
+      <w:r>
+        <w:rPr>
+          <w:rFonts w:ascii="Carlito" w:hAnsi="Carlito" w:cs="Carlito"/>
+          <w:b/>
+          <w:bCs/>
+          <w:color w:val="D86DCB" w:themeColor="accent5" w:themeTint="99"/>
+          <w:sz w:val="32"/>
+          <w:szCs w:val="32"/>
+        </w:rPr>
         <w:lastRenderedPageBreak/>
-        <w:t xml:space="preserve">            "flutterMode": "debug",</w:t>
-      </w:r>
-    </w:p>
-    <w:p>
-      <w:pPr>
-        <w:jc w:val="both"/>
-        <w:rPr>
-          <w:rFonts w:ascii="Carlito" w:hAnsi="Carlito" w:cs="Carlito"/>
-          <w:b/>
-          <w:bCs/>
-          <w:color w:val="D86DCB" w:themeColor="accent5" w:themeTint="99"/>
-          <w:sz w:val="32"/>
-          <w:szCs w:val="32"/>
-        </w:rPr>
-      </w:pPr>
-      <w:r>
-        <w:rPr>
-          <w:rFonts w:ascii="Carlito" w:hAnsi="Carlito" w:cs="Carlito"/>
-          <w:b/>
-          <w:bCs/>
-          <w:color w:val="D86DCB" w:themeColor="accent5" w:themeTint="99"/>
-          <w:sz w:val="32"/>
-          <w:szCs w:val="32"/>
-        </w:rPr>
-        <w:t xml:space="preserve">            "args": [</w:t>
+        <w:t xml:space="preserve">            "</w:t>
+      </w:r>
+      <w:proofErr w:type="spellStart"/>
+      <w:r>
+        <w:rPr>
+          <w:rFonts w:ascii="Carlito" w:hAnsi="Carlito" w:cs="Carlito"/>
+          <w:b/>
+          <w:bCs/>
+          <w:color w:val="D86DCB" w:themeColor="accent5" w:themeTint="99"/>
+          <w:sz w:val="32"/>
+          <w:szCs w:val="32"/>
+        </w:rPr>
+        <w:t>args</w:t>
+      </w:r>
+      <w:proofErr w:type="spellEnd"/>
+      <w:r>
+        <w:rPr>
+          <w:rFonts w:ascii="Carlito" w:hAnsi="Carlito" w:cs="Carlito"/>
+          <w:b/>
+          <w:bCs/>
+          <w:color w:val="D86DCB" w:themeColor="accent5" w:themeTint="99"/>
+          <w:sz w:val="32"/>
+          <w:szCs w:val="32"/>
+        </w:rPr>
+        <w:t>": [</w:t>
       </w:r>
     </w:p>
     <w:p>
@@ -3947,15 +4581,27 @@
         </w:rPr>
         <w:t xml:space="preserve">in </w:t>
       </w:r>
-      <w:r>
-        <w:rPr>
-          <w:rFonts w:ascii="Carlito" w:hAnsi="Carlito" w:cs="Carlito"/>
-          <w:b/>
-          <w:bCs/>
-          <w:sz w:val="32"/>
-          <w:szCs w:val="32"/>
-        </w:rPr>
-        <w:t xml:space="preserve">flutterMode: </w:t>
+      <w:proofErr w:type="spellStart"/>
+      <w:r>
+        <w:rPr>
+          <w:rFonts w:ascii="Carlito" w:hAnsi="Carlito" w:cs="Carlito"/>
+          <w:b/>
+          <w:bCs/>
+          <w:sz w:val="32"/>
+          <w:szCs w:val="32"/>
+        </w:rPr>
+        <w:t>flutterMode</w:t>
+      </w:r>
+      <w:proofErr w:type="spellEnd"/>
+      <w:r>
+        <w:rPr>
+          <w:rFonts w:ascii="Carlito" w:hAnsi="Carlito" w:cs="Carlito"/>
+          <w:b/>
+          <w:bCs/>
+          <w:sz w:val="32"/>
+          <w:szCs w:val="32"/>
+        </w:rPr>
+        <w:t xml:space="preserve">: </w:t>
       </w:r>
       <w:r>
         <w:rPr>
@@ -4066,7 +4712,51 @@
           <w:sz w:val="32"/>
           <w:szCs w:val="32"/>
         </w:rPr>
-        <w:t>"cwd": "project_name",</w:t>
+        <w:t>"</w:t>
+      </w:r>
+      <w:proofErr w:type="spellStart"/>
+      <w:r>
+        <w:rPr>
+          <w:rFonts w:ascii="Carlito" w:hAnsi="Carlito" w:cs="Carlito"/>
+          <w:b/>
+          <w:bCs/>
+          <w:sz w:val="32"/>
+          <w:szCs w:val="32"/>
+        </w:rPr>
+        <w:t>cwd</w:t>
+      </w:r>
+      <w:proofErr w:type="spellEnd"/>
+      <w:r>
+        <w:rPr>
+          <w:rFonts w:ascii="Carlito" w:hAnsi="Carlito" w:cs="Carlito"/>
+          <w:b/>
+          <w:bCs/>
+          <w:sz w:val="32"/>
+          <w:szCs w:val="32"/>
+        </w:rPr>
+        <w:t>": "</w:t>
+      </w:r>
+      <w:proofErr w:type="spellStart"/>
+      <w:r>
+        <w:rPr>
+          <w:rFonts w:ascii="Carlito" w:hAnsi="Carlito" w:cs="Carlito"/>
+          <w:b/>
+          <w:bCs/>
+          <w:sz w:val="32"/>
+          <w:szCs w:val="32"/>
+        </w:rPr>
+        <w:t>project_name</w:t>
+      </w:r>
+      <w:proofErr w:type="spellEnd"/>
+      <w:r>
+        <w:rPr>
+          <w:rFonts w:ascii="Carlito" w:hAnsi="Carlito" w:cs="Carlito"/>
+          <w:b/>
+          <w:bCs/>
+          <w:sz w:val="32"/>
+          <w:szCs w:val="32"/>
+        </w:rPr>
+        <w:t>",</w:t>
       </w:r>
     </w:p>
     <w:p>
@@ -4207,6 +4897,7 @@
         </w:rPr>
         <w:t xml:space="preserve"> Select </w:t>
       </w:r>
+      <w:proofErr w:type="spellStart"/>
       <w:r>
         <w:rPr>
           <w:rFonts w:ascii="Carlito" w:hAnsi="Carlito" w:cs="Carlito"/>
@@ -4217,6 +4908,7 @@
         </w:rPr>
         <w:t>afterDelay</w:t>
       </w:r>
+      <w:proofErr w:type="spellEnd"/>
       <w:r>
         <w:rPr>
           <w:rFonts w:ascii="Carlito" w:hAnsi="Carlito" w:cs="Carlito"/>
@@ -4251,8 +4943,42 @@
           <w:sz w:val="32"/>
           <w:szCs w:val="32"/>
         </w:rPr>
-        <w:t>.vscode/settings.json</w:t>
-      </w:r>
+        <w:t>.</w:t>
+      </w:r>
+      <w:proofErr w:type="spellStart"/>
+      <w:r>
+        <w:rPr>
+          <w:rFonts w:ascii="Carlito" w:hAnsi="Carlito" w:cs="Carlito"/>
+          <w:b/>
+          <w:bCs/>
+          <w:sz w:val="32"/>
+          <w:szCs w:val="32"/>
+        </w:rPr>
+        <w:t>vscode</w:t>
+      </w:r>
+      <w:proofErr w:type="spellEnd"/>
+      <w:r>
+        <w:rPr>
+          <w:rFonts w:ascii="Carlito" w:hAnsi="Carlito" w:cs="Carlito"/>
+          <w:b/>
+          <w:bCs/>
+          <w:sz w:val="32"/>
+          <w:szCs w:val="32"/>
+        </w:rPr>
+        <w:t>/</w:t>
+      </w:r>
+      <w:proofErr w:type="spellStart"/>
+      <w:r>
+        <w:rPr>
+          <w:rFonts w:ascii="Carlito" w:hAnsi="Carlito" w:cs="Carlito"/>
+          <w:b/>
+          <w:bCs/>
+          <w:sz w:val="32"/>
+          <w:szCs w:val="32"/>
+        </w:rPr>
+        <w:t>settings.json</w:t>
+      </w:r>
+      <w:proofErr w:type="spellEnd"/>
       <w:r>
         <w:rPr>
           <w:rFonts w:ascii="Carlito" w:hAnsi="Carlito" w:cs="Carlito"/>
@@ -4307,31 +5033,107 @@
           <w:sz w:val="32"/>
           <w:szCs w:val="32"/>
         </w:rPr>
-        <w:t xml:space="preserve">    "files.autoSave": "afterDelay",</w:t>
-      </w:r>
-    </w:p>
-    <w:p>
-      <w:pPr>
-        <w:jc w:val="both"/>
-        <w:rPr>
-          <w:rFonts w:ascii="Carlito" w:hAnsi="Carlito" w:cs="Carlito"/>
-          <w:b/>
-          <w:bCs/>
-          <w:color w:val="D86DCB" w:themeColor="accent5" w:themeTint="99"/>
-          <w:sz w:val="32"/>
-          <w:szCs w:val="32"/>
-        </w:rPr>
-      </w:pPr>
-      <w:r>
-        <w:rPr>
-          <w:rFonts w:ascii="Carlito" w:hAnsi="Carlito" w:cs="Carlito"/>
-          <w:b/>
-          <w:bCs/>
-          <w:color w:val="D86DCB" w:themeColor="accent5" w:themeTint="99"/>
-          <w:sz w:val="32"/>
-          <w:szCs w:val="32"/>
-        </w:rPr>
-        <w:t xml:space="preserve">    "files.autoSaveDelay": 1000</w:t>
+        <w:t xml:space="preserve">    "</w:t>
+      </w:r>
+      <w:proofErr w:type="spellStart"/>
+      <w:proofErr w:type="gramStart"/>
+      <w:r>
+        <w:rPr>
+          <w:rFonts w:ascii="Carlito" w:hAnsi="Carlito" w:cs="Carlito"/>
+          <w:b/>
+          <w:bCs/>
+          <w:color w:val="D86DCB" w:themeColor="accent5" w:themeTint="99"/>
+          <w:sz w:val="32"/>
+          <w:szCs w:val="32"/>
+        </w:rPr>
+        <w:t>files.autoSave</w:t>
+      </w:r>
+      <w:proofErr w:type="spellEnd"/>
+      <w:proofErr w:type="gramEnd"/>
+      <w:r>
+        <w:rPr>
+          <w:rFonts w:ascii="Carlito" w:hAnsi="Carlito" w:cs="Carlito"/>
+          <w:b/>
+          <w:bCs/>
+          <w:color w:val="D86DCB" w:themeColor="accent5" w:themeTint="99"/>
+          <w:sz w:val="32"/>
+          <w:szCs w:val="32"/>
+        </w:rPr>
+        <w:t>": "</w:t>
+      </w:r>
+      <w:proofErr w:type="spellStart"/>
+      <w:r>
+        <w:rPr>
+          <w:rFonts w:ascii="Carlito" w:hAnsi="Carlito" w:cs="Carlito"/>
+          <w:b/>
+          <w:bCs/>
+          <w:color w:val="D86DCB" w:themeColor="accent5" w:themeTint="99"/>
+          <w:sz w:val="32"/>
+          <w:szCs w:val="32"/>
+        </w:rPr>
+        <w:t>afterDelay</w:t>
+      </w:r>
+      <w:proofErr w:type="spellEnd"/>
+      <w:r>
+        <w:rPr>
+          <w:rFonts w:ascii="Carlito" w:hAnsi="Carlito" w:cs="Carlito"/>
+          <w:b/>
+          <w:bCs/>
+          <w:color w:val="D86DCB" w:themeColor="accent5" w:themeTint="99"/>
+          <w:sz w:val="32"/>
+          <w:szCs w:val="32"/>
+        </w:rPr>
+        <w:t>",</w:t>
+      </w:r>
+    </w:p>
+    <w:p>
+      <w:pPr>
+        <w:jc w:val="both"/>
+        <w:rPr>
+          <w:rFonts w:ascii="Carlito" w:hAnsi="Carlito" w:cs="Carlito"/>
+          <w:b/>
+          <w:bCs/>
+          <w:color w:val="D86DCB" w:themeColor="accent5" w:themeTint="99"/>
+          <w:sz w:val="32"/>
+          <w:szCs w:val="32"/>
+        </w:rPr>
+      </w:pPr>
+      <w:r>
+        <w:rPr>
+          <w:rFonts w:ascii="Carlito" w:hAnsi="Carlito" w:cs="Carlito"/>
+          <w:b/>
+          <w:bCs/>
+          <w:color w:val="D86DCB" w:themeColor="accent5" w:themeTint="99"/>
+          <w:sz w:val="32"/>
+          <w:szCs w:val="32"/>
+        </w:rPr>
+        <w:t xml:space="preserve">    "</w:t>
+      </w:r>
+      <w:proofErr w:type="spellStart"/>
+      <w:proofErr w:type="gramStart"/>
+      <w:r>
+        <w:rPr>
+          <w:rFonts w:ascii="Carlito" w:hAnsi="Carlito" w:cs="Carlito"/>
+          <w:b/>
+          <w:bCs/>
+          <w:color w:val="D86DCB" w:themeColor="accent5" w:themeTint="99"/>
+          <w:sz w:val="32"/>
+          <w:szCs w:val="32"/>
+        </w:rPr>
+        <w:t>files.autoSaveDelay</w:t>
+      </w:r>
+      <w:proofErr w:type="spellEnd"/>
+      <w:proofErr w:type="gramEnd"/>
+      <w:r>
+        <w:rPr>
+          <w:rFonts w:ascii="Carlito" w:hAnsi="Carlito" w:cs="Carlito"/>
+          <w:b/>
+          <w:bCs/>
+          <w:color w:val="D86DCB" w:themeColor="accent5" w:themeTint="99"/>
+          <w:sz w:val="32"/>
+          <w:szCs w:val="32"/>
+        </w:rPr>
+        <w:t>": 1000</w:t>
       </w:r>
     </w:p>
     <w:p>
@@ -4495,6 +5297,7 @@
         </w:rPr>
         <w:t xml:space="preserve"># Use </w:t>
       </w:r>
+      <w:proofErr w:type="spellStart"/>
       <w:r>
         <w:rPr>
           <w:rFonts w:ascii="Carlito" w:hAnsi="Carlito" w:cs="Carlito"/>
@@ -4505,6 +5308,7 @@
         </w:rPr>
         <w:t>scrcpy</w:t>
       </w:r>
+      <w:proofErr w:type="spellEnd"/>
       <w:r>
         <w:rPr>
           <w:rFonts w:ascii="Carlito" w:hAnsi="Carlito" w:cs="Carlito"/>
@@ -4558,6 +5362,7 @@
           <w:szCs w:val="32"/>
         </w:rPr>
       </w:pPr>
+      <w:proofErr w:type="spellStart"/>
       <w:r>
         <w:rPr>
           <w:rFonts w:ascii="Carlito" w:hAnsi="Carlito" w:cs="Carlito"/>
@@ -4567,8 +5372,33 @@
           <w:sz w:val="32"/>
           <w:szCs w:val="32"/>
         </w:rPr>
-        <w:t>winget install --exact Genymobile.scrcpy</w:t>
-      </w:r>
+        <w:t>winget</w:t>
+      </w:r>
+      <w:proofErr w:type="spellEnd"/>
+      <w:r>
+        <w:rPr>
+          <w:rFonts w:ascii="Carlito" w:hAnsi="Carlito" w:cs="Carlito"/>
+          <w:b/>
+          <w:bCs/>
+          <w:color w:val="60CAF3" w:themeColor="accent4" w:themeTint="99"/>
+          <w:sz w:val="32"/>
+          <w:szCs w:val="32"/>
+        </w:rPr>
+        <w:t xml:space="preserve"> install --exact </w:t>
+      </w:r>
+      <w:proofErr w:type="spellStart"/>
+      <w:r>
+        <w:rPr>
+          <w:rFonts w:ascii="Carlito" w:hAnsi="Carlito" w:cs="Carlito"/>
+          <w:b/>
+          <w:bCs/>
+          <w:color w:val="60CAF3" w:themeColor="accent4" w:themeTint="99"/>
+          <w:sz w:val="32"/>
+          <w:szCs w:val="32"/>
+        </w:rPr>
+        <w:t>Genymobile.scrcpy</w:t>
+      </w:r>
+      <w:proofErr w:type="spellEnd"/>
     </w:p>
     <w:p>
       <w:pPr>
@@ -4600,6 +5430,7 @@
           <w:szCs w:val="32"/>
         </w:rPr>
       </w:pPr>
+      <w:proofErr w:type="spellStart"/>
       <w:r>
         <w:rPr>
           <w:rFonts w:ascii="Carlito" w:hAnsi="Carlito" w:cs="Carlito"/>
@@ -4611,6 +5442,7 @@
         </w:rPr>
         <w:t>scrcpy</w:t>
       </w:r>
+      <w:proofErr w:type="spellEnd"/>
     </w:p>
     <w:p>
       <w:pPr>
@@ -4642,6 +5474,7 @@
           <w:szCs w:val="32"/>
         </w:rPr>
       </w:pPr>
+      <w:proofErr w:type="spellStart"/>
       <w:r>
         <w:rPr>
           <w:rFonts w:ascii="Carlito" w:hAnsi="Carlito" w:cs="Carlito"/>
@@ -4652,7 +5485,19 @@
           <w:szCs w:val="32"/>
         </w:rPr>
         <w:lastRenderedPageBreak/>
-        <w:t>scrcpy --stay-awake</w:t>
+        <w:t>scrcpy</w:t>
+      </w:r>
+      <w:proofErr w:type="spellEnd"/>
+      <w:r>
+        <w:rPr>
+          <w:rFonts w:ascii="Carlito" w:hAnsi="Carlito" w:cs="Carlito"/>
+          <w:b/>
+          <w:bCs/>
+          <w:color w:val="60CAF3" w:themeColor="accent4" w:themeTint="99"/>
+          <w:sz w:val="32"/>
+          <w:szCs w:val="32"/>
+        </w:rPr>
+        <w:t xml:space="preserve"> --stay-awake</w:t>
       </w:r>
     </w:p>
     <w:p>
@@ -4716,15 +5561,27 @@
         </w:rPr>
         <w:t xml:space="preserve"> Or go to the extension section of VS code and install the </w:t>
       </w:r>
-      <w:r>
-        <w:rPr>
-          <w:rFonts w:ascii="Carlito" w:hAnsi="Carlito" w:cs="Carlito"/>
-          <w:b/>
-          <w:bCs/>
-          <w:sz w:val="32"/>
-          <w:szCs w:val="32"/>
-        </w:rPr>
-        <w:t xml:space="preserve">scrcpy </w:t>
+      <w:proofErr w:type="spellStart"/>
+      <w:r>
+        <w:rPr>
+          <w:rFonts w:ascii="Carlito" w:hAnsi="Carlito" w:cs="Carlito"/>
+          <w:b/>
+          <w:bCs/>
+          <w:sz w:val="32"/>
+          <w:szCs w:val="32"/>
+        </w:rPr>
+        <w:t>scrcpy</w:t>
+      </w:r>
+      <w:proofErr w:type="spellEnd"/>
+      <w:r>
+        <w:rPr>
+          <w:rFonts w:ascii="Carlito" w:hAnsi="Carlito" w:cs="Carlito"/>
+          <w:b/>
+          <w:bCs/>
+          <w:sz w:val="32"/>
+          <w:szCs w:val="32"/>
+        </w:rPr>
+        <w:t xml:space="preserve"> </w:t>
       </w:r>
       <w:r>
         <w:rPr>
@@ -4794,7 +5651,29 @@
           <w:sz w:val="32"/>
           <w:szCs w:val="32"/>
         </w:rPr>
-        <w:t xml:space="preserve"> &gt;scrcpy:</w:t>
+        <w:t xml:space="preserve"> &gt;</w:t>
+      </w:r>
+      <w:proofErr w:type="spellStart"/>
+      <w:r>
+        <w:rPr>
+          <w:rFonts w:ascii="Carlito" w:hAnsi="Carlito" w:cs="Carlito"/>
+          <w:b/>
+          <w:bCs/>
+          <w:sz w:val="32"/>
+          <w:szCs w:val="32"/>
+        </w:rPr>
+        <w:t>scrcpy</w:t>
+      </w:r>
+      <w:proofErr w:type="spellEnd"/>
+      <w:r>
+        <w:rPr>
+          <w:rFonts w:ascii="Carlito" w:hAnsi="Carlito" w:cs="Carlito"/>
+          <w:b/>
+          <w:bCs/>
+          <w:sz w:val="32"/>
+          <w:szCs w:val="32"/>
+        </w:rPr>
+        <w:t>:</w:t>
       </w:r>
       <w:r>
         <w:rPr>
@@ -4820,7 +5699,27 @@
           <w:sz w:val="32"/>
           <w:szCs w:val="32"/>
         </w:rPr>
-        <w:t># It will mirror our physical device without needing to open a external terminal (it saves up ram, tiny bit)</w:t>
+        <w:t xml:space="preserve"># It will mirror our physical device without needing to open </w:t>
+      </w:r>
+      <w:proofErr w:type="spellStart"/>
+      <w:proofErr w:type="gramStart"/>
+      <w:r>
+        <w:rPr>
+          <w:rFonts w:ascii="Carlito" w:hAnsi="Carlito" w:cs="Carlito"/>
+          <w:sz w:val="32"/>
+          <w:szCs w:val="32"/>
+        </w:rPr>
+        <w:t>a</w:t>
+      </w:r>
+      <w:proofErr w:type="spellEnd"/>
+      <w:proofErr w:type="gramEnd"/>
+      <w:r>
+        <w:rPr>
+          <w:rFonts w:ascii="Carlito" w:hAnsi="Carlito" w:cs="Carlito"/>
+          <w:sz w:val="32"/>
+          <w:szCs w:val="32"/>
+        </w:rPr>
+        <w:t xml:space="preserve"> external terminal (it saves up ram, tiny bit)</w:t>
       </w:r>
     </w:p>
     <w:p>
@@ -4908,6 +5807,7 @@
         </w:rPr>
         <w:t xml:space="preserve"> Create any device profile (Pixel 8, Nexus, custom screen dimensions) directly from our terminal using the standalone Android Command Line Tools (</w:t>
       </w:r>
+      <w:proofErr w:type="spellStart"/>
       <w:r>
         <w:rPr>
           <w:rFonts w:ascii="Carlito" w:hAnsi="Carlito" w:cs="Carlito"/>
@@ -4918,6 +5818,7 @@
         </w:rPr>
         <w:t>avdmanager</w:t>
       </w:r>
+      <w:proofErr w:type="spellEnd"/>
       <w:r>
         <w:rPr>
           <w:rFonts w:ascii="Carlito" w:hAnsi="Carlito" w:cs="Carlito"/>
@@ -4965,6 +5866,7 @@
           <w:szCs w:val="32"/>
         </w:rPr>
       </w:pPr>
+      <w:proofErr w:type="spellStart"/>
       <w:r>
         <w:rPr>
           <w:rFonts w:ascii="Carlito" w:hAnsi="Carlito" w:cs="Carlito"/>
@@ -4974,12 +5876,10 @@
           <w:sz w:val="32"/>
           <w:szCs w:val="32"/>
         </w:rPr>
-        <w:t>sdkmanager \</w:t>
-      </w:r>
-    </w:p>
-    <w:p>
-      <w:pPr>
-        <w:jc w:val="both"/>
+        <w:t>sdkmanager</w:t>
+      </w:r>
+      <w:proofErr w:type="spellEnd"/>
+      <w:r>
         <w:rPr>
           <w:rFonts w:ascii="Carlito" w:hAnsi="Carlito" w:cs="Carlito"/>
           <w:b/>
@@ -4988,8 +5888,12 @@
           <w:sz w:val="32"/>
           <w:szCs w:val="32"/>
         </w:rPr>
-      </w:pPr>
-      <w:r>
+        <w:t xml:space="preserve"> \</w:t>
+      </w:r>
+    </w:p>
+    <w:p>
+      <w:pPr>
+        <w:jc w:val="both"/>
         <w:rPr>
           <w:rFonts w:ascii="Carlito" w:hAnsi="Carlito" w:cs="Carlito"/>
           <w:b/>
@@ -4998,7 +5902,41 @@
           <w:sz w:val="32"/>
           <w:szCs w:val="32"/>
         </w:rPr>
-        <w:t>"system-images;android-34;google_apis_playstore;x86_64" "platforms;android-34" "emulator"</w:t>
+      </w:pPr>
+      <w:r>
+        <w:rPr>
+          <w:rFonts w:ascii="Carlito" w:hAnsi="Carlito" w:cs="Carlito"/>
+          <w:b/>
+          <w:bCs/>
+          <w:color w:val="60CAF3" w:themeColor="accent4" w:themeTint="99"/>
+          <w:sz w:val="32"/>
+          <w:szCs w:val="32"/>
+        </w:rPr>
+        <w:t>"system-</w:t>
+      </w:r>
+      <w:proofErr w:type="gramStart"/>
+      <w:r>
+        <w:rPr>
+          <w:rFonts w:ascii="Carlito" w:hAnsi="Carlito" w:cs="Carlito"/>
+          <w:b/>
+          <w:bCs/>
+          <w:color w:val="60CAF3" w:themeColor="accent4" w:themeTint="99"/>
+          <w:sz w:val="32"/>
+          <w:szCs w:val="32"/>
+        </w:rPr>
+        <w:t>images;android</w:t>
+      </w:r>
+      <w:proofErr w:type="gramEnd"/>
+      <w:r>
+        <w:rPr>
+          <w:rFonts w:ascii="Carlito" w:hAnsi="Carlito" w:cs="Carlito"/>
+          <w:b/>
+          <w:bCs/>
+          <w:color w:val="60CAF3" w:themeColor="accent4" w:themeTint="99"/>
+          <w:sz w:val="32"/>
+          <w:szCs w:val="32"/>
+        </w:rPr>
+        <w:t>-34;google_apis_playstore;x86_64" "platforms;android-34" "emulator"</w:t>
       </w:r>
     </w:p>
     <w:p>
@@ -5018,6 +5956,7 @@
         </w:rPr>
         <w:t xml:space="preserve"># Create the Device. Use </w:t>
       </w:r>
+      <w:proofErr w:type="spellStart"/>
       <w:r>
         <w:rPr>
           <w:rFonts w:ascii="Carlito" w:hAnsi="Carlito" w:cs="Carlito"/>
@@ -5028,6 +5967,7 @@
         </w:rPr>
         <w:t>advmanager</w:t>
       </w:r>
+      <w:proofErr w:type="spellEnd"/>
       <w:r>
         <w:rPr>
           <w:rFonts w:ascii="Carlito" w:hAnsi="Carlito" w:cs="Carlito"/>
@@ -5049,6 +5989,7 @@
           <w:szCs w:val="32"/>
         </w:rPr>
       </w:pPr>
+      <w:proofErr w:type="spellStart"/>
       <w:r>
         <w:rPr>
           <w:rFonts w:ascii="Carlito" w:hAnsi="Carlito" w:cs="Carlito"/>
@@ -5058,7 +5999,67 @@
           <w:sz w:val="32"/>
           <w:szCs w:val="32"/>
         </w:rPr>
-        <w:t>avdmanager create avd --name "Pixel_7_Pro" --package "system-images;android-34;google_apis_playstore;x86_64" --device "pixel_7_pro"</w:t>
+        <w:t>avdmanager</w:t>
+      </w:r>
+      <w:proofErr w:type="spellEnd"/>
+      <w:r>
+        <w:rPr>
+          <w:rFonts w:ascii="Carlito" w:hAnsi="Carlito" w:cs="Carlito"/>
+          <w:b/>
+          <w:bCs/>
+          <w:color w:val="60CAF3" w:themeColor="accent4" w:themeTint="99"/>
+          <w:sz w:val="32"/>
+          <w:szCs w:val="32"/>
+        </w:rPr>
+        <w:t xml:space="preserve"> create </w:t>
+      </w:r>
+      <w:proofErr w:type="spellStart"/>
+      <w:r>
+        <w:rPr>
+          <w:rFonts w:ascii="Carlito" w:hAnsi="Carlito" w:cs="Carlito"/>
+          <w:b/>
+          <w:bCs/>
+          <w:color w:val="60CAF3" w:themeColor="accent4" w:themeTint="99"/>
+          <w:sz w:val="32"/>
+          <w:szCs w:val="32"/>
+        </w:rPr>
+        <w:t>avd</w:t>
+      </w:r>
+      <w:proofErr w:type="spellEnd"/>
+      <w:r>
+        <w:rPr>
+          <w:rFonts w:ascii="Carlito" w:hAnsi="Carlito" w:cs="Carlito"/>
+          <w:b/>
+          <w:bCs/>
+          <w:color w:val="60CAF3" w:themeColor="accent4" w:themeTint="99"/>
+          <w:sz w:val="32"/>
+          <w:szCs w:val="32"/>
+        </w:rPr>
+        <w:t xml:space="preserve"> --name "Pixel_7_Pro" --package "system-</w:t>
+      </w:r>
+      <w:proofErr w:type="gramStart"/>
+      <w:r>
+        <w:rPr>
+          <w:rFonts w:ascii="Carlito" w:hAnsi="Carlito" w:cs="Carlito"/>
+          <w:b/>
+          <w:bCs/>
+          <w:color w:val="60CAF3" w:themeColor="accent4" w:themeTint="99"/>
+          <w:sz w:val="32"/>
+          <w:szCs w:val="32"/>
+        </w:rPr>
+        <w:t>images;android</w:t>
+      </w:r>
+      <w:proofErr w:type="gramEnd"/>
+      <w:r>
+        <w:rPr>
+          <w:rFonts w:ascii="Carlito" w:hAnsi="Carlito" w:cs="Carlito"/>
+          <w:b/>
+          <w:bCs/>
+          <w:color w:val="60CAF3" w:themeColor="accent4" w:themeTint="99"/>
+          <w:sz w:val="32"/>
+          <w:szCs w:val="32"/>
+        </w:rPr>
+        <w:t>-34;google_apis_playstore;x86_64" --device "pixel_7_pro"</w:t>
       </w:r>
     </w:p>
     <w:p>
@@ -5137,7 +6138,31 @@
           <w:sz w:val="32"/>
           <w:szCs w:val="32"/>
         </w:rPr>
-        <w:t>emulator -avd Pixel_7_Pro</w:t>
+        <w:t>emulator -</w:t>
+      </w:r>
+      <w:proofErr w:type="spellStart"/>
+      <w:r>
+        <w:rPr>
+          <w:rFonts w:ascii="Carlito" w:hAnsi="Carlito" w:cs="Carlito"/>
+          <w:b/>
+          <w:bCs/>
+          <w:color w:val="60CAF3" w:themeColor="accent4" w:themeTint="99"/>
+          <w:sz w:val="32"/>
+          <w:szCs w:val="32"/>
+        </w:rPr>
+        <w:t>avd</w:t>
+      </w:r>
+      <w:proofErr w:type="spellEnd"/>
+      <w:r>
+        <w:rPr>
+          <w:rFonts w:ascii="Carlito" w:hAnsi="Carlito" w:cs="Carlito"/>
+          <w:b/>
+          <w:bCs/>
+          <w:color w:val="60CAF3" w:themeColor="accent4" w:themeTint="99"/>
+          <w:sz w:val="32"/>
+          <w:szCs w:val="32"/>
+        </w:rPr>
+        <w:t xml:space="preserve"> Pixel_7_Pro</w:t>
       </w:r>
     </w:p>
     <w:p>
@@ -5197,6 +6222,7 @@
           <w14:ligatures w14:val="none"/>
         </w:rPr>
       </w:pPr>
+      <w:proofErr w:type="spellStart"/>
       <w:r>
         <w:rPr>
           <w:rFonts w:ascii="Carlito" w:hAnsi="Carlito" w:cs="Carlito"/>
@@ -5206,8 +6232,33 @@
           <w:sz w:val="32"/>
           <w:szCs w:val="32"/>
         </w:rPr>
-        <w:t>avdmanager list avd</w:t>
-      </w:r>
+        <w:t>avdmanager</w:t>
+      </w:r>
+      <w:proofErr w:type="spellEnd"/>
+      <w:r>
+        <w:rPr>
+          <w:rFonts w:ascii="Carlito" w:hAnsi="Carlito" w:cs="Carlito"/>
+          <w:b/>
+          <w:bCs/>
+          <w:color w:val="60CAF3" w:themeColor="accent4" w:themeTint="99"/>
+          <w:sz w:val="32"/>
+          <w:szCs w:val="32"/>
+        </w:rPr>
+        <w:t xml:space="preserve"> list </w:t>
+      </w:r>
+      <w:proofErr w:type="spellStart"/>
+      <w:r>
+        <w:rPr>
+          <w:rFonts w:ascii="Carlito" w:hAnsi="Carlito" w:cs="Carlito"/>
+          <w:b/>
+          <w:bCs/>
+          <w:color w:val="60CAF3" w:themeColor="accent4" w:themeTint="99"/>
+          <w:sz w:val="32"/>
+          <w:szCs w:val="32"/>
+        </w:rPr>
+        <w:t>avd</w:t>
+      </w:r>
+      <w:proofErr w:type="spellEnd"/>
     </w:p>
     <w:p>
       <w:pPr>
@@ -5234,15 +6285,27 @@
         </w:rPr>
         <w:t xml:space="preserve">Delete the device using </w:t>
       </w:r>
-      <w:r>
-        <w:rPr>
-          <w:rFonts w:ascii="Carlito" w:hAnsi="Carlito" w:cs="Carlito"/>
-          <w:b/>
-          <w:bCs/>
-          <w:sz w:val="32"/>
-          <w:szCs w:val="32"/>
-        </w:rPr>
-        <w:t xml:space="preserve">avdmanager </w:t>
+      <w:proofErr w:type="spellStart"/>
+      <w:r>
+        <w:rPr>
+          <w:rFonts w:ascii="Carlito" w:hAnsi="Carlito" w:cs="Carlito"/>
+          <w:b/>
+          <w:bCs/>
+          <w:sz w:val="32"/>
+          <w:szCs w:val="32"/>
+        </w:rPr>
+        <w:t>avdmanager</w:t>
+      </w:r>
+      <w:proofErr w:type="spellEnd"/>
+      <w:r>
+        <w:rPr>
+          <w:rFonts w:ascii="Carlito" w:hAnsi="Carlito" w:cs="Carlito"/>
+          <w:b/>
+          <w:bCs/>
+          <w:sz w:val="32"/>
+          <w:szCs w:val="32"/>
+        </w:rPr>
+        <w:t xml:space="preserve"> </w:t>
       </w:r>
       <w:r>
         <w:rPr>
@@ -5265,6 +6328,7 @@
           <w:szCs w:val="32"/>
         </w:rPr>
       </w:pPr>
+      <w:proofErr w:type="spellStart"/>
       <w:r>
         <w:rPr>
           <w:rFonts w:ascii="Carlito" w:hAnsi="Carlito" w:cs="Carlito"/>
@@ -5274,7 +6338,43 @@
           <w:sz w:val="32"/>
           <w:szCs w:val="32"/>
         </w:rPr>
-        <w:t>avdmanager delete avd -n Pixel_8_Api34</w:t>
+        <w:t>avdmanager</w:t>
+      </w:r>
+      <w:proofErr w:type="spellEnd"/>
+      <w:r>
+        <w:rPr>
+          <w:rFonts w:ascii="Carlito" w:hAnsi="Carlito" w:cs="Carlito"/>
+          <w:b/>
+          <w:bCs/>
+          <w:color w:val="60CAF3" w:themeColor="accent4" w:themeTint="99"/>
+          <w:sz w:val="32"/>
+          <w:szCs w:val="32"/>
+        </w:rPr>
+        <w:t xml:space="preserve"> delete </w:t>
+      </w:r>
+      <w:proofErr w:type="spellStart"/>
+      <w:r>
+        <w:rPr>
+          <w:rFonts w:ascii="Carlito" w:hAnsi="Carlito" w:cs="Carlito"/>
+          <w:b/>
+          <w:bCs/>
+          <w:color w:val="60CAF3" w:themeColor="accent4" w:themeTint="99"/>
+          <w:sz w:val="32"/>
+          <w:szCs w:val="32"/>
+        </w:rPr>
+        <w:t>avd</w:t>
+      </w:r>
+      <w:proofErr w:type="spellEnd"/>
+      <w:r>
+        <w:rPr>
+          <w:rFonts w:ascii="Carlito" w:hAnsi="Carlito" w:cs="Carlito"/>
+          <w:b/>
+          <w:bCs/>
+          <w:color w:val="60CAF3" w:themeColor="accent4" w:themeTint="99"/>
+          <w:sz w:val="32"/>
+          <w:szCs w:val="32"/>
+        </w:rPr>
+        <w:t xml:space="preserve"> -n Pixel_8_Api34</w:t>
       </w:r>
     </w:p>
     <w:p>
@@ -5307,6 +6407,7 @@
           <w:szCs w:val="32"/>
         </w:rPr>
       </w:pPr>
+      <w:proofErr w:type="spellStart"/>
       <w:r>
         <w:rPr>
           <w:rFonts w:ascii="Carlito" w:hAnsi="Carlito" w:cs="Carlito"/>
@@ -5316,7 +6417,19 @@
           <w:sz w:val="32"/>
           <w:szCs w:val="32"/>
         </w:rPr>
-        <w:t>sdkmanager --list</w:t>
+        <w:t>sdkmanager</w:t>
+      </w:r>
+      <w:proofErr w:type="spellEnd"/>
+      <w:r>
+        <w:rPr>
+          <w:rFonts w:ascii="Carlito" w:hAnsi="Carlito" w:cs="Carlito"/>
+          <w:b/>
+          <w:bCs/>
+          <w:color w:val="60CAF3" w:themeColor="accent4" w:themeTint="99"/>
+          <w:sz w:val="32"/>
+          <w:szCs w:val="32"/>
+        </w:rPr>
+        <w:t xml:space="preserve"> --list</w:t>
       </w:r>
     </w:p>
     <w:p>
@@ -5367,6 +6480,7 @@
           <w:szCs w:val="32"/>
         </w:rPr>
       </w:pPr>
+      <w:proofErr w:type="spellStart"/>
       <w:r>
         <w:rPr>
           <w:rFonts w:ascii="Carlito" w:hAnsi="Carlito" w:cs="Carlito"/>
@@ -5376,7 +6490,43 @@
           <w:sz w:val="32"/>
           <w:szCs w:val="32"/>
         </w:rPr>
-        <w:t>sdkmanager --uninstall "system-images;android-34;google_apis;x86_64"</w:t>
+        <w:t>sdkmanager</w:t>
+      </w:r>
+      <w:proofErr w:type="spellEnd"/>
+      <w:r>
+        <w:rPr>
+          <w:rFonts w:ascii="Carlito" w:hAnsi="Carlito" w:cs="Carlito"/>
+          <w:b/>
+          <w:bCs/>
+          <w:color w:val="60CAF3" w:themeColor="accent4" w:themeTint="99"/>
+          <w:sz w:val="32"/>
+          <w:szCs w:val="32"/>
+        </w:rPr>
+        <w:t xml:space="preserve"> --uninstall "system-</w:t>
+      </w:r>
+      <w:proofErr w:type="gramStart"/>
+      <w:r>
+        <w:rPr>
+          <w:rFonts w:ascii="Carlito" w:hAnsi="Carlito" w:cs="Carlito"/>
+          <w:b/>
+          <w:bCs/>
+          <w:color w:val="60CAF3" w:themeColor="accent4" w:themeTint="99"/>
+          <w:sz w:val="32"/>
+          <w:szCs w:val="32"/>
+        </w:rPr>
+        <w:t>images;android</w:t>
+      </w:r>
+      <w:proofErr w:type="gramEnd"/>
+      <w:r>
+        <w:rPr>
+          <w:rFonts w:ascii="Carlito" w:hAnsi="Carlito" w:cs="Carlito"/>
+          <w:b/>
+          <w:bCs/>
+          <w:color w:val="60CAF3" w:themeColor="accent4" w:themeTint="99"/>
+          <w:sz w:val="32"/>
+          <w:szCs w:val="32"/>
+        </w:rPr>
+        <w:t>-34;google_apis;x86_64"</w:t>
       </w:r>
     </w:p>
     <w:p>
@@ -5561,8 +6711,22 @@
           <w:sz w:val="32"/>
           <w:szCs w:val="32"/>
         </w:rPr>
-        <w:t xml:space="preserve"> product.json</w:t>
-      </w:r>
+        <w:t xml:space="preserve"> </w:t>
+      </w:r>
+      <w:proofErr w:type="spellStart"/>
+      <w:proofErr w:type="gramStart"/>
+      <w:r>
+        <w:rPr>
+          <w:rFonts w:ascii="Carlito" w:hAnsi="Carlito" w:cs="Carlito"/>
+          <w:b/>
+          <w:bCs/>
+          <w:sz w:val="32"/>
+          <w:szCs w:val="32"/>
+        </w:rPr>
+        <w:t>product.json</w:t>
+      </w:r>
+      <w:proofErr w:type="spellEnd"/>
+      <w:proofErr w:type="gramEnd"/>
       <w:r>
         <w:rPr>
           <w:rFonts w:ascii="Carlito" w:hAnsi="Carlito" w:cs="Carlito"/>
@@ -5594,6 +6758,7 @@
         </w:rPr>
         <w:t xml:space="preserve">Search for </w:t>
       </w:r>
+      <w:proofErr w:type="spellStart"/>
       <w:r>
         <w:rPr>
           <w:rFonts w:ascii="Carlito" w:hAnsi="Carlito" w:cs="Carlito"/>
@@ -5604,6 +6769,7 @@
         </w:rPr>
         <w:t>extensionsGallery</w:t>
       </w:r>
+      <w:proofErr w:type="spellEnd"/>
       <w:r>
         <w:rPr>
           <w:rFonts w:ascii="Carlito" w:hAnsi="Carlito" w:cs="Carlito"/>
@@ -5634,55 +6800,151 @@
           <w:sz w:val="32"/>
           <w:szCs w:val="32"/>
         </w:rPr>
-        <w:t>"extensionsGallery": {</w:t>
-      </w:r>
-    </w:p>
-    <w:p>
-      <w:pPr>
-        <w:jc w:val="both"/>
-        <w:rPr>
-          <w:rFonts w:ascii="Carlito" w:hAnsi="Carlito" w:cs="Carlito"/>
-          <w:b/>
-          <w:bCs/>
-          <w:color w:val="D86DCB" w:themeColor="accent5" w:themeTint="99"/>
-          <w:sz w:val="32"/>
-          <w:szCs w:val="32"/>
-        </w:rPr>
-      </w:pPr>
-      <w:r>
-        <w:rPr>
-          <w:rFonts w:ascii="Carlito" w:hAnsi="Carlito" w:cs="Carlito"/>
-          <w:b/>
-          <w:bCs/>
-          <w:color w:val="D86DCB" w:themeColor="accent5" w:themeTint="99"/>
-          <w:sz w:val="32"/>
-          <w:szCs w:val="32"/>
-        </w:rPr>
-        <w:t xml:space="preserve">  "serviceUrl": "https://marketplace.visualstudio.com/_apis/public/gallery",</w:t>
-      </w:r>
-    </w:p>
-    <w:p>
-      <w:pPr>
-        <w:jc w:val="both"/>
-        <w:rPr>
-          <w:rFonts w:ascii="Carlito" w:hAnsi="Carlito" w:cs="Carlito"/>
-          <w:b/>
-          <w:bCs/>
-          <w:color w:val="D86DCB" w:themeColor="accent5" w:themeTint="99"/>
-          <w:sz w:val="32"/>
-          <w:szCs w:val="32"/>
-        </w:rPr>
-      </w:pPr>
-      <w:r>
-        <w:rPr>
-          <w:rFonts w:ascii="Carlito" w:hAnsi="Carlito" w:cs="Carlito"/>
-          <w:b/>
-          <w:bCs/>
-          <w:color w:val="D86DCB" w:themeColor="accent5" w:themeTint="99"/>
-          <w:sz w:val="32"/>
-          <w:szCs w:val="32"/>
-        </w:rPr>
-        <w:t xml:space="preserve">  "itemUrl": "https://marketplace.visualstudio.com/items"</w:t>
+        <w:t>"</w:t>
+      </w:r>
+      <w:proofErr w:type="spellStart"/>
+      <w:r>
+        <w:rPr>
+          <w:rFonts w:ascii="Carlito" w:hAnsi="Carlito" w:cs="Carlito"/>
+          <w:b/>
+          <w:bCs/>
+          <w:color w:val="D86DCB" w:themeColor="accent5" w:themeTint="99"/>
+          <w:sz w:val="32"/>
+          <w:szCs w:val="32"/>
+        </w:rPr>
+        <w:t>extensionsGallery</w:t>
+      </w:r>
+      <w:proofErr w:type="spellEnd"/>
+      <w:r>
+        <w:rPr>
+          <w:rFonts w:ascii="Carlito" w:hAnsi="Carlito" w:cs="Carlito"/>
+          <w:b/>
+          <w:bCs/>
+          <w:color w:val="D86DCB" w:themeColor="accent5" w:themeTint="99"/>
+          <w:sz w:val="32"/>
+          <w:szCs w:val="32"/>
+        </w:rPr>
+        <w:t>": {</w:t>
+      </w:r>
+    </w:p>
+    <w:p>
+      <w:pPr>
+        <w:jc w:val="both"/>
+        <w:rPr>
+          <w:rFonts w:ascii="Carlito" w:hAnsi="Carlito" w:cs="Carlito"/>
+          <w:b/>
+          <w:bCs/>
+          <w:color w:val="D86DCB" w:themeColor="accent5" w:themeTint="99"/>
+          <w:sz w:val="32"/>
+          <w:szCs w:val="32"/>
+        </w:rPr>
+      </w:pPr>
+      <w:r>
+        <w:rPr>
+          <w:rFonts w:ascii="Carlito" w:hAnsi="Carlito" w:cs="Carlito"/>
+          <w:b/>
+          <w:bCs/>
+          <w:color w:val="D86DCB" w:themeColor="accent5" w:themeTint="99"/>
+          <w:sz w:val="32"/>
+          <w:szCs w:val="32"/>
+        </w:rPr>
+        <w:t xml:space="preserve">  "</w:t>
+      </w:r>
+      <w:proofErr w:type="spellStart"/>
+      <w:r>
+        <w:rPr>
+          <w:rFonts w:ascii="Carlito" w:hAnsi="Carlito" w:cs="Carlito"/>
+          <w:b/>
+          <w:bCs/>
+          <w:color w:val="D86DCB" w:themeColor="accent5" w:themeTint="99"/>
+          <w:sz w:val="32"/>
+          <w:szCs w:val="32"/>
+        </w:rPr>
+        <w:t>serviceUrl</w:t>
+      </w:r>
+      <w:proofErr w:type="spellEnd"/>
+      <w:r>
+        <w:rPr>
+          <w:rFonts w:ascii="Carlito" w:hAnsi="Carlito" w:cs="Carlito"/>
+          <w:b/>
+          <w:bCs/>
+          <w:color w:val="D86DCB" w:themeColor="accent5" w:themeTint="99"/>
+          <w:sz w:val="32"/>
+          <w:szCs w:val="32"/>
+        </w:rPr>
+        <w:t>": "https://marketplace.visualstudio.com/_</w:t>
+      </w:r>
+      <w:proofErr w:type="spellStart"/>
+      <w:r>
+        <w:rPr>
+          <w:rFonts w:ascii="Carlito" w:hAnsi="Carlito" w:cs="Carlito"/>
+          <w:b/>
+          <w:bCs/>
+          <w:color w:val="D86DCB" w:themeColor="accent5" w:themeTint="99"/>
+          <w:sz w:val="32"/>
+          <w:szCs w:val="32"/>
+        </w:rPr>
+        <w:t>apis</w:t>
+      </w:r>
+      <w:proofErr w:type="spellEnd"/>
+      <w:r>
+        <w:rPr>
+          <w:rFonts w:ascii="Carlito" w:hAnsi="Carlito" w:cs="Carlito"/>
+          <w:b/>
+          <w:bCs/>
+          <w:color w:val="D86DCB" w:themeColor="accent5" w:themeTint="99"/>
+          <w:sz w:val="32"/>
+          <w:szCs w:val="32"/>
+        </w:rPr>
+        <w:t>/public/gallery",</w:t>
+      </w:r>
+    </w:p>
+    <w:p>
+      <w:pPr>
+        <w:jc w:val="both"/>
+        <w:rPr>
+          <w:rFonts w:ascii="Carlito" w:hAnsi="Carlito" w:cs="Carlito"/>
+          <w:b/>
+          <w:bCs/>
+          <w:color w:val="D86DCB" w:themeColor="accent5" w:themeTint="99"/>
+          <w:sz w:val="32"/>
+          <w:szCs w:val="32"/>
+        </w:rPr>
+      </w:pPr>
+      <w:r>
+        <w:rPr>
+          <w:rFonts w:ascii="Carlito" w:hAnsi="Carlito" w:cs="Carlito"/>
+          <w:b/>
+          <w:bCs/>
+          <w:color w:val="D86DCB" w:themeColor="accent5" w:themeTint="99"/>
+          <w:sz w:val="32"/>
+          <w:szCs w:val="32"/>
+        </w:rPr>
+        <w:t xml:space="preserve">  "</w:t>
+      </w:r>
+      <w:proofErr w:type="spellStart"/>
+      <w:r>
+        <w:rPr>
+          <w:rFonts w:ascii="Carlito" w:hAnsi="Carlito" w:cs="Carlito"/>
+          <w:b/>
+          <w:bCs/>
+          <w:color w:val="D86DCB" w:themeColor="accent5" w:themeTint="99"/>
+          <w:sz w:val="32"/>
+          <w:szCs w:val="32"/>
+        </w:rPr>
+        <w:t>itemUrl</w:t>
+      </w:r>
+      <w:proofErr w:type="spellEnd"/>
+      <w:r>
+        <w:rPr>
+          <w:rFonts w:ascii="Carlito" w:hAnsi="Carlito" w:cs="Carlito"/>
+          <w:b/>
+          <w:bCs/>
+          <w:color w:val="D86DCB" w:themeColor="accent5" w:themeTint="99"/>
+          <w:sz w:val="32"/>
+          <w:szCs w:val="32"/>
+        </w:rPr>
+        <w:t>": "https://marketplace.visualstudio.com/items"</w:t>
       </w:r>
     </w:p>
     <w:p>

</xml_diff>